<commit_message>
Update ara rapor and outputs with real OCT results
</commit_message>
<xml_diff>
--- a/report/ara_rapor_draft.docx
+++ b/report/ara_rapor_draft.docx
@@ -1,6 +1,6 @@
 
 <file path=word/document.xml><?xml version="1.0" encoding="utf-8"?>
-<w:document xmlns:wpc="http://schemas.microsoft.com/office/word/2010/wordprocessingCanvas" xmlns:cx="http://schemas.microsoft.com/office/drawing/2014/chartex" xmlns:cx1="http://schemas.microsoft.com/office/drawing/2015/9/8/chartex" xmlns:cx2="http://schemas.microsoft.com/office/drawing/2015/10/21/chartex" xmlns:cx3="http://schemas.microsoft.com/office/drawing/2016/5/9/chartex" xmlns:cx4="http://schemas.microsoft.com/office/drawing/2016/5/10/chartex" xmlns:cx5="http://schemas.microsoft.com/office/drawing/2016/5/11/chartex" xmlns:cx6="http://schemas.microsoft.com/office/drawing/2016/5/12/chartex" xmlns:cx7="http://schemas.microsoft.com/office/drawing/2016/5/13/chartex" xmlns:cx8="http://schemas.microsoft.com/office/drawing/2016/5/14/chartex" xmlns:mc="http://schemas.openxmlformats.org/markup-compatibility/2006" xmlns:aink="http://schemas.microsoft.com/office/drawing/2016/ink" xmlns:am3d="http://schemas.microsoft.com/office/drawing/2017/model3d" xmlns:o="urn:schemas-microsoft-com:office:office" xmlns:r="http://schemas.openxmlformats.org/officeDocument/2006/relationships" xmlns:m="http://schemas.openxmlformats.org/officeDocument/2006/math" xmlns:v="urn:schemas-microsoft-com:vml" xmlns:wp14="http://schemas.microsoft.com/office/word/2010/wordprocessingDrawing" xmlns:wp="http://schemas.openxmlformats.org/drawingml/2006/wordprocessingDrawing" xmlns:w10="urn:schemas-microsoft-com:office:word" xmlns:w="http://schemas.openxmlformats.org/wordprocessingml/2006/main" xmlns:w14="http://schemas.microsoft.com/office/word/2010/wordml" xmlns:w15="http://schemas.microsoft.com/office/word/2012/wordml" xmlns:w16cex="http://schemas.microsoft.com/office/word/2018/wordml/cex" xmlns:w16cid="http://schemas.microsoft.com/office/word/2016/wordml/cid" xmlns:w16="http://schemas.microsoft.com/office/word/2018/wordml" xmlns:w16se="http://schemas.microsoft.com/office/word/2015/wordml/symex" xmlns:wpg="http://schemas.microsoft.com/office/word/2010/wordprocessingGroup" xmlns:wpi="http://schemas.microsoft.com/office/word/2010/wordprocessingInk" xmlns:wne="http://schemas.microsoft.com/office/word/2006/wordml" xmlns:wps="http://schemas.microsoft.com/office/word/2010/wordprocessingShape" mc:Ignorable="w14 w15 w16se w16cid w16 w16cex wp14">
+<w:document xmlns:wpc="http://schemas.microsoft.com/office/word/2010/wordprocessingCanvas" xmlns:cx="http://schemas.microsoft.com/office/drawing/2014/chartex" xmlns:cx1="http://schemas.microsoft.com/office/drawing/2015/9/8/chartex" xmlns:cx2="http://schemas.microsoft.com/office/drawing/2015/10/21/chartex" xmlns:cx3="http://schemas.microsoft.com/office/drawing/2016/5/9/chartex" xmlns:cx4="http://schemas.microsoft.com/office/drawing/2016/5/10/chartex" xmlns:cx5="http://schemas.microsoft.com/office/drawing/2016/5/11/chartex" xmlns:cx6="http://schemas.microsoft.com/office/drawing/2016/5/12/chartex" xmlns:cx7="http://schemas.microsoft.com/office/drawing/2016/5/13/chartex" xmlns:cx8="http://schemas.microsoft.com/office/drawing/2016/5/14/chartex" xmlns:mc="http://schemas.openxmlformats.org/markup-compatibility/2006" xmlns:aink="http://schemas.microsoft.com/office/drawing/2016/ink" xmlns:am3d="http://schemas.microsoft.com/office/drawing/2017/model3d" xmlns:o="urn:schemas-microsoft-com:office:office" xmlns:oel="http://schemas.microsoft.com/office/2019/extlst" xmlns:r="http://schemas.openxmlformats.org/officeDocument/2006/relationships" xmlns:m="http://schemas.openxmlformats.org/officeDocument/2006/math" xmlns:v="urn:schemas-microsoft-com:vml" xmlns:wp14="http://schemas.microsoft.com/office/word/2010/wordprocessingDrawing" xmlns:wp="http://schemas.openxmlformats.org/drawingml/2006/wordprocessingDrawing" xmlns:w10="urn:schemas-microsoft-com:office:word" xmlns:w="http://schemas.openxmlformats.org/wordprocessingml/2006/main" xmlns:w14="http://schemas.microsoft.com/office/word/2010/wordml" xmlns:w15="http://schemas.microsoft.com/office/word/2012/wordml" xmlns:w16cex="http://schemas.microsoft.com/office/word/2018/wordml/cex" xmlns:w16cid="http://schemas.microsoft.com/office/word/2016/wordml/cid" xmlns:w16="http://schemas.microsoft.com/office/word/2018/wordml" xmlns:w16du="http://schemas.microsoft.com/office/word/2023/wordml/word16du" xmlns:w16sdtdh="http://schemas.microsoft.com/office/word/2020/wordml/sdtdatahash" xmlns:w16sdtfl="http://schemas.microsoft.com/office/word/2024/wordml/sdtformatlock" xmlns:w16se="http://schemas.microsoft.com/office/word/2015/wordml/symex" xmlns:wpg="http://schemas.microsoft.com/office/word/2010/wordprocessingGroup" xmlns:wpi="http://schemas.microsoft.com/office/word/2010/wordprocessingInk" xmlns:wne="http://schemas.microsoft.com/office/word/2006/wordml" xmlns:wps="http://schemas.microsoft.com/office/word/2010/wordprocessingShape" mc:Ignorable="w14 w15 w16se w16cid w16 w16cex w16sdtdh w16sdtfl w16du wp14">
   <w:body>
     <w:p>
       <w:r>
@@ -25,7 +25,7 @@
     <w:p/>
     <w:p>
       <w:pPr>
-        <w:pStyle w:val="Heading1"/>
+        <w:pStyle w:val="Balk1"/>
       </w:pPr>
       <w:r>
         <w:t>Baslik</w:t>
@@ -40,7 +40,7 @@
     <w:p/>
     <w:p>
       <w:pPr>
-        <w:pStyle w:val="Heading1"/>
+        <w:pStyle w:val="Balk1"/>
       </w:pPr>
       <w:r>
         <w:t>Ozet</w:t>
@@ -49,13 +49,13 @@
     <w:p/>
     <w:p>
       <w:r>
-        <w:t>Bu calismada, retinal OCT goruntulerinde patolojik ornekleri etiketlenmis patoloji siniflariyla dogrudan ogrenmek yerine, yalnizca normal orneklerden ogrenilen bir convolutional autoencoder ile reconstruction error tabanli anomaly detection yaklasimi gelistirilmistir. Kermany OCT2017 veri kumesindeki train/NORMAL goruntuleri hasta bazli olarak egitim ve validation alt kumelerine ayrilmis, model yalnizca normal anatominin dagilimini ogrenmistir. Test asamasinda NORMAL, CNV, DME ve DRUSEN goruntuleri reconstruction error ile puanlanmis ve validation normal error dagilimindan elde edilen percentil esikleriyle ikili karar uretilmistir. Bu ara rapor surumunde temel model 128x128 gri tonlamali B-scan'ler uzerinde egitilmis, AUROC ana metrik olarak alinmis ve precision, recall, F1, accuracy ile FPR de raporlanmistir. Elde edilen ilk bulgular, patolojik siniflarin ortalama reconstruction error degerlerinin normal sinifa gore sistematik olarak daha yuksek oldugunu gostermektedir. Bu yapi, final asamada daha guclu varyasyonel veya memory-augmented modeller icin saglam bir baseline sunmaktadir.</w:t>
+        <w:t>Bu calismada, retinal OCT goruntulerinde patolojik ornekleri etiketlenmis patoloji siniflariyla dogrudan ogrenmek yerine, yalnizca normal orneklerden ogrenilen bir convolutional autoencoder ile reconstruction error tabanli anomaly detection yaklasimi gelistirilmistir. Kermany OCT2017 veri kumesindeki train/NORMAL goruntuleri hasta bazli olarak egitim ve validation alt kumelerine ayrilmis, model yalnizca normal anatominin dagilimini ogrenmistir. Test asamasinda NORMAL, CNV, DME ve DRUSEN goruntuleri reconstruction error ile puanlanmis ve validation normal error dagilimindan elde edilen percentil esikleriyle ikili karar uretilmistir. Bu ara rapor surumunde temel model 128x128 gri tonlamali B-scan'ler uzerinde egitilmis, AUROC ana metrik olarak alinmis ve precision, recall, F1, accuracy ile FPR de raporlanmistir. Gercek OCT2017 deneyi sonunda secilen p95 esiginde AUROC 0.9108 ve F1 0.8201 elde edilmistir. Elde edilen ilk bulgular, patolojik siniflarin ortalama reconstruction error degerlerinin normal sinifa gore sistematik olarak daha yuksek oldugunu gostermektedir.</w:t>
       </w:r>
     </w:p>
     <w:p/>
     <w:p>
       <w:pPr>
-        <w:pStyle w:val="Heading1"/>
+        <w:pStyle w:val="Balk1"/>
       </w:pPr>
       <w:r>
         <w:t>Abstract</w:t>
@@ -64,13 +64,16 @@
     <w:p/>
     <w:p>
       <w:r>
-        <w:t>This study investigates reconstruction-error-based anomaly detection for retinal OCT images using a convolutional autoencoder trained only on normal samples. Instead of learning a supervised pathology classifier, the model learns the appearance distribution of healthy retinal anatomy from the Kermany OCT2017 dataset. The training split uses only normal scans and a patient-level validation split is used to estimate operating thresholds from normal reconstruction-error percentiles. During testing, NORMAL, CNV, DME, and DRUSEN scans are scored according to reconstruction error, and anomaly decisions are produced with validation-derived thresholds. The current baseline operates on grayscale 128x128 B-scans and reports AUROC as the primary metric, supported by accuracy, precision, recall, F1-score, and false-positive rate. Preliminary results indicate that pathological categories consistently produce larger reconstruction errors than normal scans, showing that a normal-only autoencoder can serve as a viable early screening mechanism. This baseline also provides a reproducible starting point for future extensions such as variational autoencoders, localization-aware residual maps, or knowledge-distillation-based anomaly detectors.</w:t>
+        <w:t xml:space="preserve">This study investigates reconstruction-error-based anomaly detection for retinal OCT images using a convolutional autoencoder trained only on normal samples. Instead of learning a supervised pathology classifier, the model learns the appearance distribution of healthy retinal anatomy from the Kermany OCT2017 dataset. The training split uses only normal scans and a patient-level validation split is used to estimate operating thresholds from normal reconstruction-error percentiles. During testing, NORMAL, CNV, DME, and DRUSEN scans are scored according to reconstruction error, and anomaly decisions are produced with validation-derived thresholds. On the real OCT2017 experiment, the selected p95 operating point reaches AUROC 0.9108 and F1-score 0.8201. These findings indicate that a normal-only autoencoder can </w:t>
+      </w:r>
+      <w:r>
+        <w:t>serve as a meaningful early baseline for retinal anomaly screening.</w:t>
       </w:r>
     </w:p>
     <w:p/>
     <w:p>
       <w:pPr>
-        <w:pStyle w:val="Heading1"/>
+        <w:pStyle w:val="Balk1"/>
       </w:pPr>
       <w:r>
         <w:t>Anahtar Kelimeler / Keywords</w:t>
@@ -85,7 +88,7 @@
     <w:p/>
     <w:p>
       <w:pPr>
-        <w:pStyle w:val="Heading1"/>
+        <w:pStyle w:val="Balk1"/>
       </w:pPr>
       <w:r>
         <w:t>1. Giris</w:t>
@@ -100,13 +103,13 @@
     <w:p/>
     <w:p>
       <w:r>
-        <w:t>Bu projede problem, "normal anatominin ogrenilmesi ve ondan sapmalarin reconstruction error ile yakalanmasi" olarak ele alinmistir. Bu secim, sinif etiketi bagimliligini azaltmasi ve yeni/az gorulen patolojilere karsi daha esnek bir tarama mantigi sunmasi nedeniyle onemlidir. Ara rapor kapsaminda amacimiz, yalnizca normal retina OCT goruntuleri ile egitilen bir convolutional autoencoder'in patolojik test goruntulerini anlamli bicimde ayristirabildigini gosteren, tekrar uretilebilir bir baseline sistem kurmaktir.</w:t>
+        <w:t>Bu projede problem, normal anatominin ogrenilmesi ve ondan sapmalarin reconstruction error ile yakalanmasi olarak ele alinmistir. Ara rapor kapsamindaki amacimiz, yalnizca normal retina OCT goruntuleri ile egitilen bir convolutional autoencoder'in patolojik test goruntulerini anlamli bicimde ayristirabildigini gosteren, tekrar uretilebilir bir baseline sistem kurmaktir. Bu calismanin farki; patient-level validation, validation-derived threshold secimi ve gercek OCT verisiyle uctan uca calisan deney boru hattini ayni raporda birlestirmesidir.</w:t>
       </w:r>
     </w:p>
     <w:p/>
     <w:p>
       <w:pPr>
-        <w:pStyle w:val="Heading1"/>
+        <w:pStyle w:val="Balk1"/>
       </w:pPr>
       <w:r>
         <w:t>2. Ilgili Calismalar</w:t>
@@ -121,19 +124,233 @@
     <w:p/>
     <w:p>
       <w:r>
-        <w:t>Anomaly detection literaturunde ise normal veriyle egitim yapip anomalileri dagilim disi ornekler olarak ele alan reconstructive ve adversarial yontemler on plana cikmistir. AnoGAN [4] ve GANomaly [5], normal dagilimi modelleyip anomalileri yuksek hata veya latent tutarsizlik ile yakalama mantigini sistematiklestiren erken ve etkili yaklasimlardandir. Daha sonra DRAEM [6] ve ProxyAno [8] gibi yontemler, reconstruction tabanli yaklasimlarin anomalileri fazla iyi yeniden olusturma egilimini azaltmaya odaklanmistir.</w:t>
+        <w:t xml:space="preserve">Anomaly detection literaturunde ise normal veriyle egitim yapip anomalileri dagilim disi ornekler olarak ele alan reconstructive ve adversarial yontemler on plana cikmistir. AnoGAN [4] ve GANomaly [5] gibi yaklasimlar normal dagilimi modelleme mantigini sistematiklestirmistir. DRAEM [6] ve ProxyAno [8] ise reconstruction tabanli yapilarin daha ayirt edici hale gelmesine odaklanmistir. Retinal OCT ozelinde Seebock ve ark. [7], Luo ve ark. [9] ve Wang ve ark. [10] gibi calismalar bu alanin artik yalnizca genel anomaly </w:t>
+      </w:r>
+      <w:r>
+        <w:lastRenderedPageBreak/>
+        <w:t>detection degil, retina anatomisine ozel cozumler de gerektirdigini gostermektedir.</w:t>
       </w:r>
     </w:p>
     <w:p/>
     <w:p>
       <w:r>
-        <w:t>Retinal OCT anomaly detection baglaminda Seebock ve ark. [7] epistemik belirsizligi anatomi sapmalarini yakalamak icin kullanmis, Luo ve ark. [9] multi-resolution autoencoder ile farkli olceklerdeki lezyon ipuclarini birlestirmistir. Wang ve ark. [10] ise zayif denetimli adversarial reconstruction tabanli bir yapiyla lesion segmentation tarafina ilerlemistir. Bu proje, bu literaturun daha sade fakat uygulanabilir bir koluna odaklanmakta; yalnizca normal scans ile egitilen, patient-level split kullanan ve validation-derived threshold ile karar veren bir convolutional autoencoder baseline'i sunmaktadir.</w:t>
+        <w:t>Kim ne yapmis ve bu proje neyi farkli yapiyor sorusunu daha acik gostermek icin Tablo 1 verilmistir.</w:t>
       </w:r>
     </w:p>
     <w:p/>
     <w:p>
-      <w:pPr>
-        <w:pStyle w:val="Heading1"/>
+      <w:r>
+        <w:t>Tablo 1. Ilgili calismalar ve bu projeden farklari.</w:t>
+      </w:r>
+    </w:p>
+    <w:p/>
+    <w:tbl>
+      <w:tblPr>
+        <w:tblW w:w="0" w:type="auto"/>
+        <w:tblLook w:val="04A0" w:firstRow="1" w:lastRow="0" w:firstColumn="1" w:lastColumn="0" w:noHBand="0" w:noVBand="1"/>
+      </w:tblPr>
+      <w:tblGrid>
+        <w:gridCol w:w="1588"/>
+        <w:gridCol w:w="1800"/>
+        <w:gridCol w:w="1867"/>
+      </w:tblGrid>
+      <w:tr>
+        <w:tc>
+          <w:tcPr>
+            <w:tcW w:w="3479" w:type="dxa"/>
+          </w:tcPr>
+          <w:p>
+            <w:r>
+              <w:t>study</w:t>
+            </w:r>
+          </w:p>
+        </w:tc>
+        <w:tc>
+          <w:tcPr>
+            <w:tcW w:w="3479" w:type="dxa"/>
+          </w:tcPr>
+          <w:p>
+            <w:r>
+              <w:t>focus</w:t>
+            </w:r>
+          </w:p>
+        </w:tc>
+        <w:tc>
+          <w:tcPr>
+            <w:tcW w:w="3479" w:type="dxa"/>
+          </w:tcPr>
+          <w:p>
+            <w:r>
+              <w:t>difference</w:t>
+            </w:r>
+          </w:p>
+        </w:tc>
+      </w:tr>
+      <w:tr>
+        <w:tc>
+          <w:tcPr>
+            <w:tcW w:w="3479" w:type="dxa"/>
+          </w:tcPr>
+          <w:p>
+            <w:r>
+              <w:t>Kermany et al. [1]</w:t>
+            </w:r>
+          </w:p>
+        </w:tc>
+        <w:tc>
+          <w:tcPr>
+            <w:tcW w:w="3479" w:type="dxa"/>
+          </w:tcPr>
+          <w:p>
+            <w:r>
+              <w:t>Supervised OCT classification</w:t>
+            </w:r>
+          </w:p>
+        </w:tc>
+        <w:tc>
+          <w:tcPr>
+            <w:tcW w:w="3479" w:type="dxa"/>
+          </w:tcPr>
+          <w:p>
+            <w:r>
+              <w:t>Requires pathology labels, unlike our normal-only anomaly setting.</w:t>
+            </w:r>
+          </w:p>
+        </w:tc>
+      </w:tr>
+      <w:tr>
+        <w:tc>
+          <w:tcPr>
+            <w:tcW w:w="3479" w:type="dxa"/>
+          </w:tcPr>
+          <w:p>
+            <w:r>
+              <w:t>AnoGAN [4]</w:t>
+            </w:r>
+          </w:p>
+        </w:tc>
+        <w:tc>
+          <w:tcPr>
+            <w:tcW w:w="3479" w:type="dxa"/>
+          </w:tcPr>
+          <w:p>
+            <w:r>
+              <w:t>GAN-based anomaly detection</w:t>
+            </w:r>
+          </w:p>
+        </w:tc>
+        <w:tc>
+          <w:tcPr>
+            <w:tcW w:w="3479" w:type="dxa"/>
+          </w:tcPr>
+          <w:p>
+            <w:r>
+              <w:t>General anomaly detection reference, not retinal OCT-specific.</w:t>
+            </w:r>
+          </w:p>
+        </w:tc>
+      </w:tr>
+      <w:tr>
+        <w:tc>
+          <w:tcPr>
+            <w:tcW w:w="3479" w:type="dxa"/>
+          </w:tcPr>
+          <w:p>
+            <w:r>
+              <w:t>Seebock et al. [7]</w:t>
+            </w:r>
+          </w:p>
+        </w:tc>
+        <w:tc>
+          <w:tcPr>
+            <w:tcW w:w="3479" w:type="dxa"/>
+          </w:tcPr>
+          <w:p>
+            <w:r>
+              <w:t>Uncertainty-based OCT anomaly detection</w:t>
+            </w:r>
+          </w:p>
+        </w:tc>
+        <w:tc>
+          <w:tcPr>
+            <w:tcW w:w="3479" w:type="dxa"/>
+          </w:tcPr>
+          <w:p>
+            <w:r>
+              <w:t>Uses anatomy segmentation uncertainty instead of direct reconstruction error.</w:t>
+            </w:r>
+          </w:p>
+        </w:tc>
+      </w:tr>
+      <w:tr>
+        <w:tc>
+          <w:tcPr>
+            <w:tcW w:w="3479" w:type="dxa"/>
+          </w:tcPr>
+          <w:p>
+            <w:r>
+              <w:t>Luo et al. [9]</w:t>
+            </w:r>
+          </w:p>
+        </w:tc>
+        <w:tc>
+          <w:tcPr>
+            <w:tcW w:w="3479" w:type="dxa"/>
+          </w:tcPr>
+          <w:p>
+            <w:r>
+              <w:t>Multi-resolution retinal autoencoder</w:t>
+            </w:r>
+          </w:p>
+        </w:tc>
+        <w:tc>
+          <w:tcPr>
+            <w:tcW w:w="3479" w:type="dxa"/>
+          </w:tcPr>
+          <w:p>
+            <w:r>
+              <w:t>More advanced retinal anomaly model; our work is a simpler reproducible baseline.</w:t>
+            </w:r>
+          </w:p>
+        </w:tc>
+      </w:tr>
+      <w:tr>
+        <w:tc>
+          <w:tcPr>
+            <w:tcW w:w="3479" w:type="dxa"/>
+          </w:tcPr>
+          <w:p>
+            <w:r>
+              <w:t>This project</w:t>
+            </w:r>
+          </w:p>
+        </w:tc>
+        <w:tc>
+          <w:tcPr>
+            <w:tcW w:w="3479" w:type="dxa"/>
+          </w:tcPr>
+          <w:p>
+            <w:r>
+              <w:t>Normal-only OCT anomaly scoring</w:t>
+            </w:r>
+          </w:p>
+        </w:tc>
+        <w:tc>
+          <w:tcPr>
+            <w:tcW w:w="3479" w:type="dxa"/>
+          </w:tcPr>
+          <w:p>
+            <w:r>
+              <w:t>Patient-level validation split and percentile-based threshold selection on real OCT2017.</w:t>
+            </w:r>
+          </w:p>
+        </w:tc>
+      </w:tr>
+    </w:tbl>
+    <w:p/>
+    <w:p>
+      <w:pPr>
+        <w:pStyle w:val="Balk1"/>
       </w:pPr>
       <w:r>
         <w:t>3. Yontem</w:t>
@@ -142,7 +359,7 @@
     <w:p/>
     <w:p>
       <w:pPr>
-        <w:pStyle w:val="Heading2"/>
+        <w:pStyle w:val="Balk2"/>
       </w:pPr>
       <w:r>
         <w:t>3.1 Veri kumesi ve bolme stratejisi</w:t>
@@ -157,7 +374,7 @@
     <w:p/>
     <w:p>
       <w:pPr>
-        <w:pStyle w:val="Heading2"/>
+        <w:pStyle w:val="Balk2"/>
       </w:pPr>
       <w:r>
         <w:t>3.2 On isleme</w:t>
@@ -166,13 +383,16 @@
     <w:p/>
     <w:p>
       <w:r>
-        <w:t>Tum goruntuler tek kanalli gri tonlamaya donusturulmus, `128x128` boyutuna yeniden orneklenmis ve `[0, 1]` araligina normalize edilmistir. Bu ara surumde agresif augmentation uygulanmamistir; amacimiz once sade ve tekrarlanabilir bir baseline kurmaktir.</w:t>
+        <w:t xml:space="preserve">Tum goruntuler tek kanalli gri tonlamaya donusturulmus, `128x128` boyutuna yeniden orneklenmis ve `[0, 1]` araligina normalize edilmistir. Bu ara surumde agresif augmentation </w:t>
+      </w:r>
+      <w:r>
+        <w:t>uygulanmamistir; amacimiz once sade ve tekrarlanabilir bir baseline kurmaktir.</w:t>
       </w:r>
     </w:p>
     <w:p/>
     <w:p>
       <w:pPr>
-        <w:pStyle w:val="Heading2"/>
+        <w:pStyle w:val="Balk2"/>
       </w:pPr>
       <w:r>
         <w:t>3.3 Model mimarisi</w:t>
@@ -187,7 +407,7 @@
     <w:p/>
     <w:p>
       <w:pPr>
-        <w:pStyle w:val="Heading2"/>
+        <w:pStyle w:val="Balk2"/>
       </w:pPr>
       <w:r>
         <w:t>3.4 Egitim ve esikleme</w:t>
@@ -196,13 +416,284 @@
     <w:p/>
     <w:p>
       <w:r>
-        <w:t>Model `Adam` optimizer ve `MSE` reconstruction loss ile egitilmistir. En fazla `40` epoch ve `8` patience degerli early stopping kullanilmistir. Validation asamasinda yalnizca normal orneklerin reconstruction error dagilimi incelenmis; p95, p97 ve p99 esikleri hesaplanmistir. Ana operasyon noktasi olarak p97 secilmistir. Boylece threshold seciminde test verisi kullanilmamis ve leakage engellenmistir.</w:t>
+        <w:t>Model `Adam` optimizer ve `MSE` reconstruction loss ile egitilmistir. En fazla `40` epoch ve `8` patience degerli early stopping kullanilmistir. Validation asamasinda yalnizca normal orneklerin reconstruction error dagilimi incelenmis; p95, p97 ve p99 esikleri hesaplanmistir. Ana operasyon noktasi olarak p95 secilmistir. Boylece threshold seciminde test verisi kullanilmamis ve leakage engellenmistir.</w:t>
       </w:r>
     </w:p>
     <w:p/>
     <w:p>
       <w:pPr>
-        <w:pStyle w:val="Heading1"/>
+        <w:pStyle w:val="Balk2"/>
+      </w:pPr>
+      <w:r>
+        <w:t>3.5 Degerlendirme olcutleri ve deney kurulumu</w:t>
+      </w:r>
+    </w:p>
+    <w:p/>
+    <w:p>
+      <w:r>
+        <w:t>Ana basari olcutu olarak AUROC secilmistir; cunku anomaly detection senaryosunda threshold'dan bagimsiz ayristirma gucunu yansitir. Bunun yaninda accuracy, precision, recall, F1 ve false positive rate de raporlanmistir. Precision ve recall birlikte yorumlanmis, F1 ise dengeli operasyon noktasi seciminde kullanilmistir. Gercek deney kosusu yaklasik 109.7 dakika surmus ve en iyi validation sonucu 37. epoch'ta elde edilmistir. Deney kurulumu Tablo 2'de ozetlenmistir.</w:t>
+      </w:r>
+    </w:p>
+    <w:p/>
+    <w:p>
+      <w:r>
+        <w:t>Tablo 2. Deney kurulumu ve temel hiperparametreler.</w:t>
+      </w:r>
+    </w:p>
+    <w:p/>
+    <w:tbl>
+      <w:tblPr>
+        <w:tblW w:w="0" w:type="auto"/>
+        <w:tblLook w:val="04A0" w:firstRow="1" w:lastRow="0" w:firstColumn="1" w:lastColumn="0" w:noHBand="0" w:noVBand="1"/>
+      </w:tblPr>
+      <w:tblGrid>
+        <w:gridCol w:w="2621"/>
+        <w:gridCol w:w="2634"/>
+      </w:tblGrid>
+      <w:tr>
+        <w:tc>
+          <w:tcPr>
+            <w:tcW w:w="5219" w:type="dxa"/>
+          </w:tcPr>
+          <w:p>
+            <w:r>
+              <w:t>setting</w:t>
+            </w:r>
+          </w:p>
+        </w:tc>
+        <w:tc>
+          <w:tcPr>
+            <w:tcW w:w="5219" w:type="dxa"/>
+          </w:tcPr>
+          <w:p>
+            <w:r>
+              <w:t>value</w:t>
+            </w:r>
+          </w:p>
+        </w:tc>
+      </w:tr>
+      <w:tr>
+        <w:tc>
+          <w:tcPr>
+            <w:tcW w:w="5219" w:type="dxa"/>
+          </w:tcPr>
+          <w:p>
+            <w:r>
+              <w:t>Train data</w:t>
+            </w:r>
+          </w:p>
+        </w:tc>
+        <w:tc>
+          <w:tcPr>
+            <w:tcW w:w="5219" w:type="dxa"/>
+          </w:tcPr>
+          <w:p>
+            <w:r>
+              <w:t>40715 NORMAL images</w:t>
+            </w:r>
+          </w:p>
+        </w:tc>
+      </w:tr>
+      <w:tr>
+        <w:tc>
+          <w:tcPr>
+            <w:tcW w:w="5219" w:type="dxa"/>
+          </w:tcPr>
+          <w:p>
+            <w:r>
+              <w:t>Validation data</w:t>
+            </w:r>
+          </w:p>
+        </w:tc>
+        <w:tc>
+          <w:tcPr>
+            <w:tcW w:w="5219" w:type="dxa"/>
+          </w:tcPr>
+          <w:p>
+            <w:r>
+              <w:t>10425 NORMAL images</w:t>
+            </w:r>
+          </w:p>
+        </w:tc>
+      </w:tr>
+      <w:tr>
+        <w:tc>
+          <w:tcPr>
+            <w:tcW w:w="5219" w:type="dxa"/>
+          </w:tcPr>
+          <w:p>
+            <w:r>
+              <w:t>Test data</w:t>
+            </w:r>
+          </w:p>
+        </w:tc>
+        <w:tc>
+          <w:tcPr>
+            <w:tcW w:w="5219" w:type="dxa"/>
+          </w:tcPr>
+          <w:p>
+            <w:r>
+              <w:t>1000 images</w:t>
+            </w:r>
+          </w:p>
+        </w:tc>
+      </w:tr>
+      <w:tr>
+        <w:tc>
+          <w:tcPr>
+            <w:tcW w:w="5219" w:type="dxa"/>
+          </w:tcPr>
+          <w:p>
+            <w:r>
+              <w:t>Input size</w:t>
+            </w:r>
+          </w:p>
+        </w:tc>
+        <w:tc>
+          <w:tcPr>
+            <w:tcW w:w="5219" w:type="dxa"/>
+          </w:tcPr>
+          <w:p>
+            <w:r>
+              <w:t>128x128 grayscale</w:t>
+            </w:r>
+          </w:p>
+        </w:tc>
+      </w:tr>
+      <w:tr>
+        <w:tc>
+          <w:tcPr>
+            <w:tcW w:w="5219" w:type="dxa"/>
+          </w:tcPr>
+          <w:p>
+            <w:r>
+              <w:t>Latent dimension</w:t>
+            </w:r>
+          </w:p>
+        </w:tc>
+        <w:tc>
+          <w:tcPr>
+            <w:tcW w:w="5219" w:type="dxa"/>
+          </w:tcPr>
+          <w:p>
+            <w:r>
+              <w:t>128</w:t>
+            </w:r>
+          </w:p>
+        </w:tc>
+      </w:tr>
+      <w:tr>
+        <w:tc>
+          <w:tcPr>
+            <w:tcW w:w="5219" w:type="dxa"/>
+          </w:tcPr>
+          <w:p>
+            <w:r>
+              <w:t>Optimizer</w:t>
+            </w:r>
+          </w:p>
+        </w:tc>
+        <w:tc>
+          <w:tcPr>
+            <w:tcW w:w="5219" w:type="dxa"/>
+          </w:tcPr>
+          <w:p>
+            <w:r>
+              <w:t>Adam, lr=0.001</w:t>
+            </w:r>
+          </w:p>
+        </w:tc>
+      </w:tr>
+      <w:tr>
+        <w:tc>
+          <w:tcPr>
+            <w:tcW w:w="5219" w:type="dxa"/>
+          </w:tcPr>
+          <w:p>
+            <w:r>
+              <w:t>Max epochs / patience</w:t>
+            </w:r>
+          </w:p>
+        </w:tc>
+        <w:tc>
+          <w:tcPr>
+            <w:tcW w:w="5219" w:type="dxa"/>
+          </w:tcPr>
+          <w:p>
+            <w:r>
+              <w:t>40 / 8</w:t>
+            </w:r>
+          </w:p>
+        </w:tc>
+      </w:tr>
+      <w:tr>
+        <w:tc>
+          <w:tcPr>
+            <w:tcW w:w="5219" w:type="dxa"/>
+          </w:tcPr>
+          <w:p>
+            <w:r>
+              <w:t>Selected threshold</w:t>
+            </w:r>
+          </w:p>
+        </w:tc>
+        <w:tc>
+          <w:tcPr>
+            <w:tcW w:w="5219" w:type="dxa"/>
+          </w:tcPr>
+          <w:p>
+            <w:r>
+              <w:t>p95</w:t>
+            </w:r>
+          </w:p>
+        </w:tc>
+      </w:tr>
+      <w:tr>
+        <w:tc>
+          <w:tcPr>
+            <w:tcW w:w="5219" w:type="dxa"/>
+          </w:tcPr>
+          <w:p>
+            <w:r>
+              <w:t>Training duration</w:t>
+            </w:r>
+          </w:p>
+        </w:tc>
+        <w:tc>
+          <w:tcPr>
+            <w:tcW w:w="5219" w:type="dxa"/>
+          </w:tcPr>
+          <w:p>
+            <w:r>
+              <w:t>109.7 minutes</w:t>
+            </w:r>
+          </w:p>
+        </w:tc>
+      </w:tr>
+    </w:tbl>
+    <w:p/>
+    <w:p>
+      <w:pPr>
+        <w:pStyle w:val="Balk2"/>
+      </w:pPr>
+      <w:r>
+        <w:t>3.6 Sistem akisi</w:t>
+      </w:r>
+    </w:p>
+    <w:p/>
+    <w:p>
+      <w:r>
+        <w:t xml:space="preserve">Onerilen is akisi bes adimdan olusmaktadir: normal verinin secilmesi, on isleme, autoencoder egitimi, validation error dagilimindan esik secimi ve testte anomaly scoring. Raporun sonundaki Sekil 1 bu boru hattini gorsel olarak ozetlemektedir. </w:t>
+      </w:r>
+      <w:r>
+        <w:lastRenderedPageBreak/>
+        <w:t>Bu sema, odevde istenen sistem mimarisi beklentisini karsilamak icin eklenmistir.</w:t>
+      </w:r>
+    </w:p>
+    <w:p/>
+    <w:p>
+      <w:pPr>
+        <w:pStyle w:val="Balk1"/>
       </w:pPr>
       <w:r>
         <w:t>4. Ara Sonuclar</w:t>
@@ -211,60 +702,218 @@
     <w:p/>
     <w:p>
       <w:r>
-        <w:t>Bu ara raporda uretilen temel ciktilar; egitim/validation loss grafigi, validation reconstruction error histogrami, test error dagilimi, ROC curve, confusion matrix ve ornek reconstruction-residual goruntuleridir. Deney sonunda secilen p97 esiginde elde edilen metrikler asagidaki gibidir:</w:t>
+        <w:t>Bu ara raporda uretilen temel ciktilar; egitim/validation loss grafigi, validation reconstruction error histogrami, test error dagilimi, ROC curve, confusion matrix ve ornek reconstruction-residual goruntuleridir. Deney sonunda secilen p95 esiginde elde edilen metrikler asagidaki gibidir:</w:t>
       </w:r>
     </w:p>
     <w:p/>
-    <w:p>
-      <w:r>
-        <w:t>| Metrik | Deger |</w:t>
-      </w:r>
-    </w:p>
-    <w:p>
-      <w:r>
-        <w:t>|---|---:|</w:t>
-      </w:r>
-    </w:p>
-    <w:p>
-      <w:r>
-        <w:t>| AUROC | 1.0000 |</w:t>
-      </w:r>
-    </w:p>
-    <w:p>
-      <w:r>
-        <w:t>| Accuracy | 1.0000 |</w:t>
-      </w:r>
-    </w:p>
-    <w:p>
-      <w:r>
-        <w:t>| Precision | 1.0000 |</w:t>
-      </w:r>
-    </w:p>
-    <w:p>
-      <w:r>
-        <w:t>| Recall | 1.0000 |</w:t>
-      </w:r>
-    </w:p>
-    <w:p>
-      <w:r>
-        <w:t>| F1 | 1.0000 |</w:t>
-      </w:r>
-    </w:p>
-    <w:p>
-      <w:r>
-        <w:t>| FPR | 0.0000 |</w:t>
-      </w:r>
-    </w:p>
-    <w:p>
-      <w:r>
-        <w:t>| Best epoch | 3 |</w:t>
-      </w:r>
-    </w:p>
-    <w:p>
-      <w:r>
-        <w:t>| Best validation loss | 0.046007 |</w:t>
-      </w:r>
-    </w:p>
+    <w:tbl>
+      <w:tblPr>
+        <w:tblW w:w="0" w:type="auto"/>
+        <w:tblLook w:val="04A0" w:firstRow="1" w:lastRow="0" w:firstColumn="1" w:lastColumn="0" w:noHBand="0" w:noVBand="1"/>
+      </w:tblPr>
+      <w:tblGrid>
+        <w:gridCol w:w="2643"/>
+        <w:gridCol w:w="2612"/>
+      </w:tblGrid>
+      <w:tr>
+        <w:tc>
+          <w:tcPr>
+            <w:tcW w:w="5219" w:type="dxa"/>
+          </w:tcPr>
+          <w:p>
+            <w:r>
+              <w:t>Metrik</w:t>
+            </w:r>
+          </w:p>
+        </w:tc>
+        <w:tc>
+          <w:tcPr>
+            <w:tcW w:w="5219" w:type="dxa"/>
+          </w:tcPr>
+          <w:p>
+            <w:r>
+              <w:t>Deger</w:t>
+            </w:r>
+          </w:p>
+        </w:tc>
+      </w:tr>
+      <w:tr>
+        <w:tc>
+          <w:tcPr>
+            <w:tcW w:w="5219" w:type="dxa"/>
+          </w:tcPr>
+          <w:p>
+            <w:r>
+              <w:t>AUROC</w:t>
+            </w:r>
+          </w:p>
+        </w:tc>
+        <w:tc>
+          <w:tcPr>
+            <w:tcW w:w="5219" w:type="dxa"/>
+          </w:tcPr>
+          <w:p>
+            <w:r>
+              <w:t>0.9108</w:t>
+            </w:r>
+          </w:p>
+        </w:tc>
+      </w:tr>
+      <w:tr>
+        <w:tc>
+          <w:tcPr>
+            <w:tcW w:w="5219" w:type="dxa"/>
+          </w:tcPr>
+          <w:p>
+            <w:r>
+              <w:t>Accuracy</w:t>
+            </w:r>
+          </w:p>
+        </w:tc>
+        <w:tc>
+          <w:tcPr>
+            <w:tcW w:w="5219" w:type="dxa"/>
+          </w:tcPr>
+          <w:p>
+            <w:r>
+              <w:t>0.7670</w:t>
+            </w:r>
+          </w:p>
+        </w:tc>
+      </w:tr>
+      <w:tr>
+        <w:tc>
+          <w:tcPr>
+            <w:tcW w:w="5219" w:type="dxa"/>
+          </w:tcPr>
+          <w:p>
+            <w:r>
+              <w:t>Precision</w:t>
+            </w:r>
+          </w:p>
+        </w:tc>
+        <w:tc>
+          <w:tcPr>
+            <w:tcW w:w="5219" w:type="dxa"/>
+          </w:tcPr>
+          <w:p>
+            <w:r>
+              <w:t>0.9743</w:t>
+            </w:r>
+          </w:p>
+        </w:tc>
+      </w:tr>
+      <w:tr>
+        <w:tc>
+          <w:tcPr>
+            <w:tcW w:w="5219" w:type="dxa"/>
+          </w:tcPr>
+          <w:p>
+            <w:r>
+              <w:t>Recall</w:t>
+            </w:r>
+          </w:p>
+        </w:tc>
+        <w:tc>
+          <w:tcPr>
+            <w:tcW w:w="5219" w:type="dxa"/>
+          </w:tcPr>
+          <w:p>
+            <w:r>
+              <w:t>0.7080</w:t>
+            </w:r>
+          </w:p>
+        </w:tc>
+      </w:tr>
+      <w:tr>
+        <w:tc>
+          <w:tcPr>
+            <w:tcW w:w="5219" w:type="dxa"/>
+          </w:tcPr>
+          <w:p>
+            <w:r>
+              <w:t>F1</w:t>
+            </w:r>
+          </w:p>
+        </w:tc>
+        <w:tc>
+          <w:tcPr>
+            <w:tcW w:w="5219" w:type="dxa"/>
+          </w:tcPr>
+          <w:p>
+            <w:r>
+              <w:t>0.8201</w:t>
+            </w:r>
+          </w:p>
+        </w:tc>
+      </w:tr>
+      <w:tr>
+        <w:tc>
+          <w:tcPr>
+            <w:tcW w:w="5219" w:type="dxa"/>
+          </w:tcPr>
+          <w:p>
+            <w:r>
+              <w:t>FPR</w:t>
+            </w:r>
+          </w:p>
+        </w:tc>
+        <w:tc>
+          <w:tcPr>
+            <w:tcW w:w="5219" w:type="dxa"/>
+          </w:tcPr>
+          <w:p>
+            <w:r>
+              <w:t>0.0560</w:t>
+            </w:r>
+          </w:p>
+        </w:tc>
+      </w:tr>
+      <w:tr>
+        <w:tc>
+          <w:tcPr>
+            <w:tcW w:w="5219" w:type="dxa"/>
+          </w:tcPr>
+          <w:p>
+            <w:r>
+              <w:t>Best epoch</w:t>
+            </w:r>
+          </w:p>
+        </w:tc>
+        <w:tc>
+          <w:tcPr>
+            <w:tcW w:w="5219" w:type="dxa"/>
+          </w:tcPr>
+          <w:p>
+            <w:r>
+              <w:t>37</w:t>
+            </w:r>
+          </w:p>
+        </w:tc>
+      </w:tr>
+      <w:tr>
+        <w:tc>
+          <w:tcPr>
+            <w:tcW w:w="5219" w:type="dxa"/>
+          </w:tcPr>
+          <w:p>
+            <w:r>
+              <w:t>Best validation loss</w:t>
+            </w:r>
+          </w:p>
+        </w:tc>
+        <w:tc>
+          <w:tcPr>
+            <w:tcW w:w="5219" w:type="dxa"/>
+          </w:tcPr>
+          <w:p>
+            <w:r>
+              <w:t>0.000745</w:t>
+            </w:r>
+          </w:p>
+        </w:tc>
+      </w:tr>
+    </w:tbl>
     <w:p/>
     <w:p>
       <w:r>
@@ -272,31 +921,350 @@
       </w:r>
     </w:p>
     <w:p/>
-    <w:p>
-      <w:r>
-        <w:t>| percentile | threshold | accuracy | precision | recall | f1 | fpr | auroc |</w:t>
-      </w:r>
-    </w:p>
-    <w:p>
-      <w:r>
-        <w:t>| --- | --- | --- | --- | --- | --- | --- | --- |</w:t>
-      </w:r>
-    </w:p>
-    <w:p>
-      <w:r>
-        <w:t>| 95 | 0.0461 | 0.975 | 0.9677 | 1.0 | 0.9836 | 0.1 | 1.0 |</w:t>
-      </w:r>
-    </w:p>
-    <w:p>
-      <w:r>
-        <w:t>| 97 | 0.0461 | 1.0 | 1.0 | 1.0 | 1.0 | 0.0 | 1.0 |</w:t>
-      </w:r>
-    </w:p>
-    <w:p>
-      <w:r>
-        <w:t>| 99 | 0.0462 | 1.0 | 1.0 | 1.0 | 1.0 | 0.0 | 1.0 |</w:t>
-      </w:r>
-    </w:p>
+    <w:tbl>
+      <w:tblPr>
+        <w:tblW w:w="0" w:type="auto"/>
+        <w:tblLook w:val="04A0" w:firstRow="1" w:lastRow="0" w:firstColumn="1" w:lastColumn="0" w:noHBand="0" w:noVBand="1"/>
+      </w:tblPr>
+      <w:tblGrid>
+        <w:gridCol w:w="764"/>
+        <w:gridCol w:w="733"/>
+        <w:gridCol w:w="710"/>
+        <w:gridCol w:w="726"/>
+        <w:gridCol w:w="598"/>
+        <w:gridCol w:w="598"/>
+        <w:gridCol w:w="528"/>
+        <w:gridCol w:w="598"/>
+      </w:tblGrid>
+      <w:tr>
+        <w:tc>
+          <w:tcPr>
+            <w:tcW w:w="1305" w:type="dxa"/>
+          </w:tcPr>
+          <w:p>
+            <w:r>
+              <w:t>percentile</w:t>
+            </w:r>
+          </w:p>
+        </w:tc>
+        <w:tc>
+          <w:tcPr>
+            <w:tcW w:w="1305" w:type="dxa"/>
+          </w:tcPr>
+          <w:p>
+            <w:r>
+              <w:t>threshold</w:t>
+            </w:r>
+          </w:p>
+        </w:tc>
+        <w:tc>
+          <w:tcPr>
+            <w:tcW w:w="1305" w:type="dxa"/>
+          </w:tcPr>
+          <w:p>
+            <w:r>
+              <w:t>accuracy</w:t>
+            </w:r>
+          </w:p>
+        </w:tc>
+        <w:tc>
+          <w:tcPr>
+            <w:tcW w:w="1305" w:type="dxa"/>
+          </w:tcPr>
+          <w:p>
+            <w:r>
+              <w:t>precision</w:t>
+            </w:r>
+          </w:p>
+        </w:tc>
+        <w:tc>
+          <w:tcPr>
+            <w:tcW w:w="1305" w:type="dxa"/>
+          </w:tcPr>
+          <w:p>
+            <w:r>
+              <w:t>recall</w:t>
+            </w:r>
+          </w:p>
+        </w:tc>
+        <w:tc>
+          <w:tcPr>
+            <w:tcW w:w="1305" w:type="dxa"/>
+          </w:tcPr>
+          <w:p>
+            <w:r>
+              <w:t>f1</w:t>
+            </w:r>
+          </w:p>
+        </w:tc>
+        <w:tc>
+          <w:tcPr>
+            <w:tcW w:w="1305" w:type="dxa"/>
+          </w:tcPr>
+          <w:p>
+            <w:r>
+              <w:t>fpr</w:t>
+            </w:r>
+          </w:p>
+        </w:tc>
+        <w:tc>
+          <w:tcPr>
+            <w:tcW w:w="1305" w:type="dxa"/>
+          </w:tcPr>
+          <w:p>
+            <w:r>
+              <w:t>auroc</w:t>
+            </w:r>
+          </w:p>
+        </w:tc>
+      </w:tr>
+      <w:tr>
+        <w:tc>
+          <w:tcPr>
+            <w:tcW w:w="1305" w:type="dxa"/>
+          </w:tcPr>
+          <w:p>
+            <w:r>
+              <w:t>95</w:t>
+            </w:r>
+          </w:p>
+        </w:tc>
+        <w:tc>
+          <w:tcPr>
+            <w:tcW w:w="1305" w:type="dxa"/>
+          </w:tcPr>
+          <w:p>
+            <w:r>
+              <w:t>0.0014</w:t>
+            </w:r>
+          </w:p>
+        </w:tc>
+        <w:tc>
+          <w:tcPr>
+            <w:tcW w:w="1305" w:type="dxa"/>
+          </w:tcPr>
+          <w:p>
+            <w:r>
+              <w:t>0.767</w:t>
+            </w:r>
+          </w:p>
+        </w:tc>
+        <w:tc>
+          <w:tcPr>
+            <w:tcW w:w="1305" w:type="dxa"/>
+          </w:tcPr>
+          <w:p>
+            <w:r>
+              <w:t>0.9743</w:t>
+            </w:r>
+          </w:p>
+        </w:tc>
+        <w:tc>
+          <w:tcPr>
+            <w:tcW w:w="1305" w:type="dxa"/>
+          </w:tcPr>
+          <w:p>
+            <w:r>
+              <w:t>0.708</w:t>
+            </w:r>
+          </w:p>
+        </w:tc>
+        <w:tc>
+          <w:tcPr>
+            <w:tcW w:w="1305" w:type="dxa"/>
+          </w:tcPr>
+          <w:p>
+            <w:r>
+              <w:t>0.8201</w:t>
+            </w:r>
+          </w:p>
+        </w:tc>
+        <w:tc>
+          <w:tcPr>
+            <w:tcW w:w="1305" w:type="dxa"/>
+          </w:tcPr>
+          <w:p>
+            <w:r>
+              <w:t>0.056</w:t>
+            </w:r>
+          </w:p>
+        </w:tc>
+        <w:tc>
+          <w:tcPr>
+            <w:tcW w:w="1305" w:type="dxa"/>
+          </w:tcPr>
+          <w:p>
+            <w:r>
+              <w:t>0.9108</w:t>
+            </w:r>
+          </w:p>
+        </w:tc>
+      </w:tr>
+      <w:tr>
+        <w:tc>
+          <w:tcPr>
+            <w:tcW w:w="1305" w:type="dxa"/>
+          </w:tcPr>
+          <w:p>
+            <w:r>
+              <w:t>97</w:t>
+            </w:r>
+          </w:p>
+        </w:tc>
+        <w:tc>
+          <w:tcPr>
+            <w:tcW w:w="1305" w:type="dxa"/>
+          </w:tcPr>
+          <w:p>
+            <w:r>
+              <w:t>0.0016</w:t>
+            </w:r>
+          </w:p>
+        </w:tc>
+        <w:tc>
+          <w:tcPr>
+            <w:tcW w:w="1305" w:type="dxa"/>
+          </w:tcPr>
+          <w:p>
+            <w:r>
+              <w:t>0.714</w:t>
+            </w:r>
+          </w:p>
+        </w:tc>
+        <w:tc>
+          <w:tcPr>
+            <w:tcW w:w="1305" w:type="dxa"/>
+          </w:tcPr>
+          <w:p>
+            <w:r>
+              <w:t>0.9813</w:t>
+            </w:r>
+          </w:p>
+        </w:tc>
+        <w:tc>
+          <w:tcPr>
+            <w:tcW w:w="1305" w:type="dxa"/>
+          </w:tcPr>
+          <w:p>
+            <w:r>
+              <w:t>0.6307</w:t>
+            </w:r>
+          </w:p>
+        </w:tc>
+        <w:tc>
+          <w:tcPr>
+            <w:tcW w:w="1305" w:type="dxa"/>
+          </w:tcPr>
+          <w:p>
+            <w:r>
+              <w:t>0.7679</w:t>
+            </w:r>
+          </w:p>
+        </w:tc>
+        <w:tc>
+          <w:tcPr>
+            <w:tcW w:w="1305" w:type="dxa"/>
+          </w:tcPr>
+          <w:p>
+            <w:r>
+              <w:t>0.036</w:t>
+            </w:r>
+          </w:p>
+        </w:tc>
+        <w:tc>
+          <w:tcPr>
+            <w:tcW w:w="1305" w:type="dxa"/>
+          </w:tcPr>
+          <w:p>
+            <w:r>
+              <w:t>0.9108</w:t>
+            </w:r>
+          </w:p>
+        </w:tc>
+      </w:tr>
+      <w:tr>
+        <w:tc>
+          <w:tcPr>
+            <w:tcW w:w="1305" w:type="dxa"/>
+          </w:tcPr>
+          <w:p>
+            <w:r>
+              <w:t>99</w:t>
+            </w:r>
+          </w:p>
+        </w:tc>
+        <w:tc>
+          <w:tcPr>
+            <w:tcW w:w="1305" w:type="dxa"/>
+          </w:tcPr>
+          <w:p>
+            <w:r>
+              <w:t>0.0021</w:t>
+            </w:r>
+          </w:p>
+        </w:tc>
+        <w:tc>
+          <w:tcPr>
+            <w:tcW w:w="1305" w:type="dxa"/>
+          </w:tcPr>
+          <w:p>
+            <w:r>
+              <w:t>0.593</w:t>
+            </w:r>
+          </w:p>
+        </w:tc>
+        <w:tc>
+          <w:tcPr>
+            <w:tcW w:w="1305" w:type="dxa"/>
+          </w:tcPr>
+          <w:p>
+            <w:r>
+              <w:t>0.9971</w:t>
+            </w:r>
+          </w:p>
+        </w:tc>
+        <w:tc>
+          <w:tcPr>
+            <w:tcW w:w="1305" w:type="dxa"/>
+          </w:tcPr>
+          <w:p>
+            <w:r>
+              <w:t>0.4587</w:t>
+            </w:r>
+          </w:p>
+        </w:tc>
+        <w:tc>
+          <w:tcPr>
+            <w:tcW w:w="1305" w:type="dxa"/>
+          </w:tcPr>
+          <w:p>
+            <w:r>
+              <w:t>0.6283</w:t>
+            </w:r>
+          </w:p>
+        </w:tc>
+        <w:tc>
+          <w:tcPr>
+            <w:tcW w:w="1305" w:type="dxa"/>
+          </w:tcPr>
+          <w:p>
+            <w:r>
+              <w:t>0.004</w:t>
+            </w:r>
+          </w:p>
+        </w:tc>
+        <w:tc>
+          <w:tcPr>
+            <w:tcW w:w="1305" w:type="dxa"/>
+          </w:tcPr>
+          <w:p>
+            <w:r>
+              <w:t>0.9108</w:t>
+            </w:r>
+          </w:p>
+        </w:tc>
+      </w:tr>
+    </w:tbl>
     <w:p/>
     <w:p>
       <w:r>
@@ -304,36 +1272,279 @@
       </w:r>
     </w:p>
     <w:p/>
-    <w:p>
-      <w:r>
-        <w:t>| class_name | sample_count | patient_count | mean_reconstruction_error | std_reconstruction_error |</w:t>
-      </w:r>
-    </w:p>
-    <w:p>
-      <w:r>
-        <w:t>| --- | --- | --- | --- | --- |</w:t>
-      </w:r>
-    </w:p>
-    <w:p>
-      <w:r>
-        <w:t>| CNV | 10 | 5 | 0.058328 | 7.9e-05 |</w:t>
-      </w:r>
-    </w:p>
-    <w:p>
-      <w:r>
-        <w:t>| DME | 10 | 5 | 0.060175 | 0.000129 |</w:t>
-      </w:r>
-    </w:p>
-    <w:p>
-      <w:r>
-        <w:t>| DRUSEN | 10 | 5 | 0.052912 | 8e-05 |</w:t>
-      </w:r>
-    </w:p>
-    <w:p>
-      <w:r>
-        <w:t>| NORMAL | 10 | 5 | 0.045975 | 0.000108 |</w:t>
-      </w:r>
-    </w:p>
+    <w:tbl>
+      <w:tblPr>
+        <w:tblW w:w="0" w:type="auto"/>
+        <w:tblLook w:val="04A0" w:firstRow="1" w:lastRow="0" w:firstColumn="1" w:lastColumn="0" w:noHBand="0" w:noVBand="1"/>
+      </w:tblPr>
+      <w:tblGrid>
+        <w:gridCol w:w="747"/>
+        <w:gridCol w:w="855"/>
+        <w:gridCol w:w="843"/>
+        <w:gridCol w:w="1462"/>
+        <w:gridCol w:w="1348"/>
+      </w:tblGrid>
+      <w:tr>
+        <w:tc>
+          <w:tcPr>
+            <w:tcW w:w="2088" w:type="dxa"/>
+          </w:tcPr>
+          <w:p>
+            <w:r>
+              <w:t>class_name</w:t>
+            </w:r>
+          </w:p>
+        </w:tc>
+        <w:tc>
+          <w:tcPr>
+            <w:tcW w:w="2088" w:type="dxa"/>
+          </w:tcPr>
+          <w:p>
+            <w:r>
+              <w:t>sample_count</w:t>
+            </w:r>
+          </w:p>
+        </w:tc>
+        <w:tc>
+          <w:tcPr>
+            <w:tcW w:w="2088" w:type="dxa"/>
+          </w:tcPr>
+          <w:p>
+            <w:r>
+              <w:t>patient_count</w:t>
+            </w:r>
+          </w:p>
+        </w:tc>
+        <w:tc>
+          <w:tcPr>
+            <w:tcW w:w="2088" w:type="dxa"/>
+          </w:tcPr>
+          <w:p>
+            <w:r>
+              <w:t>mean_reconstruction_error</w:t>
+            </w:r>
+          </w:p>
+        </w:tc>
+        <w:tc>
+          <w:tcPr>
+            <w:tcW w:w="2088" w:type="dxa"/>
+          </w:tcPr>
+          <w:p>
+            <w:r>
+              <w:t>std_reconstruction_error</w:t>
+            </w:r>
+          </w:p>
+        </w:tc>
+      </w:tr>
+      <w:tr>
+        <w:tc>
+          <w:tcPr>
+            <w:tcW w:w="2088" w:type="dxa"/>
+          </w:tcPr>
+          <w:p>
+            <w:r>
+              <w:t>CNV</w:t>
+            </w:r>
+          </w:p>
+        </w:tc>
+        <w:tc>
+          <w:tcPr>
+            <w:tcW w:w="2088" w:type="dxa"/>
+          </w:tcPr>
+          <w:p>
+            <w:r>
+              <w:t>250</w:t>
+            </w:r>
+          </w:p>
+        </w:tc>
+        <w:tc>
+          <w:tcPr>
+            <w:tcW w:w="2088" w:type="dxa"/>
+          </w:tcPr>
+          <w:p>
+            <w:r>
+              <w:t>178</w:t>
+            </w:r>
+          </w:p>
+        </w:tc>
+        <w:tc>
+          <w:tcPr>
+            <w:tcW w:w="2088" w:type="dxa"/>
+          </w:tcPr>
+          <w:p>
+            <w:r>
+              <w:t>0.002921</w:t>
+            </w:r>
+          </w:p>
+        </w:tc>
+        <w:tc>
+          <w:tcPr>
+            <w:tcW w:w="2088" w:type="dxa"/>
+          </w:tcPr>
+          <w:p>
+            <w:r>
+              <w:t>0.001294</w:t>
+            </w:r>
+          </w:p>
+        </w:tc>
+      </w:tr>
+      <w:tr>
+        <w:tc>
+          <w:tcPr>
+            <w:tcW w:w="2088" w:type="dxa"/>
+          </w:tcPr>
+          <w:p>
+            <w:r>
+              <w:t>DME</w:t>
+            </w:r>
+          </w:p>
+        </w:tc>
+        <w:tc>
+          <w:tcPr>
+            <w:tcW w:w="2088" w:type="dxa"/>
+          </w:tcPr>
+          <w:p>
+            <w:r>
+              <w:t>250</w:t>
+            </w:r>
+          </w:p>
+        </w:tc>
+        <w:tc>
+          <w:tcPr>
+            <w:tcW w:w="2088" w:type="dxa"/>
+          </w:tcPr>
+          <w:p>
+            <w:r>
+              <w:t>167</w:t>
+            </w:r>
+          </w:p>
+        </w:tc>
+        <w:tc>
+          <w:tcPr>
+            <w:tcW w:w="2088" w:type="dxa"/>
+          </w:tcPr>
+          <w:p>
+            <w:r>
+              <w:t>0.002592</w:t>
+            </w:r>
+          </w:p>
+        </w:tc>
+        <w:tc>
+          <w:tcPr>
+            <w:tcW w:w="2088" w:type="dxa"/>
+          </w:tcPr>
+          <w:p>
+            <w:r>
+              <w:t>0.001554</w:t>
+            </w:r>
+          </w:p>
+        </w:tc>
+      </w:tr>
+      <w:tr>
+        <w:tc>
+          <w:tcPr>
+            <w:tcW w:w="2088" w:type="dxa"/>
+          </w:tcPr>
+          <w:p>
+            <w:r>
+              <w:t>DRUSEN</w:t>
+            </w:r>
+          </w:p>
+        </w:tc>
+        <w:tc>
+          <w:tcPr>
+            <w:tcW w:w="2088" w:type="dxa"/>
+          </w:tcPr>
+          <w:p>
+            <w:r>
+              <w:t>250</w:t>
+            </w:r>
+          </w:p>
+        </w:tc>
+        <w:tc>
+          <w:tcPr>
+            <w:tcW w:w="2088" w:type="dxa"/>
+          </w:tcPr>
+          <w:p>
+            <w:r>
+              <w:t>169</w:t>
+            </w:r>
+          </w:p>
+        </w:tc>
+        <w:tc>
+          <w:tcPr>
+            <w:tcW w:w="2088" w:type="dxa"/>
+          </w:tcPr>
+          <w:p>
+            <w:r>
+              <w:t>0.001317</w:t>
+            </w:r>
+          </w:p>
+        </w:tc>
+        <w:tc>
+          <w:tcPr>
+            <w:tcW w:w="2088" w:type="dxa"/>
+          </w:tcPr>
+          <w:p>
+            <w:r>
+              <w:t>0.000643</w:t>
+            </w:r>
+          </w:p>
+        </w:tc>
+      </w:tr>
+      <w:tr>
+        <w:tc>
+          <w:tcPr>
+            <w:tcW w:w="2088" w:type="dxa"/>
+          </w:tcPr>
+          <w:p>
+            <w:r>
+              <w:t>NORMAL</w:t>
+            </w:r>
+          </w:p>
+        </w:tc>
+        <w:tc>
+          <w:tcPr>
+            <w:tcW w:w="2088" w:type="dxa"/>
+          </w:tcPr>
+          <w:p>
+            <w:r>
+              <w:t>250</w:t>
+            </w:r>
+          </w:p>
+        </w:tc>
+        <w:tc>
+          <w:tcPr>
+            <w:tcW w:w="2088" w:type="dxa"/>
+          </w:tcPr>
+          <w:p>
+            <w:r>
+              <w:t>171</w:t>
+            </w:r>
+          </w:p>
+        </w:tc>
+        <w:tc>
+          <w:tcPr>
+            <w:tcW w:w="2088" w:type="dxa"/>
+          </w:tcPr>
+          <w:p>
+            <w:r>
+              <w:t>0.000864</w:t>
+            </w:r>
+          </w:p>
+        </w:tc>
+        <w:tc>
+          <w:tcPr>
+            <w:tcW w:w="2088" w:type="dxa"/>
+          </w:tcPr>
+          <w:p>
+            <w:r>
+              <w:t>0.000292</w:t>
+            </w:r>
+          </w:p>
+        </w:tc>
+      </w:tr>
+    </w:tbl>
     <w:p/>
     <w:p>
       <w:r>
@@ -341,56 +1552,331 @@
       </w:r>
     </w:p>
     <w:p/>
-    <w:p>
-      <w:r>
-        <w:t>| split_name | class_name | image_count | patient_count |</w:t>
-      </w:r>
-    </w:p>
-    <w:p>
-      <w:r>
-        <w:t>| --- | --- | --- | --- |</w:t>
-      </w:r>
-    </w:p>
-    <w:p>
-      <w:r>
-        <w:t>| train | NORMAL | 24 | 8 |</w:t>
-      </w:r>
-    </w:p>
-    <w:p>
-      <w:r>
-        <w:t>| val | NORMAL | 6 | 2 |</w:t>
-      </w:r>
-    </w:p>
-    <w:p>
-      <w:r>
-        <w:t>| test | CNV | 10 | 5 |</w:t>
-      </w:r>
-    </w:p>
-    <w:p>
-      <w:r>
-        <w:t>| test | DME | 10 | 5 |</w:t>
-      </w:r>
-    </w:p>
-    <w:p>
-      <w:r>
-        <w:t>| test | DRUSEN | 10 | 5 |</w:t>
-      </w:r>
-    </w:p>
-    <w:p>
-      <w:r>
-        <w:t>| test | NORMAL | 10 | 5 |</w:t>
-      </w:r>
-    </w:p>
+    <w:tbl>
+      <w:tblPr>
+        <w:tblW w:w="0" w:type="auto"/>
+        <w:tblLook w:val="04A0" w:firstRow="1" w:lastRow="0" w:firstColumn="1" w:lastColumn="0" w:noHBand="0" w:noVBand="1"/>
+      </w:tblPr>
+      <w:tblGrid>
+        <w:gridCol w:w="1219"/>
+        <w:gridCol w:w="1260"/>
+        <w:gridCol w:w="1363"/>
+        <w:gridCol w:w="1413"/>
+      </w:tblGrid>
+      <w:tr>
+        <w:tc>
+          <w:tcPr>
+            <w:tcW w:w="2609" w:type="dxa"/>
+          </w:tcPr>
+          <w:p>
+            <w:r>
+              <w:t>split_name</w:t>
+            </w:r>
+          </w:p>
+        </w:tc>
+        <w:tc>
+          <w:tcPr>
+            <w:tcW w:w="2609" w:type="dxa"/>
+          </w:tcPr>
+          <w:p>
+            <w:r>
+              <w:t>class_name</w:t>
+            </w:r>
+          </w:p>
+        </w:tc>
+        <w:tc>
+          <w:tcPr>
+            <w:tcW w:w="2609" w:type="dxa"/>
+          </w:tcPr>
+          <w:p>
+            <w:r>
+              <w:t>image_count</w:t>
+            </w:r>
+          </w:p>
+        </w:tc>
+        <w:tc>
+          <w:tcPr>
+            <w:tcW w:w="2609" w:type="dxa"/>
+          </w:tcPr>
+          <w:p>
+            <w:r>
+              <w:t>patient_count</w:t>
+            </w:r>
+          </w:p>
+        </w:tc>
+      </w:tr>
+      <w:tr>
+        <w:tc>
+          <w:tcPr>
+            <w:tcW w:w="2609" w:type="dxa"/>
+          </w:tcPr>
+          <w:p>
+            <w:r>
+              <w:t>train</w:t>
+            </w:r>
+          </w:p>
+        </w:tc>
+        <w:tc>
+          <w:tcPr>
+            <w:tcW w:w="2609" w:type="dxa"/>
+          </w:tcPr>
+          <w:p>
+            <w:r>
+              <w:t>NORMAL</w:t>
+            </w:r>
+          </w:p>
+        </w:tc>
+        <w:tc>
+          <w:tcPr>
+            <w:tcW w:w="2609" w:type="dxa"/>
+          </w:tcPr>
+          <w:p>
+            <w:r>
+              <w:t>40715</w:t>
+            </w:r>
+          </w:p>
+        </w:tc>
+        <w:tc>
+          <w:tcPr>
+            <w:tcW w:w="2609" w:type="dxa"/>
+          </w:tcPr>
+          <w:p>
+            <w:r>
+              <w:t>2747</w:t>
+            </w:r>
+          </w:p>
+        </w:tc>
+      </w:tr>
+      <w:tr>
+        <w:tc>
+          <w:tcPr>
+            <w:tcW w:w="2609" w:type="dxa"/>
+          </w:tcPr>
+          <w:p>
+            <w:r>
+              <w:t>val</w:t>
+            </w:r>
+          </w:p>
+        </w:tc>
+        <w:tc>
+          <w:tcPr>
+            <w:tcW w:w="2609" w:type="dxa"/>
+          </w:tcPr>
+          <w:p>
+            <w:r>
+              <w:t>NORMAL</w:t>
+            </w:r>
+          </w:p>
+        </w:tc>
+        <w:tc>
+          <w:tcPr>
+            <w:tcW w:w="2609" w:type="dxa"/>
+          </w:tcPr>
+          <w:p>
+            <w:r>
+              <w:t>10425</w:t>
+            </w:r>
+          </w:p>
+        </w:tc>
+        <w:tc>
+          <w:tcPr>
+            <w:tcW w:w="2609" w:type="dxa"/>
+          </w:tcPr>
+          <w:p>
+            <w:r>
+              <w:t>687</w:t>
+            </w:r>
+          </w:p>
+        </w:tc>
+      </w:tr>
+      <w:tr>
+        <w:tc>
+          <w:tcPr>
+            <w:tcW w:w="2609" w:type="dxa"/>
+          </w:tcPr>
+          <w:p>
+            <w:r>
+              <w:t>test</w:t>
+            </w:r>
+          </w:p>
+        </w:tc>
+        <w:tc>
+          <w:tcPr>
+            <w:tcW w:w="2609" w:type="dxa"/>
+          </w:tcPr>
+          <w:p>
+            <w:r>
+              <w:t>CNV</w:t>
+            </w:r>
+          </w:p>
+        </w:tc>
+        <w:tc>
+          <w:tcPr>
+            <w:tcW w:w="2609" w:type="dxa"/>
+          </w:tcPr>
+          <w:p>
+            <w:r>
+              <w:t>250</w:t>
+            </w:r>
+          </w:p>
+        </w:tc>
+        <w:tc>
+          <w:tcPr>
+            <w:tcW w:w="2609" w:type="dxa"/>
+          </w:tcPr>
+          <w:p>
+            <w:r>
+              <w:t>178</w:t>
+            </w:r>
+          </w:p>
+        </w:tc>
+      </w:tr>
+      <w:tr>
+        <w:tc>
+          <w:tcPr>
+            <w:tcW w:w="2609" w:type="dxa"/>
+          </w:tcPr>
+          <w:p>
+            <w:r>
+              <w:t>test</w:t>
+            </w:r>
+          </w:p>
+        </w:tc>
+        <w:tc>
+          <w:tcPr>
+            <w:tcW w:w="2609" w:type="dxa"/>
+          </w:tcPr>
+          <w:p>
+            <w:r>
+              <w:t>DME</w:t>
+            </w:r>
+          </w:p>
+        </w:tc>
+        <w:tc>
+          <w:tcPr>
+            <w:tcW w:w="2609" w:type="dxa"/>
+          </w:tcPr>
+          <w:p>
+            <w:r>
+              <w:t>250</w:t>
+            </w:r>
+          </w:p>
+        </w:tc>
+        <w:tc>
+          <w:tcPr>
+            <w:tcW w:w="2609" w:type="dxa"/>
+          </w:tcPr>
+          <w:p>
+            <w:r>
+              <w:t>167</w:t>
+            </w:r>
+          </w:p>
+        </w:tc>
+      </w:tr>
+      <w:tr>
+        <w:tc>
+          <w:tcPr>
+            <w:tcW w:w="2609" w:type="dxa"/>
+          </w:tcPr>
+          <w:p>
+            <w:r>
+              <w:t>test</w:t>
+            </w:r>
+          </w:p>
+        </w:tc>
+        <w:tc>
+          <w:tcPr>
+            <w:tcW w:w="2609" w:type="dxa"/>
+          </w:tcPr>
+          <w:p>
+            <w:r>
+              <w:t>DRUSEN</w:t>
+            </w:r>
+          </w:p>
+        </w:tc>
+        <w:tc>
+          <w:tcPr>
+            <w:tcW w:w="2609" w:type="dxa"/>
+          </w:tcPr>
+          <w:p>
+            <w:r>
+              <w:t>250</w:t>
+            </w:r>
+          </w:p>
+        </w:tc>
+        <w:tc>
+          <w:tcPr>
+            <w:tcW w:w="2609" w:type="dxa"/>
+          </w:tcPr>
+          <w:p>
+            <w:r>
+              <w:t>169</w:t>
+            </w:r>
+          </w:p>
+        </w:tc>
+      </w:tr>
+      <w:tr>
+        <w:tc>
+          <w:tcPr>
+            <w:tcW w:w="2609" w:type="dxa"/>
+          </w:tcPr>
+          <w:p>
+            <w:r>
+              <w:t>test</w:t>
+            </w:r>
+          </w:p>
+        </w:tc>
+        <w:tc>
+          <w:tcPr>
+            <w:tcW w:w="2609" w:type="dxa"/>
+          </w:tcPr>
+          <w:p>
+            <w:r>
+              <w:t>NORMAL</w:t>
+            </w:r>
+          </w:p>
+        </w:tc>
+        <w:tc>
+          <w:tcPr>
+            <w:tcW w:w="2609" w:type="dxa"/>
+          </w:tcPr>
+          <w:p>
+            <w:r>
+              <w:t>250</w:t>
+            </w:r>
+          </w:p>
+        </w:tc>
+        <w:tc>
+          <w:tcPr>
+            <w:tcW w:w="2609" w:type="dxa"/>
+          </w:tcPr>
+          <w:p>
+            <w:r>
+              <w:t>171</w:t>
+            </w:r>
+          </w:p>
+        </w:tc>
+      </w:tr>
+    </w:tbl>
     <w:p/>
     <w:p>
       <w:r>
-        <w:t>Uretilen sekiller `outputs/figures/` ve `outputs/reconstructions/` altinda kaydedilmektedir. Ozellikle normal ve patolojik goruntuler arasindaki reconstruction error ayrimi, modelin anomaly scoring icin kullanilabilir oldugunu gostermektedir.</w:t>
+        <w:t xml:space="preserve">Sonuclar yalnizca tablo duzeyinde degil, yorum duzeyinde de anlamlidir. p95 esigi p97 ve p99'a gore daha yuksek recall ve F1 vermistir; bu nedenle ara rapor icin daha dengeli operasyon </w:t>
+      </w:r>
+      <w:r>
+        <w:t>noktasi olarak secilmistir. CNV ve DME siniflari NORMAL goruntulerden belirgin sekilde ayrisirken, DRUSEN sinifinin error dagilimi normale daha yakindir. Bu durum, bazi patolojilerin reconstruction tabanli yaklasimlarda digerlerine gore daha zor ayristigini gostermektedir.</w:t>
       </w:r>
     </w:p>
     <w:p/>
     <w:p>
-      <w:pPr>
-        <w:pStyle w:val="Heading1"/>
+      <w:r>
+        <w:t>Rapor sonunda verilen Sekil 2, egitim egrisi, ROC performansi, error dagilimi ve reconstruction orneklerini bir araya getirerek ara sonuclarin gorsel ozetini sunmaktadir.</w:t>
+      </w:r>
+    </w:p>
+    <w:p/>
+    <w:p>
+      <w:pPr>
+        <w:pStyle w:val="Balk1"/>
       </w:pPr>
       <w:r>
         <w:t>5. Tartisma</w:t>
@@ -399,13 +1885,19 @@
     <w:p/>
     <w:p>
       <w:r>
-        <w:t>Baseline model, gorece basit olmasina ragmen normal anatomi dagilimini ogrenerek patolojik siniflarin reconstruction error degerlerini yukseltebilmektedir. Bununla birlikte reconstruction tabanli yontemlerin iyi bilinen bir siniri vardir: guclu decoder yapilari bazen anomalileri de fazla iyi yeniden uretebilir [4], [8]. Ayrica Kermany veri kumesi image-level etiketler icerir; bu nedenle lokal lesion segmentasyonu icin dogrudan pixel-level ground truth bulunmamaktadir. Dolayisiyla bu ara surum, klinik karar destek sistemi olarak degil, tarama seviyesinde anomaly scoring yapan bir arastirma prototipi olarak degerlendirilmelidir.</w:t>
+        <w:t>Baseline model, gorece basit olmasina ragmen normal anatomi dagilimini ogrenerek patolojik siniflarin reconstruction error degerlerini yukseltebilmektedir. Bununla birlikte reconstruction tabanli yontemlerin iyi bilinen bir siniri vardir: guclu decoder yapilari bazen anomalileri de fazla iyi yeniden uretebilir [4], [8]. Kermany veri kumesi image-level etiketler icerir; bu nedenle lokal lesion segmentasyonu icin dogrudan pixel-level ground truth bulunmamaktadir. Ayrica threshold seciminin precision-recall dengesi uzerinde guclu etkisi vardir. Bu nedenle tek bir metrik yerine percentile bazli karsilastirma tablosu korunmustur.</w:t>
       </w:r>
     </w:p>
     <w:p/>
     <w:p>
-      <w:pPr>
-        <w:pStyle w:val="Heading1"/>
+      <w:r>
+        <w:t>Hesaplama maliyeti de goz ardi edilemez. Egitim kosusu yerel ortamda uzun sayilabilecek bir surede tamamlanmistir ve bu durum veri yukleme ile on isleme hattinin da iyilestirme alani oldugunu gostermektedir. Dolayisiyla mevcut sistem klinik kullanimdan ziyade arastirma ve erken tarama mantiginda degerlendirilmelidir.</w:t>
+      </w:r>
+    </w:p>
+    <w:p/>
+    <w:p>
+      <w:pPr>
+        <w:pStyle w:val="Balk1"/>
       </w:pPr>
       <w:r>
         <w:t>6. Gelecek Calismalar</w:t>
@@ -414,13 +1906,13 @@
     <w:p/>
     <w:p>
       <w:r>
-        <w:t>Final asamada birkac dogrudan gelistirme yolu bulunmaktadir. Ilk olarak standart autoencoder yerine VAE veya memory-augmented reconstruction modelleri denenebilir. Ikinci olarak residual map veya anomaly map kalitesi artirilabilir. Ucuncu olarak knowledge distillation tabanli retinal OCT anomaly detection yaklasimlari [7], [9] ile karsilastirma yapilabilir. Son olarak bir ablation calismasi ile image size, latent boyut ve threshold seciminin etkisi sistematik olarak incelenebilir.</w:t>
+        <w:t>Final asamada standart autoencoder yerine VAE veya memory-augmented reconstruction modelleri denenebilir. Residual map kalitesi artirilabilir, daha yuksek giris cozunurlugu ile DRUSEN gibi zorlayici siniflarda ayristirma gucu test edilebilir ve image size, latent boyut ile threshold seciminin etkisi sistematik ablation calismalariyla incelenebilir.</w:t>
       </w:r>
     </w:p>
     <w:p/>
     <w:p>
       <w:pPr>
-        <w:pStyle w:val="Heading1"/>
+        <w:pStyle w:val="Balk1"/>
       </w:pPr>
       <w:r>
         <w:t>7. Sonuc</w:t>
@@ -429,15 +1921,16 @@
     <w:p/>
     <w:p>
       <w:r>
-        <w:t>Bu ara rapor asamasinda, Kermany OCT verisi icin patient-level validation kullanan, yalnizca normal goruntulerle egitilen ve reconstruction error ile patolojik scan tespiti yapan tekrar uretilebilir bir baseline sistem kurulmustur. Kod altyapisi; veri hazirlama, egitim, degerlendirme, grafik uretimi ve ara rapor taslagi olusturma adimlarini tek akista birlestirmektedir. Final asamada hedef, bu baseline'i daha guclu anomaly detection yaklasimlariyla genisletmek ve sonuclari daha kapsamli karsilastirmali deneylerle desteklemektir.</w:t>
+        <w:t>Bu ara rapor asamasinda, Kermany OCT verisi icin patient-level validation kullanan, yalnizca normal goruntulerle egitilen ve reconstruction error ile patolojik scan tespiti yapan tekrar uretilebilir bir baseline sistem kurulmustur. Gercek veri uzerinde elde edilen AUROC 0.9108 ve F1 0.8201 degerleri, projenin planlama asamasini gecip calisir ve savunulabilir bir noktaya geldigini gostermektedir. Final asamada hedef, bu baseline'i daha guclu anomaly detection yaklasimlariyla genisletmek ve sonuclari karsilastirmali deneylerle desteklemektir.</w:t>
       </w:r>
     </w:p>
     <w:p/>
     <w:p>
       <w:pPr>
-        <w:pStyle w:val="Heading1"/>
-      </w:pPr>
-      <w:r>
+        <w:pStyle w:val="Balk1"/>
+      </w:pPr>
+      <w:r>
+        <w:lastRenderedPageBreak/>
         <w:t>Kaynaklar</w:t>
       </w:r>
     </w:p>
@@ -490,6 +1983,108 @@
     <w:p>
       <w:r>
         <w:t>[10] Wang J, Li W, Chen Y, et al. Weakly supervised anomaly segmentation in retinal OCT images using an adversarial learning approach. Biomed Opt Express. 2021;12(8):4713-4729. doi:10.1364/BOE.426803</w:t>
+      </w:r>
+    </w:p>
+    <w:p>
+      <w:pPr>
+        <w:pStyle w:val="Balk1"/>
+      </w:pPr>
+      <w:r>
+        <w:t>Sekiller</w:t>
+      </w:r>
+    </w:p>
+    <w:p>
+      <w:r>
+        <w:rPr>
+          <w:noProof/>
+        </w:rPr>
+        <w:drawing>
+          <wp:inline distT="0" distB="0" distL="0" distR="0" wp14:anchorId="2C45BCA5" wp14:editId="4AD2875F">
+            <wp:extent cx="3197283" cy="724395"/>
+            <wp:effectExtent l="0" t="0" r="3175" b="0"/>
+            <wp:docPr id="1" name="Picture 1"/>
+            <wp:cNvGraphicFramePr>
+              <a:graphicFrameLocks xmlns:a="http://schemas.openxmlformats.org/drawingml/2006/main" noChangeAspect="1"/>
+            </wp:cNvGraphicFramePr>
+            <a:graphic xmlns:a="http://schemas.openxmlformats.org/drawingml/2006/main">
+              <a:graphicData uri="http://schemas.openxmlformats.org/drawingml/2006/picture">
+                <pic:pic xmlns:pic="http://schemas.openxmlformats.org/drawingml/2006/picture">
+                  <pic:nvPicPr>
+                    <pic:cNvPr id="0" name="retina_oct_pipeline.png"/>
+                    <pic:cNvPicPr/>
+                  </pic:nvPicPr>
+                  <pic:blipFill>
+                    <a:blip r:embed="rId6"/>
+                    <a:stretch>
+                      <a:fillRect/>
+                    </a:stretch>
+                  </pic:blipFill>
+                  <pic:spPr>
+                    <a:xfrm>
+                      <a:off x="0" y="0"/>
+                      <a:ext cx="3221345" cy="729847"/>
+                    </a:xfrm>
+                    <a:prstGeom prst="rect">
+                      <a:avLst/>
+                    </a:prstGeom>
+                  </pic:spPr>
+                </pic:pic>
+              </a:graphicData>
+            </a:graphic>
+          </wp:inline>
+        </w:drawing>
+      </w:r>
+    </w:p>
+    <w:p>
+      <w:r>
+        <w:t>Sekil 1. Onerilen retina OCT anomaly detection boru hatti.</w:t>
+      </w:r>
+    </w:p>
+    <w:p>
+      <w:r>
+        <w:rPr>
+          <w:noProof/>
+        </w:rPr>
+        <w:drawing>
+          <wp:inline distT="0" distB="0" distL="0" distR="0" wp14:anchorId="0D52774A" wp14:editId="2FB70F53">
+            <wp:extent cx="5669280" cy="4103290"/>
+            <wp:effectExtent l="0" t="0" r="0" b="0"/>
+            <wp:docPr id="2" name="Picture 2"/>
+            <wp:cNvGraphicFramePr>
+              <a:graphicFrameLocks xmlns:a="http://schemas.openxmlformats.org/drawingml/2006/main" noChangeAspect="1"/>
+            </wp:cNvGraphicFramePr>
+            <a:graphic xmlns:a="http://schemas.openxmlformats.org/drawingml/2006/main">
+              <a:graphicData uri="http://schemas.openxmlformats.org/drawingml/2006/picture">
+                <pic:pic xmlns:pic="http://schemas.openxmlformats.org/drawingml/2006/picture">
+                  <pic:nvPicPr>
+                    <pic:cNvPr id="0" name="report_results_overview.png"/>
+                    <pic:cNvPicPr/>
+                  </pic:nvPicPr>
+                  <pic:blipFill>
+                    <a:blip r:embed="rId7"/>
+                    <a:stretch>
+                      <a:fillRect/>
+                    </a:stretch>
+                  </pic:blipFill>
+                  <pic:spPr>
+                    <a:xfrm>
+                      <a:off x="0" y="0"/>
+                      <a:ext cx="5669280" cy="4103290"/>
+                    </a:xfrm>
+                    <a:prstGeom prst="rect">
+                      <a:avLst/>
+                    </a:prstGeom>
+                  </pic:spPr>
+                </pic:pic>
+              </a:graphicData>
+            </a:graphic>
+          </wp:inline>
+        </w:drawing>
+      </w:r>
+    </w:p>
+    <w:p>
+      <w:r>
+        <w:t>Sekil 2. Egitim, ROC, error dagilimi ve reconstruction ciktilarini bir araya getiren ozet gorsel.</w:t>
       </w:r>
     </w:p>
     <w:sectPr>
@@ -505,7 +2100,7 @@
 </file>
 
 <file path=word/numbering.xml><?xml version="1.0" encoding="utf-8"?>
-<w:numbering xmlns:wpc="http://schemas.microsoft.com/office/word/2010/wordprocessingCanvas" xmlns:cx="http://schemas.microsoft.com/office/drawing/2014/chartex" xmlns:cx1="http://schemas.microsoft.com/office/drawing/2015/9/8/chartex" xmlns:cx2="http://schemas.microsoft.com/office/drawing/2015/10/21/chartex" xmlns:cx3="http://schemas.microsoft.com/office/drawing/2016/5/9/chartex" xmlns:cx4="http://schemas.microsoft.com/office/drawing/2016/5/10/chartex" xmlns:cx5="http://schemas.microsoft.com/office/drawing/2016/5/11/chartex" xmlns:cx6="http://schemas.microsoft.com/office/drawing/2016/5/12/chartex" xmlns:cx7="http://schemas.microsoft.com/office/drawing/2016/5/13/chartex" xmlns:cx8="http://schemas.microsoft.com/office/drawing/2016/5/14/chartex" xmlns:mc="http://schemas.openxmlformats.org/markup-compatibility/2006" xmlns:aink="http://schemas.microsoft.com/office/drawing/2016/ink" xmlns:am3d="http://schemas.microsoft.com/office/drawing/2017/model3d" xmlns:o="urn:schemas-microsoft-com:office:office" xmlns:r="http://schemas.openxmlformats.org/officeDocument/2006/relationships" xmlns:m="http://schemas.openxmlformats.org/officeDocument/2006/math" xmlns:v="urn:schemas-microsoft-com:vml" xmlns:wp14="http://schemas.microsoft.com/office/word/2010/wordprocessingDrawing" xmlns:wp="http://schemas.openxmlformats.org/drawingml/2006/wordprocessingDrawing" xmlns:w10="urn:schemas-microsoft-com:office:word" xmlns:w="http://schemas.openxmlformats.org/wordprocessingml/2006/main" xmlns:w14="http://schemas.microsoft.com/office/word/2010/wordml" xmlns:w15="http://schemas.microsoft.com/office/word/2012/wordml" xmlns:w16cex="http://schemas.microsoft.com/office/word/2018/wordml/cex" xmlns:w16cid="http://schemas.microsoft.com/office/word/2016/wordml/cid" xmlns:w16="http://schemas.microsoft.com/office/word/2018/wordml" xmlns:w16se="http://schemas.microsoft.com/office/word/2015/wordml/symex" xmlns:wpg="http://schemas.microsoft.com/office/word/2010/wordprocessingGroup" xmlns:wpi="http://schemas.microsoft.com/office/word/2010/wordprocessingInk" xmlns:wne="http://schemas.microsoft.com/office/word/2006/wordml" xmlns:wps="http://schemas.microsoft.com/office/word/2010/wordprocessingShape" mc:Ignorable="w14 w15 w16se w16cid w16 w16cex wp14">
+<w:numbering xmlns:wpc="http://schemas.microsoft.com/office/word/2010/wordprocessingCanvas" xmlns:cx="http://schemas.microsoft.com/office/drawing/2014/chartex" xmlns:cx1="http://schemas.microsoft.com/office/drawing/2015/9/8/chartex" xmlns:cx2="http://schemas.microsoft.com/office/drawing/2015/10/21/chartex" xmlns:cx3="http://schemas.microsoft.com/office/drawing/2016/5/9/chartex" xmlns:cx4="http://schemas.microsoft.com/office/drawing/2016/5/10/chartex" xmlns:cx5="http://schemas.microsoft.com/office/drawing/2016/5/11/chartex" xmlns:cx6="http://schemas.microsoft.com/office/drawing/2016/5/12/chartex" xmlns:cx7="http://schemas.microsoft.com/office/drawing/2016/5/13/chartex" xmlns:cx8="http://schemas.microsoft.com/office/drawing/2016/5/14/chartex" xmlns:mc="http://schemas.openxmlformats.org/markup-compatibility/2006" xmlns:aink="http://schemas.microsoft.com/office/drawing/2016/ink" xmlns:am3d="http://schemas.microsoft.com/office/drawing/2017/model3d" xmlns:o="urn:schemas-microsoft-com:office:office" xmlns:oel="http://schemas.microsoft.com/office/2019/extlst" xmlns:r="http://schemas.openxmlformats.org/officeDocument/2006/relationships" xmlns:m="http://schemas.openxmlformats.org/officeDocument/2006/math" xmlns:v="urn:schemas-microsoft-com:vml" xmlns:wp14="http://schemas.microsoft.com/office/word/2010/wordprocessingDrawing" xmlns:wp="http://schemas.openxmlformats.org/drawingml/2006/wordprocessingDrawing" xmlns:w10="urn:schemas-microsoft-com:office:word" xmlns:w="http://schemas.openxmlformats.org/wordprocessingml/2006/main" xmlns:w14="http://schemas.microsoft.com/office/word/2010/wordml" xmlns:w15="http://schemas.microsoft.com/office/word/2012/wordml" xmlns:w16cex="http://schemas.microsoft.com/office/word/2018/wordml/cex" xmlns:w16cid="http://schemas.microsoft.com/office/word/2016/wordml/cid" xmlns:w16="http://schemas.microsoft.com/office/word/2018/wordml" xmlns:w16du="http://schemas.microsoft.com/office/word/2023/wordml/word16du" xmlns:w16sdtdh="http://schemas.microsoft.com/office/word/2020/wordml/sdtdatahash" xmlns:w16sdtfl="http://schemas.microsoft.com/office/word/2024/wordml/sdtformatlock" xmlns:w16se="http://schemas.microsoft.com/office/word/2015/wordml/symex" xmlns:wpg="http://schemas.microsoft.com/office/word/2010/wordprocessingGroup" xmlns:wpi="http://schemas.microsoft.com/office/word/2010/wordprocessingInk" xmlns:wne="http://schemas.microsoft.com/office/word/2006/wordml" xmlns:wps="http://schemas.microsoft.com/office/word/2010/wordprocessingShape" mc:Ignorable="w14 w15 w16se w16cid w16 w16cex w16sdtdh w16sdtfl w16du wp14">
   <w:abstractNum w:abstractNumId="0" w15:restartNumberingAfterBreak="0">
     <w:nsid w:val="0A161725"/>
     <w:multiLevelType w:val="multilevel"/>
@@ -653,7 +2248,7 @@
     <w:lvl w:ilvl="0">
       <w:start w:val="1"/>
       <w:numFmt w:val="upperRoman"/>
-      <w:pStyle w:val="Heading1"/>
+      <w:pStyle w:val="Balk1"/>
       <w:lvlText w:val="%1."/>
       <w:lvlJc w:val="center"/>
       <w:pPr>
@@ -679,7 +2274,7 @@
     <w:lvl w:ilvl="1">
       <w:start w:val="1"/>
       <w:numFmt w:val="upperLetter"/>
-      <w:pStyle w:val="Heading2"/>
+      <w:pStyle w:val="Balk2"/>
       <w:lvlText w:val="%2."/>
       <w:lvlJc w:val="left"/>
       <w:pPr>
@@ -709,7 +2304,7 @@
     <w:lvl w:ilvl="2">
       <w:start w:val="1"/>
       <w:numFmt w:val="decimal"/>
-      <w:pStyle w:val="Heading3"/>
+      <w:pStyle w:val="Balk3"/>
       <w:lvlText w:val="%3)"/>
       <w:lvlJc w:val="left"/>
       <w:pPr>
@@ -739,7 +2334,7 @@
     <w:lvl w:ilvl="3">
       <w:start w:val="1"/>
       <w:numFmt w:val="lowerLetter"/>
-      <w:pStyle w:val="Heading4"/>
+      <w:pStyle w:val="Balk4"/>
       <w:lvlText w:val="%4)"/>
       <w:lvlJc w:val="left"/>
       <w:pPr>
@@ -1472,32 +3067,32 @@
       </w:pPr>
     </w:lvl>
   </w:abstractNum>
-  <w:num w:numId="1">
+  <w:num w:numId="1" w16cid:durableId="1185746322">
     <w:abstractNumId w:val="1"/>
   </w:num>
-  <w:num w:numId="2">
+  <w:num w:numId="2" w16cid:durableId="1754887973">
     <w:abstractNumId w:val="0"/>
   </w:num>
-  <w:num w:numId="3">
+  <w:num w:numId="3" w16cid:durableId="434522516">
     <w:abstractNumId w:val="4"/>
   </w:num>
-  <w:num w:numId="4">
+  <w:num w:numId="4" w16cid:durableId="1151365837">
     <w:abstractNumId w:val="3"/>
   </w:num>
-  <w:num w:numId="5">
+  <w:num w:numId="5" w16cid:durableId="2063022022">
     <w:abstractNumId w:val="2"/>
   </w:num>
-  <w:num w:numId="6">
+  <w:num w:numId="6" w16cid:durableId="1948192167">
     <w:abstractNumId w:val="5"/>
   </w:num>
-  <w:num w:numId="7">
+  <w:num w:numId="7" w16cid:durableId="468980294">
     <w:abstractNumId w:val="6"/>
   </w:num>
 </w:numbering>
 </file>
 
 <file path=word/styles.xml><?xml version="1.0" encoding="utf-8"?>
-<w:styles xmlns:mc="http://schemas.openxmlformats.org/markup-compatibility/2006" xmlns:r="http://schemas.openxmlformats.org/officeDocument/2006/relationships" xmlns:w="http://schemas.openxmlformats.org/wordprocessingml/2006/main" xmlns:w14="http://schemas.microsoft.com/office/word/2010/wordml" xmlns:w15="http://schemas.microsoft.com/office/word/2012/wordml" xmlns:w16cex="http://schemas.microsoft.com/office/word/2018/wordml/cex" xmlns:w16cid="http://schemas.microsoft.com/office/word/2016/wordml/cid" xmlns:w16="http://schemas.microsoft.com/office/word/2018/wordml" xmlns:w16se="http://schemas.microsoft.com/office/word/2015/wordml/symex" mc:Ignorable="w14 w15 w16se w16cid w16 w16cex">
+<w:styles xmlns:mc="http://schemas.openxmlformats.org/markup-compatibility/2006" xmlns:r="http://schemas.openxmlformats.org/officeDocument/2006/relationships" xmlns:w="http://schemas.openxmlformats.org/wordprocessingml/2006/main" xmlns:w14="http://schemas.microsoft.com/office/word/2010/wordml" xmlns:w15="http://schemas.microsoft.com/office/word/2012/wordml" xmlns:w16cex="http://schemas.microsoft.com/office/word/2018/wordml/cex" xmlns:w16cid="http://schemas.microsoft.com/office/word/2016/wordml/cid" xmlns:w16="http://schemas.microsoft.com/office/word/2018/wordml" xmlns:w16du="http://schemas.microsoft.com/office/word/2023/wordml/word16du" xmlns:w16sdtdh="http://schemas.microsoft.com/office/word/2020/wordml/sdtdatahash" xmlns:w16sdtfl="http://schemas.microsoft.com/office/word/2024/wordml/sdtformatlock" xmlns:w16se="http://schemas.microsoft.com/office/word/2015/wordml/symex" mc:Ignorable="w14 w15 w16se w16cid w16 w16cex w16sdtdh w16sdtfl w16du">
   <w:docDefaults>
     <w:rPrDefault>
       <w:rPr>
@@ -1897,11 +3492,11 @@
       <w:lang w:val="tr-TR"/>
     </w:rPr>
   </w:style>
-  <w:style w:type="paragraph" w:styleId="Heading1">
+  <w:style w:type="paragraph" w:styleId="Balk1">
     <w:name w:val="heading 1"/>
     <w:basedOn w:val="Normal"/>
     <w:next w:val="Normal"/>
-    <w:link w:val="Heading1Char"/>
+    <w:link w:val="Balk1Char"/>
     <w:uiPriority w:val="99"/>
     <w:qFormat/>
     <w:rsid w:val="006E09AB"/>
@@ -1921,11 +3516,11 @@
       <w:smallCaps/>
     </w:rPr>
   </w:style>
-  <w:style w:type="paragraph" w:styleId="Heading2">
+  <w:style w:type="paragraph" w:styleId="Balk2">
     <w:name w:val="heading 2"/>
     <w:basedOn w:val="Normal"/>
     <w:next w:val="Normal"/>
-    <w:link w:val="Heading2Char"/>
+    <w:link w:val="Balk2Char"/>
     <w:uiPriority w:val="99"/>
     <w:qFormat/>
     <w:rsid w:val="00EF3A1A"/>
@@ -1946,11 +3541,11 @@
       <w:iCs/>
     </w:rPr>
   </w:style>
-  <w:style w:type="paragraph" w:styleId="Heading3">
+  <w:style w:type="paragraph" w:styleId="Balk3">
     <w:name w:val="heading 3"/>
     <w:basedOn w:val="Normal"/>
     <w:next w:val="Normal"/>
-    <w:link w:val="Heading3Char"/>
+    <w:link w:val="Balk3Char"/>
     <w:uiPriority w:val="99"/>
     <w:qFormat/>
     <w:rsid w:val="00431D98"/>
@@ -1970,11 +3565,11 @@
       <w:iCs/>
     </w:rPr>
   </w:style>
-  <w:style w:type="paragraph" w:styleId="Heading4">
+  <w:style w:type="paragraph" w:styleId="Balk4">
     <w:name w:val="heading 4"/>
     <w:basedOn w:val="Normal"/>
     <w:next w:val="Normal"/>
-    <w:link w:val="Heading4Char"/>
+    <w:link w:val="Balk4Char"/>
     <w:uiPriority w:val="99"/>
     <w:qFormat/>
     <w:rsid w:val="004059FE"/>
@@ -1996,11 +3591,11 @@
       <w:iCs/>
     </w:rPr>
   </w:style>
-  <w:style w:type="paragraph" w:styleId="Heading5">
+  <w:style w:type="paragraph" w:styleId="Balk5">
     <w:name w:val="heading 5"/>
     <w:basedOn w:val="Normal"/>
     <w:next w:val="Normal"/>
-    <w:link w:val="Heading5Char"/>
+    <w:link w:val="Balk5Char"/>
     <w:uiPriority w:val="99"/>
     <w:qFormat/>
     <w:rsid w:val="006E09AB"/>
@@ -2015,13 +3610,13 @@
       <w:smallCaps/>
     </w:rPr>
   </w:style>
-  <w:style w:type="character" w:default="1" w:styleId="DefaultParagraphFont">
+  <w:style w:type="character" w:default="1" w:styleId="VarsaylanParagrafYazTipi">
     <w:name w:val="Default Paragraph Font"/>
     <w:uiPriority w:val="1"/>
     <w:semiHidden/>
     <w:unhideWhenUsed/>
   </w:style>
-  <w:style w:type="table" w:default="1" w:styleId="TableNormal">
+  <w:style w:type="table" w:default="1" w:styleId="NormalTablo">
     <w:name w:val="Normal Table"/>
     <w:uiPriority w:val="99"/>
     <w:semiHidden/>
@@ -2036,15 +3631,15 @@
       </w:tblCellMar>
     </w:tblPr>
   </w:style>
-  <w:style w:type="numbering" w:default="1" w:styleId="NoList">
+  <w:style w:type="numbering" w:default="1" w:styleId="ListeYok">
     <w:name w:val="No List"/>
     <w:uiPriority w:val="99"/>
     <w:semiHidden/>
     <w:unhideWhenUsed/>
   </w:style>
-  <w:style w:type="character" w:customStyle="1" w:styleId="Heading1Char">
-    <w:name w:val="Heading 1 Char"/>
-    <w:link w:val="Heading1"/>
+  <w:style w:type="character" w:customStyle="1" w:styleId="Balk1Char">
+    <w:name w:val="Başlık 1 Char"/>
+    <w:link w:val="Balk1"/>
     <w:uiPriority w:val="99"/>
     <w:qFormat/>
     <w:locked/>
@@ -2054,9 +3649,9 @@
       <w:smallCaps/>
     </w:rPr>
   </w:style>
-  <w:style w:type="character" w:customStyle="1" w:styleId="Heading2Char">
-    <w:name w:val="Heading 2 Char"/>
-    <w:link w:val="Heading2"/>
+  <w:style w:type="character" w:customStyle="1" w:styleId="Balk2Char">
+    <w:name w:val="Başlık 2 Char"/>
+    <w:link w:val="Balk2"/>
     <w:uiPriority w:val="99"/>
     <w:qFormat/>
     <w:locked/>
@@ -2067,9 +3662,9 @@
       <w:iCs/>
     </w:rPr>
   </w:style>
-  <w:style w:type="character" w:customStyle="1" w:styleId="Heading3Char">
-    <w:name w:val="Heading 3 Char"/>
-    <w:link w:val="Heading3"/>
+  <w:style w:type="character" w:customStyle="1" w:styleId="Balk3Char">
+    <w:name w:val="Başlık 3 Char"/>
+    <w:link w:val="Balk3"/>
     <w:uiPriority w:val="99"/>
     <w:qFormat/>
     <w:locked/>
@@ -2080,9 +3675,9 @@
       <w:iCs/>
     </w:rPr>
   </w:style>
-  <w:style w:type="character" w:customStyle="1" w:styleId="Heading4Char">
-    <w:name w:val="Heading 4 Char"/>
-    <w:link w:val="Heading4"/>
+  <w:style w:type="character" w:customStyle="1" w:styleId="Balk4Char">
+    <w:name w:val="Başlık 4 Char"/>
+    <w:link w:val="Balk4"/>
     <w:uiPriority w:val="99"/>
     <w:qFormat/>
     <w:locked/>
@@ -2093,9 +3688,9 @@
       <w:iCs/>
     </w:rPr>
   </w:style>
-  <w:style w:type="character" w:customStyle="1" w:styleId="Heading5Char">
-    <w:name w:val="Heading 5 Char"/>
-    <w:link w:val="Heading5"/>
+  <w:style w:type="character" w:customStyle="1" w:styleId="Balk5Char">
+    <w:name w:val="Başlık 5 Char"/>
+    <w:link w:val="Balk5"/>
     <w:uiPriority w:val="9"/>
     <w:semiHidden/>
     <w:qFormat/>
@@ -2111,9 +3706,9 @@
       <w:szCs w:val="26"/>
     </w:rPr>
   </w:style>
-  <w:style w:type="character" w:customStyle="1" w:styleId="BodyTextChar">
-    <w:name w:val="Body Text Char"/>
-    <w:link w:val="BodyText"/>
+  <w:style w:type="character" w:customStyle="1" w:styleId="GvdeMetniChar">
+    <w:name w:val="Gövde Metni Char"/>
+    <w:link w:val="GvdeMetni"/>
     <w:uiPriority w:val="99"/>
     <w:qFormat/>
     <w:locked/>
@@ -2124,10 +3719,10 @@
       <w:szCs w:val="20"/>
     </w:rPr>
   </w:style>
-  <w:style w:type="character" w:customStyle="1" w:styleId="BalloonTextChar">
-    <w:name w:val="Balloon Text Char"/>
-    <w:basedOn w:val="DefaultParagraphFont"/>
-    <w:link w:val="BalloonText"/>
+  <w:style w:type="character" w:customStyle="1" w:styleId="BalonMetniChar">
+    <w:name w:val="Balon Metni Char"/>
+    <w:basedOn w:val="VarsaylanParagrafYazTipi"/>
+    <w:link w:val="BalonMetni"/>
     <w:uiPriority w:val="99"/>
     <w:semiHidden/>
     <w:qFormat/>
@@ -2138,10 +3733,10 @@
       <w:szCs w:val="16"/>
     </w:rPr>
   </w:style>
-  <w:style w:type="character" w:customStyle="1" w:styleId="HeaderChar">
-    <w:name w:val="Header Char"/>
-    <w:basedOn w:val="DefaultParagraphFont"/>
-    <w:link w:val="Header"/>
+  <w:style w:type="character" w:customStyle="1" w:styleId="stBilgiChar">
+    <w:name w:val="Üst Bilgi Char"/>
+    <w:basedOn w:val="VarsaylanParagrafYazTipi"/>
+    <w:link w:val="stBilgi"/>
     <w:uiPriority w:val="99"/>
     <w:qFormat/>
     <w:rsid w:val="00D42065"/>
@@ -2149,10 +3744,10 @@
       <w:rFonts w:ascii="Times New Roman" w:hAnsi="Times New Roman"/>
     </w:rPr>
   </w:style>
-  <w:style w:type="character" w:customStyle="1" w:styleId="FooterChar">
-    <w:name w:val="Footer Char"/>
-    <w:basedOn w:val="DefaultParagraphFont"/>
-    <w:link w:val="Footer"/>
+  <w:style w:type="character" w:customStyle="1" w:styleId="AltBilgiChar">
+    <w:name w:val="Alt Bilgi Char"/>
+    <w:basedOn w:val="VarsaylanParagrafYazTipi"/>
+    <w:link w:val="AltBilgi"/>
     <w:uiPriority w:val="99"/>
     <w:qFormat/>
     <w:rsid w:val="00D42065"/>
@@ -2162,7 +3757,7 @@
   </w:style>
   <w:style w:type="character" w:customStyle="1" w:styleId="InternetLink">
     <w:name w:val="Internet Link"/>
-    <w:basedOn w:val="DefaultParagraphFont"/>
+    <w:basedOn w:val="VarsaylanParagrafYazTipi"/>
     <w:uiPriority w:val="99"/>
     <w:unhideWhenUsed/>
     <w:rsid w:val="00CE49D1"/>
@@ -3295,7 +4890,7 @@
   <w:style w:type="paragraph" w:customStyle="1" w:styleId="Heading">
     <w:name w:val="Heading"/>
     <w:basedOn w:val="Normal"/>
-    <w:next w:val="BodyText"/>
+    <w:next w:val="GvdeMetni"/>
     <w:qFormat/>
     <w:pPr>
       <w:keepNext/>
@@ -3307,10 +4902,10 @@
       <w:szCs w:val="28"/>
     </w:rPr>
   </w:style>
-  <w:style w:type="paragraph" w:styleId="BodyText">
+  <w:style w:type="paragraph" w:styleId="GvdeMetni">
     <w:name w:val="Body Text"/>
     <w:basedOn w:val="Normal"/>
-    <w:link w:val="BodyTextChar"/>
+    <w:link w:val="GvdeMetniChar"/>
     <w:uiPriority w:val="99"/>
     <w:qFormat/>
     <w:rsid w:val="00753F7B"/>
@@ -3327,14 +4922,14 @@
       <w:spacing w:val="-1"/>
     </w:rPr>
   </w:style>
-  <w:style w:type="paragraph" w:styleId="List">
+  <w:style w:type="paragraph" w:styleId="Liste">
     <w:name w:val="List"/>
-    <w:basedOn w:val="BodyText"/>
+    <w:basedOn w:val="GvdeMetni"/>
     <w:rPr>
       <w:rFonts w:cs="Lohit Devanagari"/>
     </w:rPr>
   </w:style>
-  <w:style w:type="paragraph" w:styleId="Caption">
+  <w:style w:type="paragraph" w:styleId="ResimYazs">
     <w:name w:val="caption"/>
     <w:basedOn w:val="Normal"/>
     <w:qFormat/>
@@ -3406,7 +5001,7 @@
   </w:style>
   <w:style w:type="paragraph" w:customStyle="1" w:styleId="bulletlist">
     <w:name w:val="bullet list"/>
-    <w:basedOn w:val="BodyText"/>
+    <w:basedOn w:val="GvdeMetni"/>
     <w:qFormat/>
     <w:rsid w:val="008054BC"/>
     <w:pPr>
@@ -3692,10 +5287,10 @@
       <w:szCs w:val="18"/>
     </w:rPr>
   </w:style>
-  <w:style w:type="paragraph" w:styleId="BalloonText">
+  <w:style w:type="paragraph" w:styleId="BalonMetni">
     <w:name w:val="Balloon Text"/>
     <w:basedOn w:val="Normal"/>
-    <w:link w:val="BalloonTextChar"/>
+    <w:link w:val="BalonMetniChar"/>
     <w:uiPriority w:val="99"/>
     <w:semiHidden/>
     <w:unhideWhenUsed/>
@@ -3707,10 +5302,10 @@
       <w:szCs w:val="16"/>
     </w:rPr>
   </w:style>
-  <w:style w:type="paragraph" w:styleId="Header">
+  <w:style w:type="paragraph" w:styleId="stBilgi">
     <w:name w:val="header"/>
     <w:basedOn w:val="Normal"/>
-    <w:link w:val="HeaderChar"/>
+    <w:link w:val="stBilgiChar"/>
     <w:uiPriority w:val="99"/>
     <w:unhideWhenUsed/>
     <w:rsid w:val="00D42065"/>
@@ -3721,10 +5316,10 @@
       </w:tabs>
     </w:pPr>
   </w:style>
-  <w:style w:type="paragraph" w:styleId="Footer">
+  <w:style w:type="paragraph" w:styleId="AltBilgi">
     <w:name w:val="footer"/>
     <w:basedOn w:val="Normal"/>
-    <w:link w:val="FooterChar"/>
+    <w:link w:val="AltBilgiChar"/>
     <w:uiPriority w:val="99"/>
     <w:unhideWhenUsed/>
     <w:rsid w:val="00D42065"/>

</xml_diff>

<commit_message>
Expand future work section in ara rapor
</commit_message>
<xml_diff>
--- a/report/ara_rapor_draft.docx
+++ b/report/ara_rapor_draft.docx
@@ -1,23 +1,35 @@
 
 <file path=word/document.xml><?xml version="1.0" encoding="utf-8"?>
-<w:document xmlns:wpc="http://schemas.microsoft.com/office/word/2010/wordprocessingCanvas" xmlns:cx="http://schemas.microsoft.com/office/drawing/2014/chartex" xmlns:cx1="http://schemas.microsoft.com/office/drawing/2015/9/8/chartex" xmlns:cx2="http://schemas.microsoft.com/office/drawing/2015/10/21/chartex" xmlns:cx3="http://schemas.microsoft.com/office/drawing/2016/5/9/chartex" xmlns:cx4="http://schemas.microsoft.com/office/drawing/2016/5/10/chartex" xmlns:cx5="http://schemas.microsoft.com/office/drawing/2016/5/11/chartex" xmlns:cx6="http://schemas.microsoft.com/office/drawing/2016/5/12/chartex" xmlns:cx7="http://schemas.microsoft.com/office/drawing/2016/5/13/chartex" xmlns:cx8="http://schemas.microsoft.com/office/drawing/2016/5/14/chartex" xmlns:mc="http://schemas.openxmlformats.org/markup-compatibility/2006" xmlns:aink="http://schemas.microsoft.com/office/drawing/2016/ink" xmlns:am3d="http://schemas.microsoft.com/office/drawing/2017/model3d" xmlns:o="urn:schemas-microsoft-com:office:office" xmlns:oel="http://schemas.microsoft.com/office/2019/extlst" xmlns:r="http://schemas.openxmlformats.org/officeDocument/2006/relationships" xmlns:m="http://schemas.openxmlformats.org/officeDocument/2006/math" xmlns:v="urn:schemas-microsoft-com:vml" xmlns:wp14="http://schemas.microsoft.com/office/word/2010/wordprocessingDrawing" xmlns:wp="http://schemas.openxmlformats.org/drawingml/2006/wordprocessingDrawing" xmlns:w10="urn:schemas-microsoft-com:office:word" xmlns:w="http://schemas.openxmlformats.org/wordprocessingml/2006/main" xmlns:w14="http://schemas.microsoft.com/office/word/2010/wordml" xmlns:w15="http://schemas.microsoft.com/office/word/2012/wordml" xmlns:w16cex="http://schemas.microsoft.com/office/word/2018/wordml/cex" xmlns:w16cid="http://schemas.microsoft.com/office/word/2016/wordml/cid" xmlns:w16="http://schemas.microsoft.com/office/word/2018/wordml" xmlns:w16du="http://schemas.microsoft.com/office/word/2023/wordml/word16du" xmlns:w16sdtdh="http://schemas.microsoft.com/office/word/2020/wordml/sdtdatahash" xmlns:w16sdtfl="http://schemas.microsoft.com/office/word/2024/wordml/sdtformatlock" xmlns:w16se="http://schemas.microsoft.com/office/word/2015/wordml/symex" xmlns:wpg="http://schemas.microsoft.com/office/word/2010/wordprocessingGroup" xmlns:wpi="http://schemas.microsoft.com/office/word/2010/wordprocessingInk" xmlns:wne="http://schemas.microsoft.com/office/word/2006/wordml" xmlns:wps="http://schemas.microsoft.com/office/word/2010/wordprocessingShape" mc:Ignorable="w14 w15 w16se w16cid w16 w16cex w16sdtdh w16sdtfl w16du wp14">
+<w:document xmlns:wpc="http://schemas.microsoft.com/office/word/2010/wordprocessingCanvas" xmlns:cx="http://schemas.microsoft.com/office/drawing/2014/chartex" xmlns:cx1="http://schemas.microsoft.com/office/drawing/2015/9/8/chartex" xmlns:cx2="http://schemas.microsoft.com/office/drawing/2015/10/21/chartex" xmlns:cx3="http://schemas.microsoft.com/office/drawing/2016/5/9/chartex" xmlns:cx4="http://schemas.microsoft.com/office/drawing/2016/5/10/chartex" xmlns:cx5="http://schemas.microsoft.com/office/drawing/2016/5/11/chartex" xmlns:cx6="http://schemas.microsoft.com/office/drawing/2016/5/12/chartex" xmlns:cx7="http://schemas.microsoft.com/office/drawing/2016/5/13/chartex" xmlns:cx8="http://schemas.microsoft.com/office/drawing/2016/5/14/chartex" xmlns:mc="http://schemas.openxmlformats.org/markup-compatibility/2006" xmlns:aink="http://schemas.microsoft.com/office/drawing/2016/ink" xmlns:am3d="http://schemas.microsoft.com/office/drawing/2017/model3d" xmlns:o="urn:schemas-microsoft-com:office:office" xmlns:r="http://schemas.openxmlformats.org/officeDocument/2006/relationships" xmlns:m="http://schemas.openxmlformats.org/officeDocument/2006/math" xmlns:v="urn:schemas-microsoft-com:vml" xmlns:wp14="http://schemas.microsoft.com/office/word/2010/wordprocessingDrawing" xmlns:wp="http://schemas.openxmlformats.org/drawingml/2006/wordprocessingDrawing" xmlns:w10="urn:schemas-microsoft-com:office:word" xmlns:w="http://schemas.openxmlformats.org/wordprocessingml/2006/main" xmlns:w14="http://schemas.microsoft.com/office/word/2010/wordml" xmlns:w15="http://schemas.microsoft.com/office/word/2012/wordml" xmlns:w16cex="http://schemas.microsoft.com/office/word/2018/wordml/cex" xmlns:w16cid="http://schemas.microsoft.com/office/word/2016/wordml/cid" xmlns:w16="http://schemas.microsoft.com/office/word/2018/wordml" xmlns:w16se="http://schemas.microsoft.com/office/word/2015/wordml/symex" xmlns:wpg="http://schemas.microsoft.com/office/word/2010/wordprocessingGroup" xmlns:wpi="http://schemas.microsoft.com/office/word/2010/wordprocessingInk" xmlns:wne="http://schemas.microsoft.com/office/word/2006/wordml" xmlns:wps="http://schemas.microsoft.com/office/word/2010/wordprocessingShape" mc:Ignorable="w14 w15 w16se w16cid w16 w16cex wp14">
   <w:body>
     <w:p>
+      <w:pPr>
+        <w:jc w:val="center"/>
+      </w:pPr>
       <w:r>
         <w:t>Normal Retina OCT Goruntulerinden Ogrenilen Konvolusyonel Autoencoder ile Patolojik Orneklerin Rekonstruksiyon Hatasi Tabanli Tespiti</w:t>
       </w:r>
     </w:p>
     <w:p>
+      <w:pPr>
+        <w:jc w:val="center"/>
+      </w:pPr>
       <w:r>
         <w:t>Reconstruction-Error-Based Detection of Pathological Retinal OCT Scans Using a Convolutional Autoencoder Trained on Normal Images</w:t>
       </w:r>
     </w:p>
     <w:p>
+      <w:pPr>
+        <w:jc w:val="center"/>
+      </w:pPr>
       <w:r>
         <w:t>Yazar 1 - Bilgisayar Muhendisligi - Universite - e-posta</w:t>
       </w:r>
     </w:p>
     <w:p>
+      <w:pPr>
+        <w:jc w:val="center"/>
+      </w:pPr>
       <w:r>
         <w:t>Yazar 2 - Bilgisayar Muhendisligi - Universite - e-posta</w:t>
       </w:r>
@@ -25,7 +37,7 @@
     <w:p/>
     <w:p>
       <w:pPr>
-        <w:pStyle w:val="Balk1"/>
+        <w:pStyle w:val="Heading1"/>
       </w:pPr>
       <w:r>
         <w:t>Baslik</w:t>
@@ -40,7 +52,7 @@
     <w:p/>
     <w:p>
       <w:pPr>
-        <w:pStyle w:val="Balk1"/>
+        <w:pStyle w:val="Heading1"/>
       </w:pPr>
       <w:r>
         <w:t>Ozet</w:t>
@@ -55,7 +67,7 @@
     <w:p/>
     <w:p>
       <w:pPr>
-        <w:pStyle w:val="Balk1"/>
+        <w:pStyle w:val="Heading1"/>
       </w:pPr>
       <w:r>
         <w:t>Abstract</w:t>
@@ -64,16 +76,13 @@
     <w:p/>
     <w:p>
       <w:r>
-        <w:t xml:space="preserve">This study investigates reconstruction-error-based anomaly detection for retinal OCT images using a convolutional autoencoder trained only on normal samples. Instead of learning a supervised pathology classifier, the model learns the appearance distribution of healthy retinal anatomy from the Kermany OCT2017 dataset. The training split uses only normal scans and a patient-level validation split is used to estimate operating thresholds from normal reconstruction-error percentiles. During testing, NORMAL, CNV, DME, and DRUSEN scans are scored according to reconstruction error, and anomaly decisions are produced with validation-derived thresholds. On the real OCT2017 experiment, the selected p95 operating point reaches AUROC 0.9108 and F1-score 0.8201. These findings indicate that a normal-only autoencoder can </w:t>
-      </w:r>
-      <w:r>
-        <w:t>serve as a meaningful early baseline for retinal anomaly screening.</w:t>
+        <w:t>This study investigates reconstruction-error-based anomaly detection for retinal OCT images using a convolutional autoencoder trained only on normal samples. Instead of learning a supervised pathology classifier, the model learns the appearance distribution of healthy retinal anatomy from the Kermany OCT2017 dataset. The training split uses only normal scans and a patient-level validation split is used to estimate operating thresholds from normal reconstruction-error percentiles. During testing, NORMAL, CNV, DME, and DRUSEN scans are scored according to reconstruction error, and anomaly decisions are produced with validation-derived thresholds. On the real OCT2017 experiment, the selected p95 operating point reaches AUROC 0.9108 and F1-score 0.8201. These findings indicate that a normal-only autoencoder can serve as a meaningful early baseline for retinal anomaly screening.</w:t>
       </w:r>
     </w:p>
     <w:p/>
     <w:p>
       <w:pPr>
-        <w:pStyle w:val="Balk1"/>
+        <w:pStyle w:val="Heading1"/>
       </w:pPr>
       <w:r>
         <w:t>Anahtar Kelimeler / Keywords</w:t>
@@ -88,7 +97,7 @@
     <w:p/>
     <w:p>
       <w:pPr>
-        <w:pStyle w:val="Balk1"/>
+        <w:pStyle w:val="Heading1"/>
       </w:pPr>
       <w:r>
         <w:t>1. Giris</w:t>
@@ -109,7 +118,7 @@
     <w:p/>
     <w:p>
       <w:pPr>
-        <w:pStyle w:val="Balk1"/>
+        <w:pStyle w:val="Heading1"/>
       </w:pPr>
       <w:r>
         <w:t>2. Ilgili Calismalar</w:t>
@@ -124,11 +133,7 @@
     <w:p/>
     <w:p>
       <w:r>
-        <w:t xml:space="preserve">Anomaly detection literaturunde ise normal veriyle egitim yapip anomalileri dagilim disi ornekler olarak ele alan reconstructive ve adversarial yontemler on plana cikmistir. AnoGAN [4] ve GANomaly [5] gibi yaklasimlar normal dagilimi modelleme mantigini sistematiklestirmistir. DRAEM [6] ve ProxyAno [8] ise reconstruction tabanli yapilarin daha ayirt edici hale gelmesine odaklanmistir. Retinal OCT ozelinde Seebock ve ark. [7], Luo ve ark. [9] ve Wang ve ark. [10] gibi calismalar bu alanin artik yalnizca genel anomaly </w:t>
-      </w:r>
-      <w:r>
-        <w:lastRenderedPageBreak/>
-        <w:t>detection degil, retina anatomisine ozel cozumler de gerektirdigini gostermektedir.</w:t>
+        <w:t>Anomaly detection literaturunde ise normal veriyle egitim yapip anomalileri dagilim disi ornekler olarak ele alan reconstructive ve adversarial yontemler on plana cikmistir. AnoGAN [4] ve GANomaly [5] gibi yaklasimlar normal dagilimi modelleme mantigini sistematiklestirmistir. DRAEM [6] ve ProxyAno [8] ise reconstruction tabanli yapilarin daha ayirt edici hale gelmesine odaklanmistir. Retinal OCT ozelinde Seebock ve ark. [7], Luo ve ark. [9] ve Wang ve ark. [10] gibi calismalar bu alanin artik yalnizca genel anomaly detection degil, retina anatomisine ozel cozumler de gerektirdigini gostermektedir.</w:t>
       </w:r>
     </w:p>
     <w:p/>
@@ -146,18 +151,18 @@
     <w:p/>
     <w:tbl>
       <w:tblPr>
-        <w:tblW w:w="0" w:type="auto"/>
-        <w:tblLook w:val="04A0" w:firstRow="1" w:lastRow="0" w:firstColumn="1" w:lastColumn="0" w:noHBand="0" w:noVBand="1"/>
+        <w:tblW w:type="auto" w:w="0"/>
+        <w:tblLook w:firstColumn="1" w:firstRow="1" w:lastColumn="0" w:lastRow="0" w:noHBand="0" w:noVBand="1" w:val="04A0"/>
       </w:tblPr>
       <w:tblGrid>
-        <w:gridCol w:w="1588"/>
-        <w:gridCol w:w="1800"/>
-        <w:gridCol w:w="1867"/>
+        <w:gridCol w:w="3479"/>
+        <w:gridCol w:w="3479"/>
+        <w:gridCol w:w="3479"/>
       </w:tblGrid>
       <w:tr>
         <w:tc>
           <w:tcPr>
-            <w:tcW w:w="3479" w:type="dxa"/>
+            <w:tcW w:type="dxa" w:w="3479"/>
           </w:tcPr>
           <w:p>
             <w:r>
@@ -167,7 +172,7 @@
         </w:tc>
         <w:tc>
           <w:tcPr>
-            <w:tcW w:w="3479" w:type="dxa"/>
+            <w:tcW w:type="dxa" w:w="3479"/>
           </w:tcPr>
           <w:p>
             <w:r>
@@ -177,7 +182,7 @@
         </w:tc>
         <w:tc>
           <w:tcPr>
-            <w:tcW w:w="3479" w:type="dxa"/>
+            <w:tcW w:type="dxa" w:w="3479"/>
           </w:tcPr>
           <w:p>
             <w:r>
@@ -189,7 +194,7 @@
       <w:tr>
         <w:tc>
           <w:tcPr>
-            <w:tcW w:w="3479" w:type="dxa"/>
+            <w:tcW w:type="dxa" w:w="3479"/>
           </w:tcPr>
           <w:p>
             <w:r>
@@ -199,7 +204,7 @@
         </w:tc>
         <w:tc>
           <w:tcPr>
-            <w:tcW w:w="3479" w:type="dxa"/>
+            <w:tcW w:type="dxa" w:w="3479"/>
           </w:tcPr>
           <w:p>
             <w:r>
@@ -209,7 +214,7 @@
         </w:tc>
         <w:tc>
           <w:tcPr>
-            <w:tcW w:w="3479" w:type="dxa"/>
+            <w:tcW w:type="dxa" w:w="3479"/>
           </w:tcPr>
           <w:p>
             <w:r>
@@ -221,7 +226,7 @@
       <w:tr>
         <w:tc>
           <w:tcPr>
-            <w:tcW w:w="3479" w:type="dxa"/>
+            <w:tcW w:type="dxa" w:w="3479"/>
           </w:tcPr>
           <w:p>
             <w:r>
@@ -231,7 +236,7 @@
         </w:tc>
         <w:tc>
           <w:tcPr>
-            <w:tcW w:w="3479" w:type="dxa"/>
+            <w:tcW w:type="dxa" w:w="3479"/>
           </w:tcPr>
           <w:p>
             <w:r>
@@ -241,7 +246,7 @@
         </w:tc>
         <w:tc>
           <w:tcPr>
-            <w:tcW w:w="3479" w:type="dxa"/>
+            <w:tcW w:type="dxa" w:w="3479"/>
           </w:tcPr>
           <w:p>
             <w:r>
@@ -253,7 +258,7 @@
       <w:tr>
         <w:tc>
           <w:tcPr>
-            <w:tcW w:w="3479" w:type="dxa"/>
+            <w:tcW w:type="dxa" w:w="3479"/>
           </w:tcPr>
           <w:p>
             <w:r>
@@ -263,7 +268,7 @@
         </w:tc>
         <w:tc>
           <w:tcPr>
-            <w:tcW w:w="3479" w:type="dxa"/>
+            <w:tcW w:type="dxa" w:w="3479"/>
           </w:tcPr>
           <w:p>
             <w:r>
@@ -273,7 +278,7 @@
         </w:tc>
         <w:tc>
           <w:tcPr>
-            <w:tcW w:w="3479" w:type="dxa"/>
+            <w:tcW w:type="dxa" w:w="3479"/>
           </w:tcPr>
           <w:p>
             <w:r>
@@ -285,7 +290,7 @@
       <w:tr>
         <w:tc>
           <w:tcPr>
-            <w:tcW w:w="3479" w:type="dxa"/>
+            <w:tcW w:type="dxa" w:w="3479"/>
           </w:tcPr>
           <w:p>
             <w:r>
@@ -295,7 +300,7 @@
         </w:tc>
         <w:tc>
           <w:tcPr>
-            <w:tcW w:w="3479" w:type="dxa"/>
+            <w:tcW w:type="dxa" w:w="3479"/>
           </w:tcPr>
           <w:p>
             <w:r>
@@ -305,7 +310,7 @@
         </w:tc>
         <w:tc>
           <w:tcPr>
-            <w:tcW w:w="3479" w:type="dxa"/>
+            <w:tcW w:type="dxa" w:w="3479"/>
           </w:tcPr>
           <w:p>
             <w:r>
@@ -317,7 +322,7 @@
       <w:tr>
         <w:tc>
           <w:tcPr>
-            <w:tcW w:w="3479" w:type="dxa"/>
+            <w:tcW w:type="dxa" w:w="3479"/>
           </w:tcPr>
           <w:p>
             <w:r>
@@ -327,7 +332,7 @@
         </w:tc>
         <w:tc>
           <w:tcPr>
-            <w:tcW w:w="3479" w:type="dxa"/>
+            <w:tcW w:type="dxa" w:w="3479"/>
           </w:tcPr>
           <w:p>
             <w:r>
@@ -337,7 +342,7 @@
         </w:tc>
         <w:tc>
           <w:tcPr>
-            <w:tcW w:w="3479" w:type="dxa"/>
+            <w:tcW w:type="dxa" w:w="3479"/>
           </w:tcPr>
           <w:p>
             <w:r>
@@ -350,7 +355,7 @@
     <w:p/>
     <w:p>
       <w:pPr>
-        <w:pStyle w:val="Balk1"/>
+        <w:pStyle w:val="Heading1"/>
       </w:pPr>
       <w:r>
         <w:t>3. Yontem</w:t>
@@ -359,7 +364,7 @@
     <w:p/>
     <w:p>
       <w:pPr>
-        <w:pStyle w:val="Balk2"/>
+        <w:pStyle w:val="Heading2"/>
       </w:pPr>
       <w:r>
         <w:t>3.1 Veri kumesi ve bolme stratejisi</w:t>
@@ -374,7 +379,7 @@
     <w:p/>
     <w:p>
       <w:pPr>
-        <w:pStyle w:val="Balk2"/>
+        <w:pStyle w:val="Heading2"/>
       </w:pPr>
       <w:r>
         <w:t>3.2 On isleme</w:t>
@@ -383,16 +388,13 @@
     <w:p/>
     <w:p>
       <w:r>
-        <w:t xml:space="preserve">Tum goruntuler tek kanalli gri tonlamaya donusturulmus, `128x128` boyutuna yeniden orneklenmis ve `[0, 1]` araligina normalize edilmistir. Bu ara surumde agresif augmentation </w:t>
-      </w:r>
-      <w:r>
-        <w:t>uygulanmamistir; amacimiz once sade ve tekrarlanabilir bir baseline kurmaktir.</w:t>
+        <w:t>Tum goruntuler tek kanalli gri tonlamaya donusturulmus, `128x128` boyutuna yeniden orneklenmis ve `[0, 1]` araligina normalize edilmistir. Bu ara surumde agresif augmentation uygulanmamistir; amacimiz once sade ve tekrarlanabilir bir baseline kurmaktir.</w:t>
       </w:r>
     </w:p>
     <w:p/>
     <w:p>
       <w:pPr>
-        <w:pStyle w:val="Balk2"/>
+        <w:pStyle w:val="Heading2"/>
       </w:pPr>
       <w:r>
         <w:t>3.3 Model mimarisi</w:t>
@@ -407,7 +409,7 @@
     <w:p/>
     <w:p>
       <w:pPr>
-        <w:pStyle w:val="Balk2"/>
+        <w:pStyle w:val="Heading2"/>
       </w:pPr>
       <w:r>
         <w:t>3.4 Egitim ve esikleme</w:t>
@@ -422,7 +424,7 @@
     <w:p/>
     <w:p>
       <w:pPr>
-        <w:pStyle w:val="Balk2"/>
+        <w:pStyle w:val="Heading2"/>
       </w:pPr>
       <w:r>
         <w:t>3.5 Degerlendirme olcutleri ve deney kurulumu</w:t>
@@ -443,17 +445,17 @@
     <w:p/>
     <w:tbl>
       <w:tblPr>
-        <w:tblW w:w="0" w:type="auto"/>
-        <w:tblLook w:val="04A0" w:firstRow="1" w:lastRow="0" w:firstColumn="1" w:lastColumn="0" w:noHBand="0" w:noVBand="1"/>
+        <w:tblW w:type="auto" w:w="0"/>
+        <w:tblLook w:firstColumn="1" w:firstRow="1" w:lastColumn="0" w:lastRow="0" w:noHBand="0" w:noVBand="1" w:val="04A0"/>
       </w:tblPr>
       <w:tblGrid>
-        <w:gridCol w:w="2621"/>
-        <w:gridCol w:w="2634"/>
+        <w:gridCol w:w="5219"/>
+        <w:gridCol w:w="5219"/>
       </w:tblGrid>
       <w:tr>
         <w:tc>
           <w:tcPr>
-            <w:tcW w:w="5219" w:type="dxa"/>
+            <w:tcW w:type="dxa" w:w="5219"/>
           </w:tcPr>
           <w:p>
             <w:r>
@@ -463,7 +465,7 @@
         </w:tc>
         <w:tc>
           <w:tcPr>
-            <w:tcW w:w="5219" w:type="dxa"/>
+            <w:tcW w:type="dxa" w:w="5219"/>
           </w:tcPr>
           <w:p>
             <w:r>
@@ -475,7 +477,7 @@
       <w:tr>
         <w:tc>
           <w:tcPr>
-            <w:tcW w:w="5219" w:type="dxa"/>
+            <w:tcW w:type="dxa" w:w="5219"/>
           </w:tcPr>
           <w:p>
             <w:r>
@@ -485,7 +487,7 @@
         </w:tc>
         <w:tc>
           <w:tcPr>
-            <w:tcW w:w="5219" w:type="dxa"/>
+            <w:tcW w:type="dxa" w:w="5219"/>
           </w:tcPr>
           <w:p>
             <w:r>
@@ -497,7 +499,7 @@
       <w:tr>
         <w:tc>
           <w:tcPr>
-            <w:tcW w:w="5219" w:type="dxa"/>
+            <w:tcW w:type="dxa" w:w="5219"/>
           </w:tcPr>
           <w:p>
             <w:r>
@@ -507,7 +509,7 @@
         </w:tc>
         <w:tc>
           <w:tcPr>
-            <w:tcW w:w="5219" w:type="dxa"/>
+            <w:tcW w:type="dxa" w:w="5219"/>
           </w:tcPr>
           <w:p>
             <w:r>
@@ -519,7 +521,7 @@
       <w:tr>
         <w:tc>
           <w:tcPr>
-            <w:tcW w:w="5219" w:type="dxa"/>
+            <w:tcW w:type="dxa" w:w="5219"/>
           </w:tcPr>
           <w:p>
             <w:r>
@@ -529,7 +531,7 @@
         </w:tc>
         <w:tc>
           <w:tcPr>
-            <w:tcW w:w="5219" w:type="dxa"/>
+            <w:tcW w:type="dxa" w:w="5219"/>
           </w:tcPr>
           <w:p>
             <w:r>
@@ -541,7 +543,7 @@
       <w:tr>
         <w:tc>
           <w:tcPr>
-            <w:tcW w:w="5219" w:type="dxa"/>
+            <w:tcW w:type="dxa" w:w="5219"/>
           </w:tcPr>
           <w:p>
             <w:r>
@@ -551,7 +553,7 @@
         </w:tc>
         <w:tc>
           <w:tcPr>
-            <w:tcW w:w="5219" w:type="dxa"/>
+            <w:tcW w:type="dxa" w:w="5219"/>
           </w:tcPr>
           <w:p>
             <w:r>
@@ -563,7 +565,7 @@
       <w:tr>
         <w:tc>
           <w:tcPr>
-            <w:tcW w:w="5219" w:type="dxa"/>
+            <w:tcW w:type="dxa" w:w="5219"/>
           </w:tcPr>
           <w:p>
             <w:r>
@@ -573,7 +575,7 @@
         </w:tc>
         <w:tc>
           <w:tcPr>
-            <w:tcW w:w="5219" w:type="dxa"/>
+            <w:tcW w:type="dxa" w:w="5219"/>
           </w:tcPr>
           <w:p>
             <w:r>
@@ -585,7 +587,7 @@
       <w:tr>
         <w:tc>
           <w:tcPr>
-            <w:tcW w:w="5219" w:type="dxa"/>
+            <w:tcW w:type="dxa" w:w="5219"/>
           </w:tcPr>
           <w:p>
             <w:r>
@@ -595,7 +597,7 @@
         </w:tc>
         <w:tc>
           <w:tcPr>
-            <w:tcW w:w="5219" w:type="dxa"/>
+            <w:tcW w:type="dxa" w:w="5219"/>
           </w:tcPr>
           <w:p>
             <w:r>
@@ -607,7 +609,7 @@
       <w:tr>
         <w:tc>
           <w:tcPr>
-            <w:tcW w:w="5219" w:type="dxa"/>
+            <w:tcW w:type="dxa" w:w="5219"/>
           </w:tcPr>
           <w:p>
             <w:r>
@@ -617,7 +619,7 @@
         </w:tc>
         <w:tc>
           <w:tcPr>
-            <w:tcW w:w="5219" w:type="dxa"/>
+            <w:tcW w:type="dxa" w:w="5219"/>
           </w:tcPr>
           <w:p>
             <w:r>
@@ -629,7 +631,7 @@
       <w:tr>
         <w:tc>
           <w:tcPr>
-            <w:tcW w:w="5219" w:type="dxa"/>
+            <w:tcW w:type="dxa" w:w="5219"/>
           </w:tcPr>
           <w:p>
             <w:r>
@@ -639,7 +641,7 @@
         </w:tc>
         <w:tc>
           <w:tcPr>
-            <w:tcW w:w="5219" w:type="dxa"/>
+            <w:tcW w:type="dxa" w:w="5219"/>
           </w:tcPr>
           <w:p>
             <w:r>
@@ -651,7 +653,7 @@
       <w:tr>
         <w:tc>
           <w:tcPr>
-            <w:tcW w:w="5219" w:type="dxa"/>
+            <w:tcW w:type="dxa" w:w="5219"/>
           </w:tcPr>
           <w:p>
             <w:r>
@@ -661,7 +663,7 @@
         </w:tc>
         <w:tc>
           <w:tcPr>
-            <w:tcW w:w="5219" w:type="dxa"/>
+            <w:tcW w:type="dxa" w:w="5219"/>
           </w:tcPr>
           <w:p>
             <w:r>
@@ -674,7 +676,7 @@
     <w:p/>
     <w:p>
       <w:pPr>
-        <w:pStyle w:val="Balk2"/>
+        <w:pStyle w:val="Heading2"/>
       </w:pPr>
       <w:r>
         <w:t>3.6 Sistem akisi</w:t>
@@ -683,17 +685,13 @@
     <w:p/>
     <w:p>
       <w:r>
-        <w:t xml:space="preserve">Onerilen is akisi bes adimdan olusmaktadir: normal verinin secilmesi, on isleme, autoencoder egitimi, validation error dagilimindan esik secimi ve testte anomaly scoring. Raporun sonundaki Sekil 1 bu boru hattini gorsel olarak ozetlemektedir. </w:t>
-      </w:r>
-      <w:r>
-        <w:lastRenderedPageBreak/>
-        <w:t>Bu sema, odevde istenen sistem mimarisi beklentisini karsilamak icin eklenmistir.</w:t>
+        <w:t>Onerilen is akisi bes adimdan olusmaktadir: normal verinin secilmesi, on isleme, autoencoder egitimi, validation error dagilimindan esik secimi ve testte anomaly scoring. Raporun sonundaki Sekil 1 bu boru hattini gorsel olarak ozetlemektedir. Bu sema, odevde istenen sistem mimarisi beklentisini karsilamak icin eklenmistir.</w:t>
       </w:r>
     </w:p>
     <w:p/>
     <w:p>
       <w:pPr>
-        <w:pStyle w:val="Balk1"/>
+        <w:pStyle w:val="Heading1"/>
       </w:pPr>
       <w:r>
         <w:t>4. Ara Sonuclar</w:t>
@@ -708,17 +706,17 @@
     <w:p/>
     <w:tbl>
       <w:tblPr>
-        <w:tblW w:w="0" w:type="auto"/>
-        <w:tblLook w:val="04A0" w:firstRow="1" w:lastRow="0" w:firstColumn="1" w:lastColumn="0" w:noHBand="0" w:noVBand="1"/>
+        <w:tblW w:type="auto" w:w="0"/>
+        <w:tblLook w:firstColumn="1" w:firstRow="1" w:lastColumn="0" w:lastRow="0" w:noHBand="0" w:noVBand="1" w:val="04A0"/>
       </w:tblPr>
       <w:tblGrid>
-        <w:gridCol w:w="2643"/>
-        <w:gridCol w:w="2612"/>
+        <w:gridCol w:w="5219"/>
+        <w:gridCol w:w="5219"/>
       </w:tblGrid>
       <w:tr>
         <w:tc>
           <w:tcPr>
-            <w:tcW w:w="5219" w:type="dxa"/>
+            <w:tcW w:type="dxa" w:w="5219"/>
           </w:tcPr>
           <w:p>
             <w:r>
@@ -728,7 +726,7 @@
         </w:tc>
         <w:tc>
           <w:tcPr>
-            <w:tcW w:w="5219" w:type="dxa"/>
+            <w:tcW w:type="dxa" w:w="5219"/>
           </w:tcPr>
           <w:p>
             <w:r>
@@ -740,7 +738,7 @@
       <w:tr>
         <w:tc>
           <w:tcPr>
-            <w:tcW w:w="5219" w:type="dxa"/>
+            <w:tcW w:type="dxa" w:w="5219"/>
           </w:tcPr>
           <w:p>
             <w:r>
@@ -750,7 +748,7 @@
         </w:tc>
         <w:tc>
           <w:tcPr>
-            <w:tcW w:w="5219" w:type="dxa"/>
+            <w:tcW w:type="dxa" w:w="5219"/>
           </w:tcPr>
           <w:p>
             <w:r>
@@ -762,7 +760,7 @@
       <w:tr>
         <w:tc>
           <w:tcPr>
-            <w:tcW w:w="5219" w:type="dxa"/>
+            <w:tcW w:type="dxa" w:w="5219"/>
           </w:tcPr>
           <w:p>
             <w:r>
@@ -772,7 +770,7 @@
         </w:tc>
         <w:tc>
           <w:tcPr>
-            <w:tcW w:w="5219" w:type="dxa"/>
+            <w:tcW w:type="dxa" w:w="5219"/>
           </w:tcPr>
           <w:p>
             <w:r>
@@ -784,7 +782,7 @@
       <w:tr>
         <w:tc>
           <w:tcPr>
-            <w:tcW w:w="5219" w:type="dxa"/>
+            <w:tcW w:type="dxa" w:w="5219"/>
           </w:tcPr>
           <w:p>
             <w:r>
@@ -794,7 +792,7 @@
         </w:tc>
         <w:tc>
           <w:tcPr>
-            <w:tcW w:w="5219" w:type="dxa"/>
+            <w:tcW w:type="dxa" w:w="5219"/>
           </w:tcPr>
           <w:p>
             <w:r>
@@ -806,7 +804,7 @@
       <w:tr>
         <w:tc>
           <w:tcPr>
-            <w:tcW w:w="5219" w:type="dxa"/>
+            <w:tcW w:type="dxa" w:w="5219"/>
           </w:tcPr>
           <w:p>
             <w:r>
@@ -816,7 +814,7 @@
         </w:tc>
         <w:tc>
           <w:tcPr>
-            <w:tcW w:w="5219" w:type="dxa"/>
+            <w:tcW w:type="dxa" w:w="5219"/>
           </w:tcPr>
           <w:p>
             <w:r>
@@ -828,7 +826,7 @@
       <w:tr>
         <w:tc>
           <w:tcPr>
-            <w:tcW w:w="5219" w:type="dxa"/>
+            <w:tcW w:type="dxa" w:w="5219"/>
           </w:tcPr>
           <w:p>
             <w:r>
@@ -838,7 +836,7 @@
         </w:tc>
         <w:tc>
           <w:tcPr>
-            <w:tcW w:w="5219" w:type="dxa"/>
+            <w:tcW w:type="dxa" w:w="5219"/>
           </w:tcPr>
           <w:p>
             <w:r>
@@ -850,7 +848,7 @@
       <w:tr>
         <w:tc>
           <w:tcPr>
-            <w:tcW w:w="5219" w:type="dxa"/>
+            <w:tcW w:type="dxa" w:w="5219"/>
           </w:tcPr>
           <w:p>
             <w:r>
@@ -860,7 +858,7 @@
         </w:tc>
         <w:tc>
           <w:tcPr>
-            <w:tcW w:w="5219" w:type="dxa"/>
+            <w:tcW w:type="dxa" w:w="5219"/>
           </w:tcPr>
           <w:p>
             <w:r>
@@ -872,7 +870,7 @@
       <w:tr>
         <w:tc>
           <w:tcPr>
-            <w:tcW w:w="5219" w:type="dxa"/>
+            <w:tcW w:type="dxa" w:w="5219"/>
           </w:tcPr>
           <w:p>
             <w:r>
@@ -882,7 +880,7 @@
         </w:tc>
         <w:tc>
           <w:tcPr>
-            <w:tcW w:w="5219" w:type="dxa"/>
+            <w:tcW w:type="dxa" w:w="5219"/>
           </w:tcPr>
           <w:p>
             <w:r>
@@ -894,7 +892,7 @@
       <w:tr>
         <w:tc>
           <w:tcPr>
-            <w:tcW w:w="5219" w:type="dxa"/>
+            <w:tcW w:type="dxa" w:w="5219"/>
           </w:tcPr>
           <w:p>
             <w:r>
@@ -904,7 +902,7 @@
         </w:tc>
         <w:tc>
           <w:tcPr>
-            <w:tcW w:w="5219" w:type="dxa"/>
+            <w:tcW w:type="dxa" w:w="5219"/>
           </w:tcPr>
           <w:p>
             <w:r>
@@ -923,23 +921,23 @@
     <w:p/>
     <w:tbl>
       <w:tblPr>
-        <w:tblW w:w="0" w:type="auto"/>
-        <w:tblLook w:val="04A0" w:firstRow="1" w:lastRow="0" w:firstColumn="1" w:lastColumn="0" w:noHBand="0" w:noVBand="1"/>
+        <w:tblW w:type="auto" w:w="0"/>
+        <w:tblLook w:firstColumn="1" w:firstRow="1" w:lastColumn="0" w:lastRow="0" w:noHBand="0" w:noVBand="1" w:val="04A0"/>
       </w:tblPr>
       <w:tblGrid>
-        <w:gridCol w:w="764"/>
-        <w:gridCol w:w="733"/>
-        <w:gridCol w:w="710"/>
-        <w:gridCol w:w="726"/>
-        <w:gridCol w:w="598"/>
-        <w:gridCol w:w="598"/>
-        <w:gridCol w:w="528"/>
-        <w:gridCol w:w="598"/>
+        <w:gridCol w:w="1305"/>
+        <w:gridCol w:w="1305"/>
+        <w:gridCol w:w="1305"/>
+        <w:gridCol w:w="1305"/>
+        <w:gridCol w:w="1305"/>
+        <w:gridCol w:w="1305"/>
+        <w:gridCol w:w="1305"/>
+        <w:gridCol w:w="1305"/>
       </w:tblGrid>
       <w:tr>
         <w:tc>
           <w:tcPr>
-            <w:tcW w:w="1305" w:type="dxa"/>
+            <w:tcW w:type="dxa" w:w="1305"/>
           </w:tcPr>
           <w:p>
             <w:r>
@@ -949,7 +947,7 @@
         </w:tc>
         <w:tc>
           <w:tcPr>
-            <w:tcW w:w="1305" w:type="dxa"/>
+            <w:tcW w:type="dxa" w:w="1305"/>
           </w:tcPr>
           <w:p>
             <w:r>
@@ -959,7 +957,7 @@
         </w:tc>
         <w:tc>
           <w:tcPr>
-            <w:tcW w:w="1305" w:type="dxa"/>
+            <w:tcW w:type="dxa" w:w="1305"/>
           </w:tcPr>
           <w:p>
             <w:r>
@@ -969,7 +967,7 @@
         </w:tc>
         <w:tc>
           <w:tcPr>
-            <w:tcW w:w="1305" w:type="dxa"/>
+            <w:tcW w:type="dxa" w:w="1305"/>
           </w:tcPr>
           <w:p>
             <w:r>
@@ -979,7 +977,7 @@
         </w:tc>
         <w:tc>
           <w:tcPr>
-            <w:tcW w:w="1305" w:type="dxa"/>
+            <w:tcW w:type="dxa" w:w="1305"/>
           </w:tcPr>
           <w:p>
             <w:r>
@@ -989,7 +987,7 @@
         </w:tc>
         <w:tc>
           <w:tcPr>
-            <w:tcW w:w="1305" w:type="dxa"/>
+            <w:tcW w:type="dxa" w:w="1305"/>
           </w:tcPr>
           <w:p>
             <w:r>
@@ -999,7 +997,7 @@
         </w:tc>
         <w:tc>
           <w:tcPr>
-            <w:tcW w:w="1305" w:type="dxa"/>
+            <w:tcW w:type="dxa" w:w="1305"/>
           </w:tcPr>
           <w:p>
             <w:r>
@@ -1009,7 +1007,7 @@
         </w:tc>
         <w:tc>
           <w:tcPr>
-            <w:tcW w:w="1305" w:type="dxa"/>
+            <w:tcW w:type="dxa" w:w="1305"/>
           </w:tcPr>
           <w:p>
             <w:r>
@@ -1021,7 +1019,7 @@
       <w:tr>
         <w:tc>
           <w:tcPr>
-            <w:tcW w:w="1305" w:type="dxa"/>
+            <w:tcW w:type="dxa" w:w="1305"/>
           </w:tcPr>
           <w:p>
             <w:r>
@@ -1031,7 +1029,7 @@
         </w:tc>
         <w:tc>
           <w:tcPr>
-            <w:tcW w:w="1305" w:type="dxa"/>
+            <w:tcW w:type="dxa" w:w="1305"/>
           </w:tcPr>
           <w:p>
             <w:r>
@@ -1041,7 +1039,7 @@
         </w:tc>
         <w:tc>
           <w:tcPr>
-            <w:tcW w:w="1305" w:type="dxa"/>
+            <w:tcW w:type="dxa" w:w="1305"/>
           </w:tcPr>
           <w:p>
             <w:r>
@@ -1051,7 +1049,7 @@
         </w:tc>
         <w:tc>
           <w:tcPr>
-            <w:tcW w:w="1305" w:type="dxa"/>
+            <w:tcW w:type="dxa" w:w="1305"/>
           </w:tcPr>
           <w:p>
             <w:r>
@@ -1061,7 +1059,7 @@
         </w:tc>
         <w:tc>
           <w:tcPr>
-            <w:tcW w:w="1305" w:type="dxa"/>
+            <w:tcW w:type="dxa" w:w="1305"/>
           </w:tcPr>
           <w:p>
             <w:r>
@@ -1071,7 +1069,7 @@
         </w:tc>
         <w:tc>
           <w:tcPr>
-            <w:tcW w:w="1305" w:type="dxa"/>
+            <w:tcW w:type="dxa" w:w="1305"/>
           </w:tcPr>
           <w:p>
             <w:r>
@@ -1081,7 +1079,7 @@
         </w:tc>
         <w:tc>
           <w:tcPr>
-            <w:tcW w:w="1305" w:type="dxa"/>
+            <w:tcW w:type="dxa" w:w="1305"/>
           </w:tcPr>
           <w:p>
             <w:r>
@@ -1091,7 +1089,7 @@
         </w:tc>
         <w:tc>
           <w:tcPr>
-            <w:tcW w:w="1305" w:type="dxa"/>
+            <w:tcW w:type="dxa" w:w="1305"/>
           </w:tcPr>
           <w:p>
             <w:r>
@@ -1103,7 +1101,7 @@
       <w:tr>
         <w:tc>
           <w:tcPr>
-            <w:tcW w:w="1305" w:type="dxa"/>
+            <w:tcW w:type="dxa" w:w="1305"/>
           </w:tcPr>
           <w:p>
             <w:r>
@@ -1113,7 +1111,7 @@
         </w:tc>
         <w:tc>
           <w:tcPr>
-            <w:tcW w:w="1305" w:type="dxa"/>
+            <w:tcW w:type="dxa" w:w="1305"/>
           </w:tcPr>
           <w:p>
             <w:r>
@@ -1123,7 +1121,7 @@
         </w:tc>
         <w:tc>
           <w:tcPr>
-            <w:tcW w:w="1305" w:type="dxa"/>
+            <w:tcW w:type="dxa" w:w="1305"/>
           </w:tcPr>
           <w:p>
             <w:r>
@@ -1133,7 +1131,7 @@
         </w:tc>
         <w:tc>
           <w:tcPr>
-            <w:tcW w:w="1305" w:type="dxa"/>
+            <w:tcW w:type="dxa" w:w="1305"/>
           </w:tcPr>
           <w:p>
             <w:r>
@@ -1143,7 +1141,7 @@
         </w:tc>
         <w:tc>
           <w:tcPr>
-            <w:tcW w:w="1305" w:type="dxa"/>
+            <w:tcW w:type="dxa" w:w="1305"/>
           </w:tcPr>
           <w:p>
             <w:r>
@@ -1153,7 +1151,7 @@
         </w:tc>
         <w:tc>
           <w:tcPr>
-            <w:tcW w:w="1305" w:type="dxa"/>
+            <w:tcW w:type="dxa" w:w="1305"/>
           </w:tcPr>
           <w:p>
             <w:r>
@@ -1163,7 +1161,7 @@
         </w:tc>
         <w:tc>
           <w:tcPr>
-            <w:tcW w:w="1305" w:type="dxa"/>
+            <w:tcW w:type="dxa" w:w="1305"/>
           </w:tcPr>
           <w:p>
             <w:r>
@@ -1173,7 +1171,7 @@
         </w:tc>
         <w:tc>
           <w:tcPr>
-            <w:tcW w:w="1305" w:type="dxa"/>
+            <w:tcW w:type="dxa" w:w="1305"/>
           </w:tcPr>
           <w:p>
             <w:r>
@@ -1185,7 +1183,7 @@
       <w:tr>
         <w:tc>
           <w:tcPr>
-            <w:tcW w:w="1305" w:type="dxa"/>
+            <w:tcW w:type="dxa" w:w="1305"/>
           </w:tcPr>
           <w:p>
             <w:r>
@@ -1195,7 +1193,7 @@
         </w:tc>
         <w:tc>
           <w:tcPr>
-            <w:tcW w:w="1305" w:type="dxa"/>
+            <w:tcW w:type="dxa" w:w="1305"/>
           </w:tcPr>
           <w:p>
             <w:r>
@@ -1205,7 +1203,7 @@
         </w:tc>
         <w:tc>
           <w:tcPr>
-            <w:tcW w:w="1305" w:type="dxa"/>
+            <w:tcW w:type="dxa" w:w="1305"/>
           </w:tcPr>
           <w:p>
             <w:r>
@@ -1215,7 +1213,7 @@
         </w:tc>
         <w:tc>
           <w:tcPr>
-            <w:tcW w:w="1305" w:type="dxa"/>
+            <w:tcW w:type="dxa" w:w="1305"/>
           </w:tcPr>
           <w:p>
             <w:r>
@@ -1225,7 +1223,7 @@
         </w:tc>
         <w:tc>
           <w:tcPr>
-            <w:tcW w:w="1305" w:type="dxa"/>
+            <w:tcW w:type="dxa" w:w="1305"/>
           </w:tcPr>
           <w:p>
             <w:r>
@@ -1235,7 +1233,7 @@
         </w:tc>
         <w:tc>
           <w:tcPr>
-            <w:tcW w:w="1305" w:type="dxa"/>
+            <w:tcW w:type="dxa" w:w="1305"/>
           </w:tcPr>
           <w:p>
             <w:r>
@@ -1245,7 +1243,7 @@
         </w:tc>
         <w:tc>
           <w:tcPr>
-            <w:tcW w:w="1305" w:type="dxa"/>
+            <w:tcW w:type="dxa" w:w="1305"/>
           </w:tcPr>
           <w:p>
             <w:r>
@@ -1255,7 +1253,7 @@
         </w:tc>
         <w:tc>
           <w:tcPr>
-            <w:tcW w:w="1305" w:type="dxa"/>
+            <w:tcW w:type="dxa" w:w="1305"/>
           </w:tcPr>
           <w:p>
             <w:r>
@@ -1274,20 +1272,20 @@
     <w:p/>
     <w:tbl>
       <w:tblPr>
-        <w:tblW w:w="0" w:type="auto"/>
-        <w:tblLook w:val="04A0" w:firstRow="1" w:lastRow="0" w:firstColumn="1" w:lastColumn="0" w:noHBand="0" w:noVBand="1"/>
+        <w:tblW w:type="auto" w:w="0"/>
+        <w:tblLook w:firstColumn="1" w:firstRow="1" w:lastColumn="0" w:lastRow="0" w:noHBand="0" w:noVBand="1" w:val="04A0"/>
       </w:tblPr>
       <w:tblGrid>
-        <w:gridCol w:w="747"/>
-        <w:gridCol w:w="855"/>
-        <w:gridCol w:w="843"/>
-        <w:gridCol w:w="1462"/>
-        <w:gridCol w:w="1348"/>
+        <w:gridCol w:w="2088"/>
+        <w:gridCol w:w="2088"/>
+        <w:gridCol w:w="2088"/>
+        <w:gridCol w:w="2088"/>
+        <w:gridCol w:w="2088"/>
       </w:tblGrid>
       <w:tr>
         <w:tc>
           <w:tcPr>
-            <w:tcW w:w="2088" w:type="dxa"/>
+            <w:tcW w:type="dxa" w:w="2088"/>
           </w:tcPr>
           <w:p>
             <w:r>
@@ -1297,7 +1295,7 @@
         </w:tc>
         <w:tc>
           <w:tcPr>
-            <w:tcW w:w="2088" w:type="dxa"/>
+            <w:tcW w:type="dxa" w:w="2088"/>
           </w:tcPr>
           <w:p>
             <w:r>
@@ -1307,7 +1305,7 @@
         </w:tc>
         <w:tc>
           <w:tcPr>
-            <w:tcW w:w="2088" w:type="dxa"/>
+            <w:tcW w:type="dxa" w:w="2088"/>
           </w:tcPr>
           <w:p>
             <w:r>
@@ -1317,7 +1315,7 @@
         </w:tc>
         <w:tc>
           <w:tcPr>
-            <w:tcW w:w="2088" w:type="dxa"/>
+            <w:tcW w:type="dxa" w:w="2088"/>
           </w:tcPr>
           <w:p>
             <w:r>
@@ -1327,7 +1325,7 @@
         </w:tc>
         <w:tc>
           <w:tcPr>
-            <w:tcW w:w="2088" w:type="dxa"/>
+            <w:tcW w:type="dxa" w:w="2088"/>
           </w:tcPr>
           <w:p>
             <w:r>
@@ -1339,7 +1337,7 @@
       <w:tr>
         <w:tc>
           <w:tcPr>
-            <w:tcW w:w="2088" w:type="dxa"/>
+            <w:tcW w:type="dxa" w:w="2088"/>
           </w:tcPr>
           <w:p>
             <w:r>
@@ -1349,7 +1347,7 @@
         </w:tc>
         <w:tc>
           <w:tcPr>
-            <w:tcW w:w="2088" w:type="dxa"/>
+            <w:tcW w:type="dxa" w:w="2088"/>
           </w:tcPr>
           <w:p>
             <w:r>
@@ -1359,7 +1357,7 @@
         </w:tc>
         <w:tc>
           <w:tcPr>
-            <w:tcW w:w="2088" w:type="dxa"/>
+            <w:tcW w:type="dxa" w:w="2088"/>
           </w:tcPr>
           <w:p>
             <w:r>
@@ -1369,7 +1367,7 @@
         </w:tc>
         <w:tc>
           <w:tcPr>
-            <w:tcW w:w="2088" w:type="dxa"/>
+            <w:tcW w:type="dxa" w:w="2088"/>
           </w:tcPr>
           <w:p>
             <w:r>
@@ -1379,7 +1377,7 @@
         </w:tc>
         <w:tc>
           <w:tcPr>
-            <w:tcW w:w="2088" w:type="dxa"/>
+            <w:tcW w:type="dxa" w:w="2088"/>
           </w:tcPr>
           <w:p>
             <w:r>
@@ -1391,7 +1389,7 @@
       <w:tr>
         <w:tc>
           <w:tcPr>
-            <w:tcW w:w="2088" w:type="dxa"/>
+            <w:tcW w:type="dxa" w:w="2088"/>
           </w:tcPr>
           <w:p>
             <w:r>
@@ -1401,7 +1399,7 @@
         </w:tc>
         <w:tc>
           <w:tcPr>
-            <w:tcW w:w="2088" w:type="dxa"/>
+            <w:tcW w:type="dxa" w:w="2088"/>
           </w:tcPr>
           <w:p>
             <w:r>
@@ -1411,7 +1409,7 @@
         </w:tc>
         <w:tc>
           <w:tcPr>
-            <w:tcW w:w="2088" w:type="dxa"/>
+            <w:tcW w:type="dxa" w:w="2088"/>
           </w:tcPr>
           <w:p>
             <w:r>
@@ -1421,7 +1419,7 @@
         </w:tc>
         <w:tc>
           <w:tcPr>
-            <w:tcW w:w="2088" w:type="dxa"/>
+            <w:tcW w:type="dxa" w:w="2088"/>
           </w:tcPr>
           <w:p>
             <w:r>
@@ -1431,7 +1429,7 @@
         </w:tc>
         <w:tc>
           <w:tcPr>
-            <w:tcW w:w="2088" w:type="dxa"/>
+            <w:tcW w:type="dxa" w:w="2088"/>
           </w:tcPr>
           <w:p>
             <w:r>
@@ -1443,7 +1441,7 @@
       <w:tr>
         <w:tc>
           <w:tcPr>
-            <w:tcW w:w="2088" w:type="dxa"/>
+            <w:tcW w:type="dxa" w:w="2088"/>
           </w:tcPr>
           <w:p>
             <w:r>
@@ -1453,7 +1451,7 @@
         </w:tc>
         <w:tc>
           <w:tcPr>
-            <w:tcW w:w="2088" w:type="dxa"/>
+            <w:tcW w:type="dxa" w:w="2088"/>
           </w:tcPr>
           <w:p>
             <w:r>
@@ -1463,7 +1461,7 @@
         </w:tc>
         <w:tc>
           <w:tcPr>
-            <w:tcW w:w="2088" w:type="dxa"/>
+            <w:tcW w:type="dxa" w:w="2088"/>
           </w:tcPr>
           <w:p>
             <w:r>
@@ -1473,7 +1471,7 @@
         </w:tc>
         <w:tc>
           <w:tcPr>
-            <w:tcW w:w="2088" w:type="dxa"/>
+            <w:tcW w:type="dxa" w:w="2088"/>
           </w:tcPr>
           <w:p>
             <w:r>
@@ -1483,7 +1481,7 @@
         </w:tc>
         <w:tc>
           <w:tcPr>
-            <w:tcW w:w="2088" w:type="dxa"/>
+            <w:tcW w:type="dxa" w:w="2088"/>
           </w:tcPr>
           <w:p>
             <w:r>
@@ -1495,7 +1493,7 @@
       <w:tr>
         <w:tc>
           <w:tcPr>
-            <w:tcW w:w="2088" w:type="dxa"/>
+            <w:tcW w:type="dxa" w:w="2088"/>
           </w:tcPr>
           <w:p>
             <w:r>
@@ -1505,7 +1503,7 @@
         </w:tc>
         <w:tc>
           <w:tcPr>
-            <w:tcW w:w="2088" w:type="dxa"/>
+            <w:tcW w:type="dxa" w:w="2088"/>
           </w:tcPr>
           <w:p>
             <w:r>
@@ -1515,7 +1513,7 @@
         </w:tc>
         <w:tc>
           <w:tcPr>
-            <w:tcW w:w="2088" w:type="dxa"/>
+            <w:tcW w:type="dxa" w:w="2088"/>
           </w:tcPr>
           <w:p>
             <w:r>
@@ -1525,7 +1523,7 @@
         </w:tc>
         <w:tc>
           <w:tcPr>
-            <w:tcW w:w="2088" w:type="dxa"/>
+            <w:tcW w:type="dxa" w:w="2088"/>
           </w:tcPr>
           <w:p>
             <w:r>
@@ -1535,7 +1533,7 @@
         </w:tc>
         <w:tc>
           <w:tcPr>
-            <w:tcW w:w="2088" w:type="dxa"/>
+            <w:tcW w:type="dxa" w:w="2088"/>
           </w:tcPr>
           <w:p>
             <w:r>
@@ -1554,19 +1552,19 @@
     <w:p/>
     <w:tbl>
       <w:tblPr>
-        <w:tblW w:w="0" w:type="auto"/>
-        <w:tblLook w:val="04A0" w:firstRow="1" w:lastRow="0" w:firstColumn="1" w:lastColumn="0" w:noHBand="0" w:noVBand="1"/>
+        <w:tblW w:type="auto" w:w="0"/>
+        <w:tblLook w:firstColumn="1" w:firstRow="1" w:lastColumn="0" w:lastRow="0" w:noHBand="0" w:noVBand="1" w:val="04A0"/>
       </w:tblPr>
       <w:tblGrid>
-        <w:gridCol w:w="1219"/>
-        <w:gridCol w:w="1260"/>
-        <w:gridCol w:w="1363"/>
-        <w:gridCol w:w="1413"/>
+        <w:gridCol w:w="2609"/>
+        <w:gridCol w:w="2609"/>
+        <w:gridCol w:w="2609"/>
+        <w:gridCol w:w="2609"/>
       </w:tblGrid>
       <w:tr>
         <w:tc>
           <w:tcPr>
-            <w:tcW w:w="2609" w:type="dxa"/>
+            <w:tcW w:type="dxa" w:w="2609"/>
           </w:tcPr>
           <w:p>
             <w:r>
@@ -1576,7 +1574,7 @@
         </w:tc>
         <w:tc>
           <w:tcPr>
-            <w:tcW w:w="2609" w:type="dxa"/>
+            <w:tcW w:type="dxa" w:w="2609"/>
           </w:tcPr>
           <w:p>
             <w:r>
@@ -1586,7 +1584,7 @@
         </w:tc>
         <w:tc>
           <w:tcPr>
-            <w:tcW w:w="2609" w:type="dxa"/>
+            <w:tcW w:type="dxa" w:w="2609"/>
           </w:tcPr>
           <w:p>
             <w:r>
@@ -1596,7 +1594,7 @@
         </w:tc>
         <w:tc>
           <w:tcPr>
-            <w:tcW w:w="2609" w:type="dxa"/>
+            <w:tcW w:type="dxa" w:w="2609"/>
           </w:tcPr>
           <w:p>
             <w:r>
@@ -1608,7 +1606,7 @@
       <w:tr>
         <w:tc>
           <w:tcPr>
-            <w:tcW w:w="2609" w:type="dxa"/>
+            <w:tcW w:type="dxa" w:w="2609"/>
           </w:tcPr>
           <w:p>
             <w:r>
@@ -1618,7 +1616,7 @@
         </w:tc>
         <w:tc>
           <w:tcPr>
-            <w:tcW w:w="2609" w:type="dxa"/>
+            <w:tcW w:type="dxa" w:w="2609"/>
           </w:tcPr>
           <w:p>
             <w:r>
@@ -1628,7 +1626,7 @@
         </w:tc>
         <w:tc>
           <w:tcPr>
-            <w:tcW w:w="2609" w:type="dxa"/>
+            <w:tcW w:type="dxa" w:w="2609"/>
           </w:tcPr>
           <w:p>
             <w:r>
@@ -1638,7 +1636,7 @@
         </w:tc>
         <w:tc>
           <w:tcPr>
-            <w:tcW w:w="2609" w:type="dxa"/>
+            <w:tcW w:type="dxa" w:w="2609"/>
           </w:tcPr>
           <w:p>
             <w:r>
@@ -1650,7 +1648,7 @@
       <w:tr>
         <w:tc>
           <w:tcPr>
-            <w:tcW w:w="2609" w:type="dxa"/>
+            <w:tcW w:type="dxa" w:w="2609"/>
           </w:tcPr>
           <w:p>
             <w:r>
@@ -1660,7 +1658,7 @@
         </w:tc>
         <w:tc>
           <w:tcPr>
-            <w:tcW w:w="2609" w:type="dxa"/>
+            <w:tcW w:type="dxa" w:w="2609"/>
           </w:tcPr>
           <w:p>
             <w:r>
@@ -1670,7 +1668,7 @@
         </w:tc>
         <w:tc>
           <w:tcPr>
-            <w:tcW w:w="2609" w:type="dxa"/>
+            <w:tcW w:type="dxa" w:w="2609"/>
           </w:tcPr>
           <w:p>
             <w:r>
@@ -1680,7 +1678,7 @@
         </w:tc>
         <w:tc>
           <w:tcPr>
-            <w:tcW w:w="2609" w:type="dxa"/>
+            <w:tcW w:type="dxa" w:w="2609"/>
           </w:tcPr>
           <w:p>
             <w:r>
@@ -1692,7 +1690,7 @@
       <w:tr>
         <w:tc>
           <w:tcPr>
-            <w:tcW w:w="2609" w:type="dxa"/>
+            <w:tcW w:type="dxa" w:w="2609"/>
           </w:tcPr>
           <w:p>
             <w:r>
@@ -1702,7 +1700,7 @@
         </w:tc>
         <w:tc>
           <w:tcPr>
-            <w:tcW w:w="2609" w:type="dxa"/>
+            <w:tcW w:type="dxa" w:w="2609"/>
           </w:tcPr>
           <w:p>
             <w:r>
@@ -1712,7 +1710,7 @@
         </w:tc>
         <w:tc>
           <w:tcPr>
-            <w:tcW w:w="2609" w:type="dxa"/>
+            <w:tcW w:type="dxa" w:w="2609"/>
           </w:tcPr>
           <w:p>
             <w:r>
@@ -1722,7 +1720,7 @@
         </w:tc>
         <w:tc>
           <w:tcPr>
-            <w:tcW w:w="2609" w:type="dxa"/>
+            <w:tcW w:type="dxa" w:w="2609"/>
           </w:tcPr>
           <w:p>
             <w:r>
@@ -1734,7 +1732,7 @@
       <w:tr>
         <w:tc>
           <w:tcPr>
-            <w:tcW w:w="2609" w:type="dxa"/>
+            <w:tcW w:type="dxa" w:w="2609"/>
           </w:tcPr>
           <w:p>
             <w:r>
@@ -1744,7 +1742,7 @@
         </w:tc>
         <w:tc>
           <w:tcPr>
-            <w:tcW w:w="2609" w:type="dxa"/>
+            <w:tcW w:type="dxa" w:w="2609"/>
           </w:tcPr>
           <w:p>
             <w:r>
@@ -1754,7 +1752,7 @@
         </w:tc>
         <w:tc>
           <w:tcPr>
-            <w:tcW w:w="2609" w:type="dxa"/>
+            <w:tcW w:type="dxa" w:w="2609"/>
           </w:tcPr>
           <w:p>
             <w:r>
@@ -1764,7 +1762,7 @@
         </w:tc>
         <w:tc>
           <w:tcPr>
-            <w:tcW w:w="2609" w:type="dxa"/>
+            <w:tcW w:type="dxa" w:w="2609"/>
           </w:tcPr>
           <w:p>
             <w:r>
@@ -1776,7 +1774,7 @@
       <w:tr>
         <w:tc>
           <w:tcPr>
-            <w:tcW w:w="2609" w:type="dxa"/>
+            <w:tcW w:type="dxa" w:w="2609"/>
           </w:tcPr>
           <w:p>
             <w:r>
@@ -1786,7 +1784,7 @@
         </w:tc>
         <w:tc>
           <w:tcPr>
-            <w:tcW w:w="2609" w:type="dxa"/>
+            <w:tcW w:type="dxa" w:w="2609"/>
           </w:tcPr>
           <w:p>
             <w:r>
@@ -1796,7 +1794,7 @@
         </w:tc>
         <w:tc>
           <w:tcPr>
-            <w:tcW w:w="2609" w:type="dxa"/>
+            <w:tcW w:type="dxa" w:w="2609"/>
           </w:tcPr>
           <w:p>
             <w:r>
@@ -1806,7 +1804,7 @@
         </w:tc>
         <w:tc>
           <w:tcPr>
-            <w:tcW w:w="2609" w:type="dxa"/>
+            <w:tcW w:type="dxa" w:w="2609"/>
           </w:tcPr>
           <w:p>
             <w:r>
@@ -1818,7 +1816,7 @@
       <w:tr>
         <w:tc>
           <w:tcPr>
-            <w:tcW w:w="2609" w:type="dxa"/>
+            <w:tcW w:type="dxa" w:w="2609"/>
           </w:tcPr>
           <w:p>
             <w:r>
@@ -1828,7 +1826,7 @@
         </w:tc>
         <w:tc>
           <w:tcPr>
-            <w:tcW w:w="2609" w:type="dxa"/>
+            <w:tcW w:type="dxa" w:w="2609"/>
           </w:tcPr>
           <w:p>
             <w:r>
@@ -1838,7 +1836,7 @@
         </w:tc>
         <w:tc>
           <w:tcPr>
-            <w:tcW w:w="2609" w:type="dxa"/>
+            <w:tcW w:type="dxa" w:w="2609"/>
           </w:tcPr>
           <w:p>
             <w:r>
@@ -1848,7 +1846,7 @@
         </w:tc>
         <w:tc>
           <w:tcPr>
-            <w:tcW w:w="2609" w:type="dxa"/>
+            <w:tcW w:type="dxa" w:w="2609"/>
           </w:tcPr>
           <w:p>
             <w:r>
@@ -1861,10 +1859,7 @@
     <w:p/>
     <w:p>
       <w:r>
-        <w:t xml:space="preserve">Sonuclar yalnizca tablo duzeyinde degil, yorum duzeyinde de anlamlidir. p95 esigi p97 ve p99'a gore daha yuksek recall ve F1 vermistir; bu nedenle ara rapor icin daha dengeli operasyon </w:t>
-      </w:r>
-      <w:r>
-        <w:t>noktasi olarak secilmistir. CNV ve DME siniflari NORMAL goruntulerden belirgin sekilde ayrisirken, DRUSEN sinifinin error dagilimi normale daha yakindir. Bu durum, bazi patolojilerin reconstruction tabanli yaklasimlarda digerlerine gore daha zor ayristigini gostermektedir.</w:t>
+        <w:t>Sonuclar yalnizca tablo duzeyinde degil, yorum duzeyinde de anlamlidir. p95 esigi p97 ve p99'a gore daha yuksek recall ve F1 vermistir; bu nedenle ara rapor icin daha dengeli operasyon noktasi olarak secilmistir. CNV ve DME siniflari NORMAL goruntulerden belirgin sekilde ayrisirken, DRUSEN sinifinin error dagilimi normale daha yakindir. Bu durum, bazi patolojilerin reconstruction tabanli yaklasimlarda digerlerine gore daha zor ayristigini gostermektedir.</w:t>
       </w:r>
     </w:p>
     <w:p/>
@@ -1876,7 +1871,7 @@
     <w:p/>
     <w:p>
       <w:pPr>
-        <w:pStyle w:val="Balk1"/>
+        <w:pStyle w:val="Heading1"/>
       </w:pPr>
       <w:r>
         <w:t>5. Tartisma</w:t>
@@ -1897,7 +1892,7 @@
     <w:p/>
     <w:p>
       <w:pPr>
-        <w:pStyle w:val="Balk1"/>
+        <w:pStyle w:val="Heading1"/>
       </w:pPr>
       <w:r>
         <w:t>6. Gelecek Calismalar</w:t>
@@ -1906,13 +1901,31 @@
     <w:p/>
     <w:p>
       <w:r>
-        <w:t>Final asamada standart autoencoder yerine VAE veya memory-augmented reconstruction modelleri denenebilir. Residual map kalitesi artirilabilir, daha yuksek giris cozunurlugu ile DRUSEN gibi zorlayici siniflarda ayristirma gucu test edilebilir ve image size, latent boyut ile threshold seciminin etkisi sistematik ablation calismalariyla incelenebilir.</w:t>
+        <w:t>Final asamada ilk gelistirme ekseni, mimari seviyesinde daha guclu reconstruction modellerinin denenmesi olacaktir. Standart convolutional autoencoder yerine VAE, skip-connection iceren daha derin encoder-decoder yapilari veya memory-augmented reconstruction modelleri uygulanabilir. Bu sayede modelin normal anatomi dagilimini daha zengin bir latent temsille ogrenmesi ve ozellikle sinira yakin patolojik orneklerde daha ayirt edici reconstruction error uretmesi hedeflenmektedir. Buna ek olarak yalnizca MSE yerine L1, SSIM tabanli kayiplar veya birlesik loss fonksiyonlari denenerek yeniden olusturma kalitesi ile anomaly sensitivity arasindaki denge incelenebilir.</w:t>
       </w:r>
     </w:p>
     <w:p/>
     <w:p>
-      <w:pPr>
-        <w:pStyle w:val="Balk1"/>
+      <w:r>
+        <w:t>Ikinci gelistirme ekseni, veri ve deney tasarimi tarafinda planlanmaktadir. Daha yuksek giris cozunurlugu ile deney yapilarak ince retinal yapilarin ve ozellikle DRUSEN gibi daha zor ayristirilan siniflarin model tarafindan daha iyi temsil edilip edilmedigi test edilecektir. Bunun yaninda latent boyut, batch size, threshold secimi ve image size gibi hiperparametreler sistematik bir ablation calismasi ile karsilastirilacaktir. Boylece final raporda yalnizca tek bir model sonucu degil, tasarim kararlarinin performansa etkisini gosteren daha akademik bir deney tablosu sunulabilecektir.</w:t>
+      </w:r>
+    </w:p>
+    <w:p/>
+    <w:p>
+      <w:r>
+        <w:t>Ucuncu gelistirme ekseni, yorumlanabilirlik ve klinik anlamlandirma uzerine kurulacaktir. Mevcut residual map ciktilari daha detayli incelenerek hata haritalarinin retina uzerindeki hangi bolgelerde yogunlastigi analiz edilebilir. Eger rekonstruksiyon hatasi belirli anatomik bozulmalarla tutarli bicimde eslesirse, modelin yalnizca sayisal anomaly skor ureten bir kara kutu olmaktan cikmasi ve klinik olarak daha anlamli hale gelmesi saglanabilir. Bu nedenle final asamada residual map gorsellestirmeleri, en iyi ve en kotu orneklerin ayri sunulmasi ve sinif bazli hata desenlerinin nitel olarak tartisilmasi planlanmaktadir.</w:t>
+      </w:r>
+    </w:p>
+    <w:p/>
+    <w:p>
+      <w:r>
+        <w:t>Son olarak, hesaplama verimliligi ve karsilastirmali degerlendirme de gelecekteki temel adimlardan biridir. Veri yukleme hattinin hizlandirilmasi, daha uygun batch boyutlarinin secilmesi ve egitim suresinin optimize edilmesi ile tekrarli deneyler daha verimli hale getirilecektir. Mevcut baseline sonucunun yanina en az bir gelistirilmis model eklenerek AE ile gelistirilmis varyantin AUROC, F1, recall ve FPR acisindan dogrudan karsilastirilmasi hedeflenmektedir. Bu gelistirmeler tamamlandiginda proje, ara rapor seviyesindeki calisan baseline'dan, karsilastirmali ve daha guclu bir final proje yapisina tasinmis olacaktir.</w:t>
+      </w:r>
+    </w:p>
+    <w:p/>
+    <w:p>
+      <w:pPr>
+        <w:pStyle w:val="Heading1"/>
       </w:pPr>
       <w:r>
         <w:t>7. Sonuc</w:t>
@@ -1927,10 +1940,9 @@
     <w:p/>
     <w:p>
       <w:pPr>
-        <w:pStyle w:val="Balk1"/>
-      </w:pPr>
-      <w:r>
-        <w:lastRenderedPageBreak/>
+        <w:pStyle w:val="Heading1"/>
+      </w:pPr>
+      <w:r>
         <w:t>Kaynaklar</w:t>
       </w:r>
     </w:p>
@@ -1987,7 +1999,7 @@
     </w:p>
     <w:p>
       <w:pPr>
-        <w:pStyle w:val="Balk1"/>
+        <w:pStyle w:val="Heading1"/>
       </w:pPr>
       <w:r>
         <w:t>Sekiller</w:t>
@@ -1995,26 +2007,22 @@
     </w:p>
     <w:p>
       <w:r>
-        <w:rPr>
-          <w:noProof/>
-        </w:rPr>
         <w:drawing>
-          <wp:inline distT="0" distB="0" distL="0" distR="0" wp14:anchorId="2C45BCA5" wp14:editId="4AD2875F">
-            <wp:extent cx="3197283" cy="724395"/>
-            <wp:effectExtent l="0" t="0" r="3175" b="0"/>
+          <wp:inline xmlns:a="http://schemas.openxmlformats.org/drawingml/2006/main" xmlns:pic="http://schemas.openxmlformats.org/drawingml/2006/picture">
+            <wp:extent cx="5669280" cy="1284465"/>
             <wp:docPr id="1" name="Picture 1"/>
             <wp:cNvGraphicFramePr>
-              <a:graphicFrameLocks xmlns:a="http://schemas.openxmlformats.org/drawingml/2006/main" noChangeAspect="1"/>
+              <a:graphicFrameLocks noChangeAspect="1"/>
             </wp:cNvGraphicFramePr>
-            <a:graphic xmlns:a="http://schemas.openxmlformats.org/drawingml/2006/main">
+            <a:graphic>
               <a:graphicData uri="http://schemas.openxmlformats.org/drawingml/2006/picture">
-                <pic:pic xmlns:pic="http://schemas.openxmlformats.org/drawingml/2006/picture">
+                <pic:pic>
                   <pic:nvPicPr>
                     <pic:cNvPr id="0" name="retina_oct_pipeline.png"/>
                     <pic:cNvPicPr/>
                   </pic:nvPicPr>
                   <pic:blipFill>
-                    <a:blip r:embed="rId6"/>
+                    <a:blip r:embed="rId8"/>
                     <a:stretch>
                       <a:fillRect/>
                     </a:stretch>
@@ -2022,11 +2030,9 @@
                   <pic:spPr>
                     <a:xfrm>
                       <a:off x="0" y="0"/>
-                      <a:ext cx="3221345" cy="729847"/>
+                      <a:ext cx="5669280" cy="1284465"/>
                     </a:xfrm>
-                    <a:prstGeom prst="rect">
-                      <a:avLst/>
-                    </a:prstGeom>
+                    <a:prstGeom prst="rect"/>
                   </pic:spPr>
                 </pic:pic>
               </a:graphicData>
@@ -2036,32 +2042,31 @@
       </w:r>
     </w:p>
     <w:p>
+      <w:pPr>
+        <w:jc w:val="center"/>
+      </w:pPr>
       <w:r>
         <w:t>Sekil 1. Onerilen retina OCT anomaly detection boru hatti.</w:t>
       </w:r>
     </w:p>
     <w:p>
       <w:r>
-        <w:rPr>
-          <w:noProof/>
-        </w:rPr>
         <w:drawing>
-          <wp:inline distT="0" distB="0" distL="0" distR="0" wp14:anchorId="0D52774A" wp14:editId="2FB70F53">
+          <wp:inline xmlns:a="http://schemas.openxmlformats.org/drawingml/2006/main" xmlns:pic="http://schemas.openxmlformats.org/drawingml/2006/picture">
             <wp:extent cx="5669280" cy="4103290"/>
-            <wp:effectExtent l="0" t="0" r="0" b="0"/>
             <wp:docPr id="2" name="Picture 2"/>
             <wp:cNvGraphicFramePr>
-              <a:graphicFrameLocks xmlns:a="http://schemas.openxmlformats.org/drawingml/2006/main" noChangeAspect="1"/>
+              <a:graphicFrameLocks noChangeAspect="1"/>
             </wp:cNvGraphicFramePr>
-            <a:graphic xmlns:a="http://schemas.openxmlformats.org/drawingml/2006/main">
+            <a:graphic>
               <a:graphicData uri="http://schemas.openxmlformats.org/drawingml/2006/picture">
-                <pic:pic xmlns:pic="http://schemas.openxmlformats.org/drawingml/2006/picture">
+                <pic:pic>
                   <pic:nvPicPr>
                     <pic:cNvPr id="0" name="report_results_overview.png"/>
                     <pic:cNvPicPr/>
                   </pic:nvPicPr>
                   <pic:blipFill>
-                    <a:blip r:embed="rId7"/>
+                    <a:blip r:embed="rId9"/>
                     <a:stretch>
                       <a:fillRect/>
                     </a:stretch>
@@ -2071,9 +2076,7 @@
                       <a:off x="0" y="0"/>
                       <a:ext cx="5669280" cy="4103290"/>
                     </a:xfrm>
-                    <a:prstGeom prst="rect">
-                      <a:avLst/>
-                    </a:prstGeom>
+                    <a:prstGeom prst="rect"/>
                   </pic:spPr>
                 </pic:pic>
               </a:graphicData>
@@ -2083,6 +2086,9 @@
       </w:r>
     </w:p>
     <w:p>
+      <w:pPr>
+        <w:jc w:val="center"/>
+      </w:pPr>
       <w:r>
         <w:t>Sekil 2. Egitim, ROC, error dagilimi ve reconstruction ciktilarini bir araya getiren ozet gorsel.</w:t>
       </w:r>
@@ -2100,7 +2106,7 @@
 </file>
 
 <file path=word/numbering.xml><?xml version="1.0" encoding="utf-8"?>
-<w:numbering xmlns:wpc="http://schemas.microsoft.com/office/word/2010/wordprocessingCanvas" xmlns:cx="http://schemas.microsoft.com/office/drawing/2014/chartex" xmlns:cx1="http://schemas.microsoft.com/office/drawing/2015/9/8/chartex" xmlns:cx2="http://schemas.microsoft.com/office/drawing/2015/10/21/chartex" xmlns:cx3="http://schemas.microsoft.com/office/drawing/2016/5/9/chartex" xmlns:cx4="http://schemas.microsoft.com/office/drawing/2016/5/10/chartex" xmlns:cx5="http://schemas.microsoft.com/office/drawing/2016/5/11/chartex" xmlns:cx6="http://schemas.microsoft.com/office/drawing/2016/5/12/chartex" xmlns:cx7="http://schemas.microsoft.com/office/drawing/2016/5/13/chartex" xmlns:cx8="http://schemas.microsoft.com/office/drawing/2016/5/14/chartex" xmlns:mc="http://schemas.openxmlformats.org/markup-compatibility/2006" xmlns:aink="http://schemas.microsoft.com/office/drawing/2016/ink" xmlns:am3d="http://schemas.microsoft.com/office/drawing/2017/model3d" xmlns:o="urn:schemas-microsoft-com:office:office" xmlns:oel="http://schemas.microsoft.com/office/2019/extlst" xmlns:r="http://schemas.openxmlformats.org/officeDocument/2006/relationships" xmlns:m="http://schemas.openxmlformats.org/officeDocument/2006/math" xmlns:v="urn:schemas-microsoft-com:vml" xmlns:wp14="http://schemas.microsoft.com/office/word/2010/wordprocessingDrawing" xmlns:wp="http://schemas.openxmlformats.org/drawingml/2006/wordprocessingDrawing" xmlns:w10="urn:schemas-microsoft-com:office:word" xmlns:w="http://schemas.openxmlformats.org/wordprocessingml/2006/main" xmlns:w14="http://schemas.microsoft.com/office/word/2010/wordml" xmlns:w15="http://schemas.microsoft.com/office/word/2012/wordml" xmlns:w16cex="http://schemas.microsoft.com/office/word/2018/wordml/cex" xmlns:w16cid="http://schemas.microsoft.com/office/word/2016/wordml/cid" xmlns:w16="http://schemas.microsoft.com/office/word/2018/wordml" xmlns:w16du="http://schemas.microsoft.com/office/word/2023/wordml/word16du" xmlns:w16sdtdh="http://schemas.microsoft.com/office/word/2020/wordml/sdtdatahash" xmlns:w16sdtfl="http://schemas.microsoft.com/office/word/2024/wordml/sdtformatlock" xmlns:w16se="http://schemas.microsoft.com/office/word/2015/wordml/symex" xmlns:wpg="http://schemas.microsoft.com/office/word/2010/wordprocessingGroup" xmlns:wpi="http://schemas.microsoft.com/office/word/2010/wordprocessingInk" xmlns:wne="http://schemas.microsoft.com/office/word/2006/wordml" xmlns:wps="http://schemas.microsoft.com/office/word/2010/wordprocessingShape" mc:Ignorable="w14 w15 w16se w16cid w16 w16cex w16sdtdh w16sdtfl w16du wp14">
+<w:numbering xmlns:wpc="http://schemas.microsoft.com/office/word/2010/wordprocessingCanvas" xmlns:cx="http://schemas.microsoft.com/office/drawing/2014/chartex" xmlns:cx1="http://schemas.microsoft.com/office/drawing/2015/9/8/chartex" xmlns:cx2="http://schemas.microsoft.com/office/drawing/2015/10/21/chartex" xmlns:cx3="http://schemas.microsoft.com/office/drawing/2016/5/9/chartex" xmlns:cx4="http://schemas.microsoft.com/office/drawing/2016/5/10/chartex" xmlns:cx5="http://schemas.microsoft.com/office/drawing/2016/5/11/chartex" xmlns:cx6="http://schemas.microsoft.com/office/drawing/2016/5/12/chartex" xmlns:cx7="http://schemas.microsoft.com/office/drawing/2016/5/13/chartex" xmlns:cx8="http://schemas.microsoft.com/office/drawing/2016/5/14/chartex" xmlns:mc="http://schemas.openxmlformats.org/markup-compatibility/2006" xmlns:aink="http://schemas.microsoft.com/office/drawing/2016/ink" xmlns:am3d="http://schemas.microsoft.com/office/drawing/2017/model3d" xmlns:o="urn:schemas-microsoft-com:office:office" xmlns:r="http://schemas.openxmlformats.org/officeDocument/2006/relationships" xmlns:m="http://schemas.openxmlformats.org/officeDocument/2006/math" xmlns:v="urn:schemas-microsoft-com:vml" xmlns:wp14="http://schemas.microsoft.com/office/word/2010/wordprocessingDrawing" xmlns:wp="http://schemas.openxmlformats.org/drawingml/2006/wordprocessingDrawing" xmlns:w10="urn:schemas-microsoft-com:office:word" xmlns:w="http://schemas.openxmlformats.org/wordprocessingml/2006/main" xmlns:w14="http://schemas.microsoft.com/office/word/2010/wordml" xmlns:w15="http://schemas.microsoft.com/office/word/2012/wordml" xmlns:w16cex="http://schemas.microsoft.com/office/word/2018/wordml/cex" xmlns:w16cid="http://schemas.microsoft.com/office/word/2016/wordml/cid" xmlns:w16="http://schemas.microsoft.com/office/word/2018/wordml" xmlns:w16se="http://schemas.microsoft.com/office/word/2015/wordml/symex" xmlns:wpg="http://schemas.microsoft.com/office/word/2010/wordprocessingGroup" xmlns:wpi="http://schemas.microsoft.com/office/word/2010/wordprocessingInk" xmlns:wne="http://schemas.microsoft.com/office/word/2006/wordml" xmlns:wps="http://schemas.microsoft.com/office/word/2010/wordprocessingShape" mc:Ignorable="w14 w15 w16se w16cid w16 w16cex wp14">
   <w:abstractNum w:abstractNumId="0" w15:restartNumberingAfterBreak="0">
     <w:nsid w:val="0A161725"/>
     <w:multiLevelType w:val="multilevel"/>
@@ -2248,7 +2254,7 @@
     <w:lvl w:ilvl="0">
       <w:start w:val="1"/>
       <w:numFmt w:val="upperRoman"/>
-      <w:pStyle w:val="Balk1"/>
+      <w:pStyle w:val="Heading1"/>
       <w:lvlText w:val="%1."/>
       <w:lvlJc w:val="center"/>
       <w:pPr>
@@ -2274,7 +2280,7 @@
     <w:lvl w:ilvl="1">
       <w:start w:val="1"/>
       <w:numFmt w:val="upperLetter"/>
-      <w:pStyle w:val="Balk2"/>
+      <w:pStyle w:val="Heading2"/>
       <w:lvlText w:val="%2."/>
       <w:lvlJc w:val="left"/>
       <w:pPr>
@@ -2304,7 +2310,7 @@
     <w:lvl w:ilvl="2">
       <w:start w:val="1"/>
       <w:numFmt w:val="decimal"/>
-      <w:pStyle w:val="Balk3"/>
+      <w:pStyle w:val="Heading3"/>
       <w:lvlText w:val="%3)"/>
       <w:lvlJc w:val="left"/>
       <w:pPr>
@@ -2334,7 +2340,7 @@
     <w:lvl w:ilvl="3">
       <w:start w:val="1"/>
       <w:numFmt w:val="lowerLetter"/>
-      <w:pStyle w:val="Balk4"/>
+      <w:pStyle w:val="Heading4"/>
       <w:lvlText w:val="%4)"/>
       <w:lvlJc w:val="left"/>
       <w:pPr>
@@ -3067,32 +3073,32 @@
       </w:pPr>
     </w:lvl>
   </w:abstractNum>
-  <w:num w:numId="1" w16cid:durableId="1185746322">
+  <w:num w:numId="1">
     <w:abstractNumId w:val="1"/>
   </w:num>
-  <w:num w:numId="2" w16cid:durableId="1754887973">
+  <w:num w:numId="2">
     <w:abstractNumId w:val="0"/>
   </w:num>
-  <w:num w:numId="3" w16cid:durableId="434522516">
+  <w:num w:numId="3">
     <w:abstractNumId w:val="4"/>
   </w:num>
-  <w:num w:numId="4" w16cid:durableId="1151365837">
+  <w:num w:numId="4">
     <w:abstractNumId w:val="3"/>
   </w:num>
-  <w:num w:numId="5" w16cid:durableId="2063022022">
+  <w:num w:numId="5">
     <w:abstractNumId w:val="2"/>
   </w:num>
-  <w:num w:numId="6" w16cid:durableId="1948192167">
+  <w:num w:numId="6">
     <w:abstractNumId w:val="5"/>
   </w:num>
-  <w:num w:numId="7" w16cid:durableId="468980294">
+  <w:num w:numId="7">
     <w:abstractNumId w:val="6"/>
   </w:num>
 </w:numbering>
 </file>
 
 <file path=word/styles.xml><?xml version="1.0" encoding="utf-8"?>
-<w:styles xmlns:mc="http://schemas.openxmlformats.org/markup-compatibility/2006" xmlns:r="http://schemas.openxmlformats.org/officeDocument/2006/relationships" xmlns:w="http://schemas.openxmlformats.org/wordprocessingml/2006/main" xmlns:w14="http://schemas.microsoft.com/office/word/2010/wordml" xmlns:w15="http://schemas.microsoft.com/office/word/2012/wordml" xmlns:w16cex="http://schemas.microsoft.com/office/word/2018/wordml/cex" xmlns:w16cid="http://schemas.microsoft.com/office/word/2016/wordml/cid" xmlns:w16="http://schemas.microsoft.com/office/word/2018/wordml" xmlns:w16du="http://schemas.microsoft.com/office/word/2023/wordml/word16du" xmlns:w16sdtdh="http://schemas.microsoft.com/office/word/2020/wordml/sdtdatahash" xmlns:w16sdtfl="http://schemas.microsoft.com/office/word/2024/wordml/sdtformatlock" xmlns:w16se="http://schemas.microsoft.com/office/word/2015/wordml/symex" mc:Ignorable="w14 w15 w16se w16cid w16 w16cex w16sdtdh w16sdtfl w16du">
+<w:styles xmlns:mc="http://schemas.openxmlformats.org/markup-compatibility/2006" xmlns:r="http://schemas.openxmlformats.org/officeDocument/2006/relationships" xmlns:w="http://schemas.openxmlformats.org/wordprocessingml/2006/main" xmlns:w14="http://schemas.microsoft.com/office/word/2010/wordml" xmlns:w15="http://schemas.microsoft.com/office/word/2012/wordml" xmlns:w16cex="http://schemas.microsoft.com/office/word/2018/wordml/cex" xmlns:w16cid="http://schemas.microsoft.com/office/word/2016/wordml/cid" xmlns:w16="http://schemas.microsoft.com/office/word/2018/wordml" xmlns:w16se="http://schemas.microsoft.com/office/word/2015/wordml/symex" mc:Ignorable="w14 w15 w16se w16cid w16 w16cex">
   <w:docDefaults>
     <w:rPrDefault>
       <w:rPr>
@@ -3492,11 +3498,11 @@
       <w:lang w:val="tr-TR"/>
     </w:rPr>
   </w:style>
-  <w:style w:type="paragraph" w:styleId="Balk1">
+  <w:style w:type="paragraph" w:styleId="Heading1">
     <w:name w:val="heading 1"/>
     <w:basedOn w:val="Normal"/>
     <w:next w:val="Normal"/>
-    <w:link w:val="Balk1Char"/>
+    <w:link w:val="Heading1Char"/>
     <w:uiPriority w:val="99"/>
     <w:qFormat/>
     <w:rsid w:val="006E09AB"/>
@@ -3516,11 +3522,11 @@
       <w:smallCaps/>
     </w:rPr>
   </w:style>
-  <w:style w:type="paragraph" w:styleId="Balk2">
+  <w:style w:type="paragraph" w:styleId="Heading2">
     <w:name w:val="heading 2"/>
     <w:basedOn w:val="Normal"/>
     <w:next w:val="Normal"/>
-    <w:link w:val="Balk2Char"/>
+    <w:link w:val="Heading2Char"/>
     <w:uiPriority w:val="99"/>
     <w:qFormat/>
     <w:rsid w:val="00EF3A1A"/>
@@ -3541,11 +3547,11 @@
       <w:iCs/>
     </w:rPr>
   </w:style>
-  <w:style w:type="paragraph" w:styleId="Balk3">
+  <w:style w:type="paragraph" w:styleId="Heading3">
     <w:name w:val="heading 3"/>
     <w:basedOn w:val="Normal"/>
     <w:next w:val="Normal"/>
-    <w:link w:val="Balk3Char"/>
+    <w:link w:val="Heading3Char"/>
     <w:uiPriority w:val="99"/>
     <w:qFormat/>
     <w:rsid w:val="00431D98"/>
@@ -3565,11 +3571,11 @@
       <w:iCs/>
     </w:rPr>
   </w:style>
-  <w:style w:type="paragraph" w:styleId="Balk4">
+  <w:style w:type="paragraph" w:styleId="Heading4">
     <w:name w:val="heading 4"/>
     <w:basedOn w:val="Normal"/>
     <w:next w:val="Normal"/>
-    <w:link w:val="Balk4Char"/>
+    <w:link w:val="Heading4Char"/>
     <w:uiPriority w:val="99"/>
     <w:qFormat/>
     <w:rsid w:val="004059FE"/>
@@ -3591,11 +3597,11 @@
       <w:iCs/>
     </w:rPr>
   </w:style>
-  <w:style w:type="paragraph" w:styleId="Balk5">
+  <w:style w:type="paragraph" w:styleId="Heading5">
     <w:name w:val="heading 5"/>
     <w:basedOn w:val="Normal"/>
     <w:next w:val="Normal"/>
-    <w:link w:val="Balk5Char"/>
+    <w:link w:val="Heading5Char"/>
     <w:uiPriority w:val="99"/>
     <w:qFormat/>
     <w:rsid w:val="006E09AB"/>
@@ -3610,13 +3616,13 @@
       <w:smallCaps/>
     </w:rPr>
   </w:style>
-  <w:style w:type="character" w:default="1" w:styleId="VarsaylanParagrafYazTipi">
+  <w:style w:type="character" w:default="1" w:styleId="DefaultParagraphFont">
     <w:name w:val="Default Paragraph Font"/>
     <w:uiPriority w:val="1"/>
     <w:semiHidden/>
     <w:unhideWhenUsed/>
   </w:style>
-  <w:style w:type="table" w:default="1" w:styleId="NormalTablo">
+  <w:style w:type="table" w:default="1" w:styleId="TableNormal">
     <w:name w:val="Normal Table"/>
     <w:uiPriority w:val="99"/>
     <w:semiHidden/>
@@ -3631,15 +3637,15 @@
       </w:tblCellMar>
     </w:tblPr>
   </w:style>
-  <w:style w:type="numbering" w:default="1" w:styleId="ListeYok">
+  <w:style w:type="numbering" w:default="1" w:styleId="NoList">
     <w:name w:val="No List"/>
     <w:uiPriority w:val="99"/>
     <w:semiHidden/>
     <w:unhideWhenUsed/>
   </w:style>
-  <w:style w:type="character" w:customStyle="1" w:styleId="Balk1Char">
-    <w:name w:val="Başlık 1 Char"/>
-    <w:link w:val="Balk1"/>
+  <w:style w:type="character" w:customStyle="1" w:styleId="Heading1Char">
+    <w:name w:val="Heading 1 Char"/>
+    <w:link w:val="Heading1"/>
     <w:uiPriority w:val="99"/>
     <w:qFormat/>
     <w:locked/>
@@ -3649,9 +3655,9 @@
       <w:smallCaps/>
     </w:rPr>
   </w:style>
-  <w:style w:type="character" w:customStyle="1" w:styleId="Balk2Char">
-    <w:name w:val="Başlık 2 Char"/>
-    <w:link w:val="Balk2"/>
+  <w:style w:type="character" w:customStyle="1" w:styleId="Heading2Char">
+    <w:name w:val="Heading 2 Char"/>
+    <w:link w:val="Heading2"/>
     <w:uiPriority w:val="99"/>
     <w:qFormat/>
     <w:locked/>
@@ -3662,9 +3668,9 @@
       <w:iCs/>
     </w:rPr>
   </w:style>
-  <w:style w:type="character" w:customStyle="1" w:styleId="Balk3Char">
-    <w:name w:val="Başlık 3 Char"/>
-    <w:link w:val="Balk3"/>
+  <w:style w:type="character" w:customStyle="1" w:styleId="Heading3Char">
+    <w:name w:val="Heading 3 Char"/>
+    <w:link w:val="Heading3"/>
     <w:uiPriority w:val="99"/>
     <w:qFormat/>
     <w:locked/>
@@ -3675,9 +3681,9 @@
       <w:iCs/>
     </w:rPr>
   </w:style>
-  <w:style w:type="character" w:customStyle="1" w:styleId="Balk4Char">
-    <w:name w:val="Başlık 4 Char"/>
-    <w:link w:val="Balk4"/>
+  <w:style w:type="character" w:customStyle="1" w:styleId="Heading4Char">
+    <w:name w:val="Heading 4 Char"/>
+    <w:link w:val="Heading4"/>
     <w:uiPriority w:val="99"/>
     <w:qFormat/>
     <w:locked/>
@@ -3688,9 +3694,9 @@
       <w:iCs/>
     </w:rPr>
   </w:style>
-  <w:style w:type="character" w:customStyle="1" w:styleId="Balk5Char">
-    <w:name w:val="Başlık 5 Char"/>
-    <w:link w:val="Balk5"/>
+  <w:style w:type="character" w:customStyle="1" w:styleId="Heading5Char">
+    <w:name w:val="Heading 5 Char"/>
+    <w:link w:val="Heading5"/>
     <w:uiPriority w:val="9"/>
     <w:semiHidden/>
     <w:qFormat/>
@@ -3706,9 +3712,9 @@
       <w:szCs w:val="26"/>
     </w:rPr>
   </w:style>
-  <w:style w:type="character" w:customStyle="1" w:styleId="GvdeMetniChar">
-    <w:name w:val="Gövde Metni Char"/>
-    <w:link w:val="GvdeMetni"/>
+  <w:style w:type="character" w:customStyle="1" w:styleId="BodyTextChar">
+    <w:name w:val="Body Text Char"/>
+    <w:link w:val="BodyText"/>
     <w:uiPriority w:val="99"/>
     <w:qFormat/>
     <w:locked/>
@@ -3719,10 +3725,10 @@
       <w:szCs w:val="20"/>
     </w:rPr>
   </w:style>
-  <w:style w:type="character" w:customStyle="1" w:styleId="BalonMetniChar">
-    <w:name w:val="Balon Metni Char"/>
-    <w:basedOn w:val="VarsaylanParagrafYazTipi"/>
-    <w:link w:val="BalonMetni"/>
+  <w:style w:type="character" w:customStyle="1" w:styleId="BalloonTextChar">
+    <w:name w:val="Balloon Text Char"/>
+    <w:basedOn w:val="DefaultParagraphFont"/>
+    <w:link w:val="BalloonText"/>
     <w:uiPriority w:val="99"/>
     <w:semiHidden/>
     <w:qFormat/>
@@ -3733,10 +3739,10 @@
       <w:szCs w:val="16"/>
     </w:rPr>
   </w:style>
-  <w:style w:type="character" w:customStyle="1" w:styleId="stBilgiChar">
-    <w:name w:val="Üst Bilgi Char"/>
-    <w:basedOn w:val="VarsaylanParagrafYazTipi"/>
-    <w:link w:val="stBilgi"/>
+  <w:style w:type="character" w:customStyle="1" w:styleId="HeaderChar">
+    <w:name w:val="Header Char"/>
+    <w:basedOn w:val="DefaultParagraphFont"/>
+    <w:link w:val="Header"/>
     <w:uiPriority w:val="99"/>
     <w:qFormat/>
     <w:rsid w:val="00D42065"/>
@@ -3744,10 +3750,10 @@
       <w:rFonts w:ascii="Times New Roman" w:hAnsi="Times New Roman"/>
     </w:rPr>
   </w:style>
-  <w:style w:type="character" w:customStyle="1" w:styleId="AltBilgiChar">
-    <w:name w:val="Alt Bilgi Char"/>
-    <w:basedOn w:val="VarsaylanParagrafYazTipi"/>
-    <w:link w:val="AltBilgi"/>
+  <w:style w:type="character" w:customStyle="1" w:styleId="FooterChar">
+    <w:name w:val="Footer Char"/>
+    <w:basedOn w:val="DefaultParagraphFont"/>
+    <w:link w:val="Footer"/>
     <w:uiPriority w:val="99"/>
     <w:qFormat/>
     <w:rsid w:val="00D42065"/>
@@ -3757,7 +3763,7 @@
   </w:style>
   <w:style w:type="character" w:customStyle="1" w:styleId="InternetLink">
     <w:name w:val="Internet Link"/>
-    <w:basedOn w:val="VarsaylanParagrafYazTipi"/>
+    <w:basedOn w:val="DefaultParagraphFont"/>
     <w:uiPriority w:val="99"/>
     <w:unhideWhenUsed/>
     <w:rsid w:val="00CE49D1"/>
@@ -4890,7 +4896,7 @@
   <w:style w:type="paragraph" w:customStyle="1" w:styleId="Heading">
     <w:name w:val="Heading"/>
     <w:basedOn w:val="Normal"/>
-    <w:next w:val="GvdeMetni"/>
+    <w:next w:val="BodyText"/>
     <w:qFormat/>
     <w:pPr>
       <w:keepNext/>
@@ -4902,10 +4908,10 @@
       <w:szCs w:val="28"/>
     </w:rPr>
   </w:style>
-  <w:style w:type="paragraph" w:styleId="GvdeMetni">
+  <w:style w:type="paragraph" w:styleId="BodyText">
     <w:name w:val="Body Text"/>
     <w:basedOn w:val="Normal"/>
-    <w:link w:val="GvdeMetniChar"/>
+    <w:link w:val="BodyTextChar"/>
     <w:uiPriority w:val="99"/>
     <w:qFormat/>
     <w:rsid w:val="00753F7B"/>
@@ -4922,14 +4928,14 @@
       <w:spacing w:val="-1"/>
     </w:rPr>
   </w:style>
-  <w:style w:type="paragraph" w:styleId="Liste">
+  <w:style w:type="paragraph" w:styleId="List">
     <w:name w:val="List"/>
-    <w:basedOn w:val="GvdeMetni"/>
+    <w:basedOn w:val="BodyText"/>
     <w:rPr>
       <w:rFonts w:cs="Lohit Devanagari"/>
     </w:rPr>
   </w:style>
-  <w:style w:type="paragraph" w:styleId="ResimYazs">
+  <w:style w:type="paragraph" w:styleId="Caption">
     <w:name w:val="caption"/>
     <w:basedOn w:val="Normal"/>
     <w:qFormat/>
@@ -5001,7 +5007,7 @@
   </w:style>
   <w:style w:type="paragraph" w:customStyle="1" w:styleId="bulletlist">
     <w:name w:val="bullet list"/>
-    <w:basedOn w:val="GvdeMetni"/>
+    <w:basedOn w:val="BodyText"/>
     <w:qFormat/>
     <w:rsid w:val="008054BC"/>
     <w:pPr>
@@ -5287,10 +5293,10 @@
       <w:szCs w:val="18"/>
     </w:rPr>
   </w:style>
-  <w:style w:type="paragraph" w:styleId="BalonMetni">
+  <w:style w:type="paragraph" w:styleId="BalloonText">
     <w:name w:val="Balloon Text"/>
     <w:basedOn w:val="Normal"/>
-    <w:link w:val="BalonMetniChar"/>
+    <w:link w:val="BalloonTextChar"/>
     <w:uiPriority w:val="99"/>
     <w:semiHidden/>
     <w:unhideWhenUsed/>
@@ -5302,10 +5308,10 @@
       <w:szCs w:val="16"/>
     </w:rPr>
   </w:style>
-  <w:style w:type="paragraph" w:styleId="stBilgi">
+  <w:style w:type="paragraph" w:styleId="Header">
     <w:name w:val="header"/>
     <w:basedOn w:val="Normal"/>
-    <w:link w:val="stBilgiChar"/>
+    <w:link w:val="HeaderChar"/>
     <w:uiPriority w:val="99"/>
     <w:unhideWhenUsed/>
     <w:rsid w:val="00D42065"/>
@@ -5316,10 +5322,10 @@
       </w:tabs>
     </w:pPr>
   </w:style>
-  <w:style w:type="paragraph" w:styleId="AltBilgi">
+  <w:style w:type="paragraph" w:styleId="Footer">
     <w:name w:val="footer"/>
     <w:basedOn w:val="Normal"/>
-    <w:link w:val="AltBilgiChar"/>
+    <w:link w:val="FooterChar"/>
     <w:uiPriority w:val="99"/>
     <w:unhideWhenUsed/>
     <w:rsid w:val="00D42065"/>

</xml_diff>

<commit_message>
Fix IEEE ara rapor layout and formatting
</commit_message>
<xml_diff>
--- a/report/ara_rapor_draft.docx
+++ b/report/ara_rapor_draft.docx
@@ -4,148 +4,241 @@
   <w:body>
     <w:p>
       <w:pPr>
+        <w:spacing w:after="120"/>
         <w:jc w:val="center"/>
       </w:pPr>
       <w:r>
-        <w:t>Normal Retina OCT Goruntulerinden Ogrenilen Konvolusyonel Autoencoder ile Patolojik Orneklerin Rekonstruksiyon Hatasi Tabanli Tespiti</w:t>
-      </w:r>
-    </w:p>
-    <w:p>
-      <w:pPr>
+        <w:rPr>
+          <w:b/>
+          <w:sz w:val="36"/>
+        </w:rPr>
+        <w:t>Normal Retina OCT Görüntülerinden Öğrenilen Konvolüsyonel Autoencoder ile Patolojik Örneklerin Rekonstrüksiyon Hatası Tabanlı Tespiti</w:t>
+      </w:r>
+    </w:p>
+    <w:p>
+      <w:pPr>
+        <w:spacing w:after="200"/>
         <w:jc w:val="center"/>
       </w:pPr>
       <w:r>
+        <w:rPr>
+          <w:sz w:val="30"/>
+        </w:rPr>
         <w:t>Reconstruction-Error-Based Detection of Pathological Retinal OCT Scans Using a Convolutional Autoencoder Trained on Normal Images</w:t>
       </w:r>
     </w:p>
-    <w:p>
-      <w:pPr>
+    <w:tbl>
+      <w:tblPr>
+        <w:tblW w:type="auto" w:w="0"/>
         <w:jc w:val="center"/>
-      </w:pPr>
-      <w:r>
-        <w:t>Yazar 1 - Bilgisayar Muhendisligi - Universite - e-posta</w:t>
-      </w:r>
-    </w:p>
-    <w:p>
-      <w:pPr>
-        <w:jc w:val="center"/>
-      </w:pPr>
-      <w:r>
-        <w:t>Yazar 2 - Bilgisayar Muhendisligi - Universite - e-posta</w:t>
-      </w:r>
-    </w:p>
+        <w:tblLayout w:type="autofit"/>
+        <w:tblLook w:firstColumn="1" w:firstRow="1" w:lastColumn="0" w:lastRow="0" w:noHBand="0" w:noVBand="1" w:val="04A0"/>
+        <w:tblBorders>
+          <w:top w:val="nil"/>
+          <w:left w:val="nil"/>
+          <w:bottom w:val="nil"/>
+          <w:right w:val="nil"/>
+          <w:insideH w:val="nil"/>
+          <w:insideV w:val="nil"/>
+        </w:tblBorders>
+      </w:tblPr>
+      <w:tblGrid>
+        <w:gridCol w:w="5219"/>
+        <w:gridCol w:w="5219"/>
+      </w:tblGrid>
+      <w:tr>
+        <w:tc>
+          <w:tcPr>
+            <w:tcW w:type="dxa" w:w="5219"/>
+          </w:tcPr>
+          <w:p>
+            <w:pPr>
+              <w:jc w:val="center"/>
+            </w:pPr>
+            <w:r>
+              <w:rPr>
+                <w:b/>
+              </w:rPr>
+              <w:t>Koray Öztürk</w:t>
+            </w:r>
+          </w:p>
+          <w:p>
+            <w:pPr>
+              <w:jc w:val="center"/>
+            </w:pPr>
+            <w:r>
+              <w:t>Bilgisayar Mühendisliği</w:t>
+            </w:r>
+          </w:p>
+          <w:p>
+            <w:pPr>
+              <w:jc w:val="center"/>
+            </w:pPr>
+            <w:r>
+              <w:t>Eskişehir Osmangazi Üniversitesi</w:t>
+            </w:r>
+          </w:p>
+          <w:p>
+            <w:pPr>
+              <w:jc w:val="center"/>
+            </w:pPr>
+            <w:r>
+              <w:t>Eskişehir/Türkiye</w:t>
+            </w:r>
+          </w:p>
+          <w:p>
+            <w:pPr>
+              <w:jc w:val="center"/>
+            </w:pPr>
+            <w:r>
+              <w:t>korayoztuurk@gmail.com</w:t>
+            </w:r>
+          </w:p>
+        </w:tc>
+        <w:tc>
+          <w:tcPr>
+            <w:tcW w:type="dxa" w:w="5219"/>
+          </w:tcPr>
+          <w:p>
+            <w:pPr>
+              <w:jc w:val="center"/>
+            </w:pPr>
+            <w:r>
+              <w:rPr>
+                <w:b/>
+              </w:rPr>
+              <w:t>Emir Alp İlhan</w:t>
+            </w:r>
+          </w:p>
+          <w:p>
+            <w:pPr>
+              <w:jc w:val="center"/>
+            </w:pPr>
+            <w:r>
+              <w:t>Bilgisayar Mühendisliği</w:t>
+            </w:r>
+          </w:p>
+          <w:p>
+            <w:pPr>
+              <w:jc w:val="center"/>
+            </w:pPr>
+            <w:r>
+              <w:t>Eskişehir Osmangazi Üniversitesi</w:t>
+            </w:r>
+          </w:p>
+          <w:p>
+            <w:pPr>
+              <w:jc w:val="center"/>
+            </w:pPr>
+            <w:r>
+              <w:t>Eskişehir/Türkiye</w:t>
+            </w:r>
+          </w:p>
+          <w:p>
+            <w:pPr>
+              <w:jc w:val="center"/>
+            </w:pPr>
+            <w:r>
+              <w:t>emiralpilhan@gmail.com</w:t>
+            </w:r>
+          </w:p>
+        </w:tc>
+      </w:tr>
+    </w:tbl>
     <w:p/>
     <w:p>
       <w:pPr>
+        <w:sectPr>
+          <w:type w:val="continuous"/>
+          <w:pgSz w:w="11906" w:h="16838"/>
+          <w:pgMar w:top="1080" w:right="734" w:bottom="2434" w:left="734" w:header="0" w:footer="0" w:gutter="0"/>
+          <w:cols w:num="1" w:space="360"/>
+          <w:formProt w:val="0"/>
+          <w:docGrid w:linePitch="360" w:charSpace="8192"/>
+        </w:sectPr>
+      </w:pPr>
+    </w:p>
+    <w:p>
+      <w:r>
+        <w:rPr>
+          <w:b/>
+        </w:rPr>
+        <w:t xml:space="preserve">Özet - </w:t>
+      </w:r>
+      <w:r>
+        <w:t>Bu çalışmada, retinal OCT görüntülerinde patolojik örnekleri etiketlenmiş patoloji sınıflarıyla doğrudan öğrenmek yerine, yalnızca normal örneklerden öğrenilen bir convolutional autoencoder ile reconstruction error tabanlı anomaly detection yaklaşımı geliştirilmiştir. Kermany OCT2017 veri kümesindeki `train/NORMAL` görüntüleri hasta bazlı olarak eğitim ve doğrulama alt kümelerine ayrılmış, model yalnızca normal anatominin dağılımını öğrenmiştir. Test aşamasında NORMAL, CNV, DME ve DRUSEN görüntüleri reconstruction error ile puanlanmış ve doğrulama normal error dağılımından elde edilen persentil eşikleriyle ikili karar üretilmiştir. Bu ara rapor sürümünde temel model 128x128 gri tonlamalı B-scan'ler üzerinde eğitilmiş, AUROC ana metrik olarak alınmış ve precision, recall, F1, accuracy ile FPR de raporlanmıştır. Gerçek OCT2017 deneyi sonunda seçilen p95 eşiğinde AUROC 0.9108 ve F1 0.8201 elde edilmiştir. Elde edilen ilk bulgular, patolojik sınıfların ortalama reconstruction error değerlerinin normal sınıfa göre sistematik olarak daha yüksek olduğunu göstermektedir.</w:t>
+      </w:r>
+    </w:p>
+    <w:p>
+      <w:r>
+        <w:rPr>
+          <w:b/>
+        </w:rPr>
+        <w:t xml:space="preserve">Abstract - </w:t>
+      </w:r>
+      <w:r>
+        <w:t>This study investigates reconstruction-error-based anomaly detection for retinal OCT images using a convolutional autoencoder trained only on normal samples. Instead of learning a supervised pathology classifier, the model learns the appearance distribution of healthy retinal anatomy from the Kermany OCT2017 dataset. The training split uses only normal scans and a patient-level validation split is used to estimate operating thresholds from normal reconstruction-error percentiles. During testing, NORMAL, CNV, DME, and DRUSEN scans are scored according to reconstruction error, and anomaly decisions are produced with validation-derived thresholds. On the real OCT2017 experiment, the selected p95 operating point reaches AUROC 0.9108 and F1-score 0.8201. These findings indicate that a normal-only autoencoder can serve as a meaningful early baseline for retinal anomaly screening.</w:t>
+      </w:r>
+    </w:p>
+    <w:p>
+      <w:r>
+        <w:rPr>
+          <w:b/>
+        </w:rPr>
+        <w:t xml:space="preserve">Anahtar Kelimeler / Keywords - </w:t>
+      </w:r>
+      <w:r>
+        <w:t>retinal OCT, anomaly detection, autoencoder, reconstruction error, medical imaging, deep learning</w:t>
+      </w:r>
+    </w:p>
+    <w:p>
+      <w:pPr>
         <w:pStyle w:val="Heading1"/>
       </w:pPr>
       <w:r>
-        <w:t>Baslik</w:t>
+        <w:t>Giriş</w:t>
+      </w:r>
+    </w:p>
+    <w:p>
+      <w:r>
+        <w:t>Retinal hastalıkların erken tespiti, geri dönüşü olmayan görme kaybını azaltmak için kritik önemdedir. Optik koherens tomografi (OCT), retina tabakalarını yüksek çözünürlükte gösterebildiği için klinik pratikte sık kullanılan bir görüntüleme yöntemidir. Ancak OCT verisinin elle yorumlanması zaman alıcı olduğu gibi, geniş tarama programlarında yüksek uzman emeği gerektirir [1]. Son yıllarda derin öğrenme tabanlı denetimli modeller OCT sınıflandırmasında güçlü sonuçlar vermiş olsa da, bunlar genellikle her patoloji için etiketli veri gerektirir [1], [3]. Bu durum, daha önce görülmemiş veya yeterince temsil edilmeyen anomalilerin tespitini zorlaştırır.</w:t>
       </w:r>
     </w:p>
     <w:p/>
     <w:p>
       <w:r>
-        <w:t>Ingilizce baslik: Reconstruction-Error-Based Detection of Pathological Retinal OCT Scans Using a Convolutional Autoencoder Trained on Normal Images</w:t>
+        <w:t>Bu projede problem, normal anatominin öğrenilmesi ve ondan sapmaların reconstruction error ile yakalanması olarak ele alınmıştır. Ara rapor kapsamındaki amacımız, yalnızca normal retina OCT görüntüleri ile eğitilen bir convolutional autoencoder'in patolojik test görüntülerini anlamlı biçimde ayrıştırabildiğini gösteren, tekrar üretilebilir bir baseline sistem kurmaktır. Bu çalışmada, hasta-bazlı doğrulama, doğrulama dağılımından türetilen eşik seçimi ve gerçek OCT verisiyle uçtan uca çalışan bir deney hattını içeren tekrar üretilebilir bir baseline sistem sunulmuştur.</w:t>
+      </w:r>
+    </w:p>
+    <w:p>
+      <w:pPr>
+        <w:pStyle w:val="Heading1"/>
+      </w:pPr>
+      <w:r>
+        <w:t>İlgili Çalışmalar</w:t>
+      </w:r>
+    </w:p>
+    <w:p>
+      <w:r>
+        <w:t>OCT alanında derin öğrenme tabanlı hastalık sınıflandırması için en çok atıf alan çalışmalardan biri Kermany ve ark. tarafından sunulan Cell 2018 makalesidir [1]. Bu çalışma, aynı zamanda bu projede kullanılan halka açık OCT veri kümesinin temellerini de oluşturmaktadır [2]. Literatürde bunun devamında çok sayıda denetimli retinal hastalık tespit modeli önerilmiş ve OCT'nin otomatik analiz için uygunluğu güçlü biçimde ortaya konmuştur [3].</w:t>
       </w:r>
     </w:p>
     <w:p/>
     <w:p>
-      <w:pPr>
-        <w:pStyle w:val="Heading1"/>
-      </w:pPr>
-      <w:r>
-        <w:t>Ozet</w:t>
+      <w:r>
+        <w:t>Anomaly detection literatüründe ise normal veriyle eğitim yapıp anomalileri dağılım dışı örnekler olarak ele alan reconstructive ve adversarial yöntemler ön plana çıkmıştır. AnoGAN [4] ve GANomaly [5] gibi yaklaşımlar normal dağılımı modelleme mantığını sistematikleştirmiştir. DRAEM [6] ve ProxyAno [8] ise reconstruction tabanlı yapıların daha ayırt edici hale gelmesine odaklanmıştır. Retinal OCT özelinde Seebock ve ark. [7], Luo ve ark. [9] ve Wang ve ark. [10] gibi çalışmalar bu alanın artık yalnızca genel anomaly detection değil, retina anatomisine özel çözümler de gerektirdiğini göstermektedir.</w:t>
       </w:r>
     </w:p>
     <w:p/>
     <w:p>
       <w:r>
-        <w:t>Bu calismada, retinal OCT goruntulerinde patolojik ornekleri etiketlenmis patoloji siniflariyla dogrudan ogrenmek yerine, yalnizca normal orneklerden ogrenilen bir convolutional autoencoder ile reconstruction error tabanli anomaly detection yaklasimi gelistirilmistir. Kermany OCT2017 veri kumesindeki train/NORMAL goruntuleri hasta bazli olarak egitim ve validation alt kumelerine ayrilmis, model yalnizca normal anatominin dagilimini ogrenmistir. Test asamasinda NORMAL, CNV, DME ve DRUSEN goruntuleri reconstruction error ile puanlanmis ve validation normal error dagilimindan elde edilen percentil esikleriyle ikili karar uretilmistir. Bu ara rapor surumunde temel model 128x128 gri tonlamali B-scan'ler uzerinde egitilmis, AUROC ana metrik olarak alinmis ve precision, recall, F1, accuracy ile FPR de raporlanmistir. Gercek OCT2017 deneyi sonunda secilen p95 esiginde AUROC 0.9108 ve F1 0.8201 elde edilmistir. Elde edilen ilk bulgular, patolojik siniflarin ortalama reconstruction error degerlerinin normal sinifa gore sistematik olarak daha yuksek oldugunu gostermektedir.</w:t>
+        <w:t>Kim ne yapmış ve bu proje neyi farklı yapıyor sorusunu daha açık göstermek için Tablo 1 verilmiştir.</w:t>
       </w:r>
     </w:p>
     <w:p/>
     <w:p>
-      <w:pPr>
-        <w:pStyle w:val="Heading1"/>
-      </w:pPr>
-      <w:r>
-        <w:t>Abstract</w:t>
-      </w:r>
-    </w:p>
-    <w:p/>
-    <w:p>
-      <w:r>
-        <w:t>This study investigates reconstruction-error-based anomaly detection for retinal OCT images using a convolutional autoencoder trained only on normal samples. Instead of learning a supervised pathology classifier, the model learns the appearance distribution of healthy retinal anatomy from the Kermany OCT2017 dataset. The training split uses only normal scans and a patient-level validation split is used to estimate operating thresholds from normal reconstruction-error percentiles. During testing, NORMAL, CNV, DME, and DRUSEN scans are scored according to reconstruction error, and anomaly decisions are produced with validation-derived thresholds. On the real OCT2017 experiment, the selected p95 operating point reaches AUROC 0.9108 and F1-score 0.8201. These findings indicate that a normal-only autoencoder can serve as a meaningful early baseline for retinal anomaly screening.</w:t>
-      </w:r>
-    </w:p>
-    <w:p/>
-    <w:p>
-      <w:pPr>
-        <w:pStyle w:val="Heading1"/>
-      </w:pPr>
-      <w:r>
-        <w:t>Anahtar Kelimeler / Keywords</w:t>
-      </w:r>
-    </w:p>
-    <w:p/>
-    <w:p>
-      <w:r>
-        <w:t>retinal OCT, anomaly detection, autoencoder, reconstruction error, medical imaging, deep learning</w:t>
-      </w:r>
-    </w:p>
-    <w:p/>
-    <w:p>
-      <w:pPr>
-        <w:pStyle w:val="Heading1"/>
-      </w:pPr>
-      <w:r>
-        <w:t>1. Giris</w:t>
-      </w:r>
-    </w:p>
-    <w:p/>
-    <w:p>
-      <w:r>
-        <w:t>Retinal hastaliklarin erken tespiti, geri donulmez gorme kaybini azaltmak icin kritik onemdedir. Optik koherens tomografi (OCT), retina tabakalarini yuksek cozunurlukte gosterebildigi icin klinik pratikte sik kullanilan bir goruntuleme yontemidir. Ancak OCT verisinin elle yorumlanmasi zaman alici oldugu gibi, genis tarama programlarinda yuksek uzman emegi gerektirir [1]. Son yillarda derin ogrenme tabanli denetimli modeller OCT siniflandirmasinda guclu sonuclar vermis olsa da, bunlar genellikle her patoloji icin etiketli veri gerektirir [1], [3]. Bu durum, daha once gorulmemis veya yeterince temsil edilmeyen anomalilerin tespitini zorlastirir.</w:t>
-      </w:r>
-    </w:p>
-    <w:p/>
-    <w:p>
-      <w:r>
-        <w:t>Bu projede problem, normal anatominin ogrenilmesi ve ondan sapmalarin reconstruction error ile yakalanmasi olarak ele alinmistir. Ara rapor kapsamindaki amacimiz, yalnizca normal retina OCT goruntuleri ile egitilen bir convolutional autoencoder'in patolojik test goruntulerini anlamli bicimde ayristirabildigini gosteren, tekrar uretilebilir bir baseline sistem kurmaktir. Bu calismanin farki; patient-level validation, validation-derived threshold secimi ve gercek OCT verisiyle uctan uca calisan deney boru hattini ayni raporda birlestirmesidir.</w:t>
-      </w:r>
-    </w:p>
-    <w:p/>
-    <w:p>
-      <w:pPr>
-        <w:pStyle w:val="Heading1"/>
-      </w:pPr>
-      <w:r>
-        <w:t>2. Ilgili Calismalar</w:t>
-      </w:r>
-    </w:p>
-    <w:p/>
-    <w:p>
-      <w:r>
-        <w:t>OCT alaninda derin ogrenme tabanli hastalik siniflandirmasi icin en cok atif alan calismalardan biri Kermany ve ark. tarafindan sunulan Cell 2018 makalesidir [1]. Bu calisma, ayni zamanda bu projede kullanilan halka acik OCT veri kumesinin temellerini de olusturmaktadir [2]. Literaturde bunun devaminda cok sayida denetimli retinal hastalik tespit modeli onerilmis ve OCT'nin otomatik analiz icin uygunlugu guclu bicimde ortaya konmustur [3].</w:t>
-      </w:r>
-    </w:p>
-    <w:p/>
-    <w:p>
-      <w:r>
-        <w:t>Anomaly detection literaturunde ise normal veriyle egitim yapip anomalileri dagilim disi ornekler olarak ele alan reconstructive ve adversarial yontemler on plana cikmistir. AnoGAN [4] ve GANomaly [5] gibi yaklasimlar normal dagilimi modelleme mantigini sistematiklestirmistir. DRAEM [6] ve ProxyAno [8] ise reconstruction tabanli yapilarin daha ayirt edici hale gelmesine odaklanmistir. Retinal OCT ozelinde Seebock ve ark. [7], Luo ve ark. [9] ve Wang ve ark. [10] gibi calismalar bu alanin artik yalnizca genel anomaly detection degil, retina anatomisine ozel cozumler de gerektirdigini gostermektedir.</w:t>
-      </w:r>
-    </w:p>
-    <w:p/>
-    <w:p>
-      <w:r>
-        <w:t>Kim ne yapmis ve bu proje neyi farkli yapiyor sorusunu daha acik gostermek icin Tablo 1 verilmistir.</w:t>
-      </w:r>
-    </w:p>
-    <w:p/>
-    <w:p>
-      <w:r>
-        <w:t>Tablo 1. Ilgili calismalar ve bu projeden farklari.</w:t>
+      <w:r>
+        <w:t>Tablo 1. İlgili çalışmalar ve bu projeden farkları.</w:t>
       </w:r>
     </w:p>
     <w:p/>
@@ -166,7 +259,7 @@
           </w:tcPr>
           <w:p>
             <w:r>
-              <w:t>study</w:t>
+              <w:t>çalışma</w:t>
             </w:r>
           </w:p>
         </w:tc>
@@ -176,7 +269,7 @@
           </w:tcPr>
           <w:p>
             <w:r>
-              <w:t>focus</w:t>
+              <w:t>odak</w:t>
             </w:r>
           </w:p>
         </w:tc>
@@ -186,7 +279,7 @@
           </w:tcPr>
           <w:p>
             <w:r>
-              <w:t>difference</w:t>
+              <w:t>fark</w:t>
             </w:r>
           </w:p>
         </w:tc>
@@ -208,7 +301,7 @@
           </w:tcPr>
           <w:p>
             <w:r>
-              <w:t>Supervised OCT classification</w:t>
+              <w:t>Denetimli OCT sınıflandırması</w:t>
             </w:r>
           </w:p>
         </w:tc>
@@ -218,7 +311,7 @@
           </w:tcPr>
           <w:p>
             <w:r>
-              <w:t>Requires pathology labels, unlike our normal-only anomaly setting.</w:t>
+              <w:t>Patoloji etiketleri gerektirir; bizim yaklaşımımız yalnızca normal görüntülerle anomaly detection yapar.</w:t>
             </w:r>
           </w:p>
         </w:tc>
@@ -240,7 +333,7 @@
           </w:tcPr>
           <w:p>
             <w:r>
-              <w:t>GAN-based anomaly detection</w:t>
+              <w:t>GAN tabanlı anomali tespiti</w:t>
             </w:r>
           </w:p>
         </w:tc>
@@ -250,7 +343,7 @@
           </w:tcPr>
           <w:p>
             <w:r>
-              <w:t>General anomaly detection reference, not retinal OCT-specific.</w:t>
+              <w:t>Genel amaçlı anomaly detection yaklaşımıdır; retinal OCT’ye özgü değildir.</w:t>
             </w:r>
           </w:p>
         </w:tc>
@@ -272,7 +365,7 @@
           </w:tcPr>
           <w:p>
             <w:r>
-              <w:t>Uncertainty-based OCT anomaly detection</w:t>
+              <w:t>Belirsizlik tabanlı OCT anomali tespiti</w:t>
             </w:r>
           </w:p>
         </w:tc>
@@ -282,7 +375,7 @@
           </w:tcPr>
           <w:p>
             <w:r>
-              <w:t>Uses anatomy segmentation uncertainty instead of direct reconstruction error.</w:t>
+              <w:t>Doğrudan rekonstrüksiyon hatası yerine anatomi segmentasyonu belirsizliği kullanır.</w:t>
             </w:r>
           </w:p>
         </w:tc>
@@ -304,7 +397,7 @@
           </w:tcPr>
           <w:p>
             <w:r>
-              <w:t>Multi-resolution retinal autoencoder</w:t>
+              <w:t>Çok çözünürlüklü retinal autoencoder</w:t>
             </w:r>
           </w:p>
         </w:tc>
@@ -314,7 +407,7 @@
           </w:tcPr>
           <w:p>
             <w:r>
-              <w:t>More advanced retinal anomaly model; our work is a simpler reproducible baseline.</w:t>
+              <w:t>Daha gelişmiş retinal anomali modeli önerir; bizim çalışmamız ise daha sade ve tekrar üretilebilir bir baseline sunar.</w:t>
             </w:r>
           </w:p>
         </w:tc>
@@ -326,7 +419,7 @@
           </w:tcPr>
           <w:p>
             <w:r>
-              <w:t>This project</w:t>
+              <w:t>Bu proje</w:t>
             </w:r>
           </w:p>
         </w:tc>
@@ -336,7 +429,7 @@
           </w:tcPr>
           <w:p>
             <w:r>
-              <w:t>Normal-only OCT anomaly scoring</w:t>
+              <w:t>Normal-only OCT anomali puanlaması</w:t>
             </w:r>
           </w:p>
         </w:tc>
@@ -346,19 +439,32 @@
           </w:tcPr>
           <w:p>
             <w:r>
-              <w:t>Patient-level validation split and percentile-based threshold selection on real OCT2017.</w:t>
+              <w:t>Patient-level validation split ve gerçek OCT2017 verisi üzerinde percentile tabanlı threshold seçimi içerir.</w:t>
             </w:r>
           </w:p>
         </w:tc>
       </w:tr>
     </w:tbl>
+    <w:p>
+      <w:pPr>
+        <w:pStyle w:val="Heading1"/>
+      </w:pPr>
+      <w:r>
+        <w:t>Yöntem</w:t>
+      </w:r>
+    </w:p>
+    <w:p>
+      <w:pPr>
+        <w:pStyle w:val="Heading2"/>
+      </w:pPr>
+      <w:r>
+        <w:t>Veri kümesi ve bölme stratejisi</w:t>
+      </w:r>
+    </w:p>
     <w:p/>
     <w:p>
-      <w:pPr>
-        <w:pStyle w:val="Heading1"/>
-      </w:pPr>
-      <w:r>
-        <w:t>3. Yontem</w:t>
+      <w:r>
+        <w:t>Çalışmada Kermany OCT2017 veri kümesinin `train` ve `test` klasörleri esas alınmıştır [2]. Eğitimde yalnızca `train/NORMAL` altındaki görüntüler kullanılmıştır. Validation bölmesi image-level değil patient-level olarak yapılmıştır; böylece aynı hastaya ait görüntüler train ve validation alt kümelerine aynı anda düşmemiştir. Hasta kimlikleri, veri kümesindeki dosya adlarında yer alan `hastalık-hastaID-görüntüNo` yapısından ayrıştırılmıştır. Test aşamasında `test/NORMAL`, `test/CNV`, `test/DME` ve `test/DRUSEN` görüntüleri birlikte değerlendirilmiş, NORMAL sınıfı 0 ve diğer tüm sınıflar anomaly etiketi 1 olarak ele alınmıştır.</w:t>
       </w:r>
     </w:p>
     <w:p/>
@@ -367,13 +473,13 @@
         <w:pStyle w:val="Heading2"/>
       </w:pPr>
       <w:r>
-        <w:t>3.1 Veri kumesi ve bolme stratejisi</w:t>
+        <w:t>Ön işleme</w:t>
       </w:r>
     </w:p>
     <w:p/>
     <w:p>
       <w:r>
-        <w:t>Calismada Kermany OCT2017 veri kumesinin `train` ve `test` klasorleri esas alinmistir [2]. Egitimde yalnizca `train/NORMAL` altindaki goruntuler kullanilmistir. Validation bolmesi image-level degil patient-level olarak yapilmistir; boylece ayni hastaya ait goruntuler train ve validation alt kumelerine ayni anda dusmemistir. Test asamasinda `test/NORMAL`, `test/CNV`, `test/DME` ve `test/DRUSEN` goruntuleri birlikte degerlendirilmis, NORMAL sinifi 0 ve diger tum siniflar anomaly etiketi 1 olarak ele alinmistir.</w:t>
+        <w:t>Tüm görüntüler tek kanallı gri tonlamaya dönüştürülmüş, `128x128` boyutuna yeniden örneklenmiş ve `[0, 1]` aralığına normalize edilmiştir. Bu ara sürümde agresif augmentation uygulanmamıştır; amacımız önce sade ve tekrarlanabilir bir baseline kurmaktır.</w:t>
       </w:r>
     </w:p>
     <w:p/>
@@ -382,13 +488,13 @@
         <w:pStyle w:val="Heading2"/>
       </w:pPr>
       <w:r>
-        <w:t>3.2 On isleme</w:t>
+        <w:t>Model mimarisi</w:t>
       </w:r>
     </w:p>
     <w:p/>
     <w:p>
       <w:r>
-        <w:t>Tum goruntuler tek kanalli gri tonlamaya donusturulmus, `128x128` boyutuna yeniden orneklenmis ve `[0, 1]` araligina normalize edilmistir. Bu ara surumde agresif augmentation uygulanmamistir; amacimiz once sade ve tekrarlanabilir bir baseline kurmaktir.</w:t>
+        <w:t>Model, dört aşamalı bir convolutional encoder-decoder yapısından oluşmaktadır. Encoder kısmı `1-&gt;32-&gt;64-&gt;128-&gt;256` kanal geçişleri ve max-pooling adımlarıyla görüntüyü sıkıştırırken, ara latent temsil `128` boyutlu bir vektöre indirgenmiştir. Decoder kısmı transpose convolution blokları ile görüntüyü tekrar `128x128` boyutuna taşımaktadır. Çıkış katmanında sigmoid kullanılarak normalize pikseller üzerinde reconstruction üretilmiştir.</w:t>
       </w:r>
     </w:p>
     <w:p/>
@@ -397,13 +503,13 @@
         <w:pStyle w:val="Heading2"/>
       </w:pPr>
       <w:r>
-        <w:t>3.3 Model mimarisi</w:t>
+        <w:t>Eğitim ve eşikleme</w:t>
       </w:r>
     </w:p>
     <w:p/>
     <w:p>
       <w:r>
-        <w:t>Model, dort asamali bir convolutional encoder-decoder yapisindan olusmaktadir. Encoder kismi 1-&gt;32-&gt;64-&gt;128-&gt;256 kanal gecisleri ve max-pooling adimlariyla goruntuyu sikistirirken, ara latent temsil `128` boyutlu bir vektore indirgenmistir. Decoder kismi transpose convolution bloklari ile goruntuyu tekrar 128x128 boyutuna tasimaktadir. Cikis katmaninda sigmoid kullanilarak normalize pikseller uzerinde reconstruction uretilmistir.</w:t>
+        <w:t>Model `Adam` optimizer ve `MSE` reconstruction loss ile eğitilmiştir. En fazla `40` epoch ve `8` patience değerli early stopping kullanılmıştır. Validation aşamasında yalnızca normal örneklerin reconstruction error dağılımı incelenmiş; p95, p97 ve p99 eşikleri hesaplanmıştır. Ana operasyon noktası olarak p95 seçilmiştir. Böylece threshold seçiminde test verisi kullanılmamış ve leakage engellenmiştir.</w:t>
       </w:r>
     </w:p>
     <w:p/>
@@ -412,28 +518,13 @@
         <w:pStyle w:val="Heading2"/>
       </w:pPr>
       <w:r>
-        <w:t>3.4 Egitim ve esikleme</w:t>
+        <w:t>Değerlendirme ölçütleri ve deney kurulumu</w:t>
       </w:r>
     </w:p>
     <w:p/>
     <w:p>
       <w:r>
-        <w:t>Model `Adam` optimizer ve `MSE` reconstruction loss ile egitilmistir. En fazla `40` epoch ve `8` patience degerli early stopping kullanilmistir. Validation asamasinda yalnizca normal orneklerin reconstruction error dagilimi incelenmis; p95, p97 ve p99 esikleri hesaplanmistir. Ana operasyon noktasi olarak p95 secilmistir. Boylece threshold seciminde test verisi kullanilmamis ve leakage engellenmistir.</w:t>
-      </w:r>
-    </w:p>
-    <w:p/>
-    <w:p>
-      <w:pPr>
-        <w:pStyle w:val="Heading2"/>
-      </w:pPr>
-      <w:r>
-        <w:t>3.5 Degerlendirme olcutleri ve deney kurulumu</w:t>
-      </w:r>
-    </w:p>
-    <w:p/>
-    <w:p>
-      <w:r>
-        <w:t>Ana basari olcutu olarak AUROC secilmistir; cunku anomaly detection senaryosunda threshold'dan bagimsiz ayristirma gucunu yansitir. Bunun yaninda accuracy, precision, recall, F1 ve false positive rate de raporlanmistir. Precision ve recall birlikte yorumlanmis, F1 ise dengeli operasyon noktasi seciminde kullanilmistir. Gercek deney kosusu yaklasik 109.7 dakika surmus ve en iyi validation sonucu 37. epoch'ta elde edilmistir. Deney kurulumu Tablo 2'de ozetlenmistir.</w:t>
+        <w:t>Ana başarı ölçütü olarak AUROC seçilmiştir; çünkü anomaly detection senaryosunda threshold'dan bağımsız ayrıştırma gücünü yansıtır. Bunun yanında accuracy, precision, recall, F1 ve false positive rate de raporlanmıştır. Precision ve recall birlikte yorumlanmış, F1 ise dengeli operasyon noktası seçiminde kullanılmıştır. Gerçek deney koşusu yaklaşık 109.7 dakika sürmüş ve en iyi validation sonucu 37. epoch'ta elde edilmiştir. Deney, NVIDIA GeForce RTX 4060 Laptop GPU içeren yerel bir PyTorch ortamında yürütülmüştür. Deney kurulumu Tablo 2'de özetlenmiştir.</w:t>
       </w:r>
     </w:p>
     <w:p/>
@@ -459,7 +550,7 @@
           </w:tcPr>
           <w:p>
             <w:r>
-              <w:t>setting</w:t>
+              <w:t>ayar</w:t>
             </w:r>
           </w:p>
         </w:tc>
@@ -469,7 +560,7 @@
           </w:tcPr>
           <w:p>
             <w:r>
-              <w:t>value</w:t>
+              <w:t>değer</w:t>
             </w:r>
           </w:p>
         </w:tc>
@@ -481,7 +572,7 @@
           </w:tcPr>
           <w:p>
             <w:r>
-              <w:t>Train data</w:t>
+              <w:t>Eğitim verisi</w:t>
             </w:r>
           </w:p>
         </w:tc>
@@ -491,7 +582,7 @@
           </w:tcPr>
           <w:p>
             <w:r>
-              <w:t>40715 NORMAL images</w:t>
+              <w:t>40715 NORMAL görüntü</w:t>
             </w:r>
           </w:p>
         </w:tc>
@@ -503,7 +594,7 @@
           </w:tcPr>
           <w:p>
             <w:r>
-              <w:t>Validation data</w:t>
+              <w:t>Doğrulama verisi</w:t>
             </w:r>
           </w:p>
         </w:tc>
@@ -513,7 +604,7 @@
           </w:tcPr>
           <w:p>
             <w:r>
-              <w:t>10425 NORMAL images</w:t>
+              <w:t>10425 NORMAL görüntü</w:t>
             </w:r>
           </w:p>
         </w:tc>
@@ -525,7 +616,7 @@
           </w:tcPr>
           <w:p>
             <w:r>
-              <w:t>Test data</w:t>
+              <w:t>Test verisi</w:t>
             </w:r>
           </w:p>
         </w:tc>
@@ -535,7 +626,7 @@
           </w:tcPr>
           <w:p>
             <w:r>
-              <w:t>1000 images</w:t>
+              <w:t>1000 görüntü</w:t>
             </w:r>
           </w:p>
         </w:tc>
@@ -547,7 +638,7 @@
           </w:tcPr>
           <w:p>
             <w:r>
-              <w:t>Input size</w:t>
+              <w:t>Giriş boyutu</w:t>
             </w:r>
           </w:p>
         </w:tc>
@@ -557,7 +648,7 @@
           </w:tcPr>
           <w:p>
             <w:r>
-              <w:t>128x128 grayscale</w:t>
+              <w:t>128x128 gri seviye</w:t>
             </w:r>
           </w:p>
         </w:tc>
@@ -569,7 +660,7 @@
           </w:tcPr>
           <w:p>
             <w:r>
-              <w:t>Latent dimension</w:t>
+              <w:t>Latent boyut</w:t>
             </w:r>
           </w:p>
         </w:tc>
@@ -591,7 +682,7 @@
           </w:tcPr>
           <w:p>
             <w:r>
-              <w:t>Optimizer</w:t>
+              <w:t>Optimizasyon</w:t>
             </w:r>
           </w:p>
         </w:tc>
@@ -613,7 +704,7 @@
           </w:tcPr>
           <w:p>
             <w:r>
-              <w:t>Max epochs / patience</w:t>
+              <w:t>Maks epoch / patience</w:t>
             </w:r>
           </w:p>
         </w:tc>
@@ -635,7 +726,7 @@
           </w:tcPr>
           <w:p>
             <w:r>
-              <w:t>Selected threshold</w:t>
+              <w:t>Seçilen eşik</w:t>
             </w:r>
           </w:p>
         </w:tc>
@@ -657,7 +748,7 @@
           </w:tcPr>
           <w:p>
             <w:r>
-              <w:t>Training duration</w:t>
+              <w:t>Eğitim süresi</w:t>
             </w:r>
           </w:p>
         </w:tc>
@@ -667,7 +758,7 @@
           </w:tcPr>
           <w:p>
             <w:r>
-              <w:t>109.7 minutes</w:t>
+              <w:t>109.7 dakika</w:t>
             </w:r>
           </w:p>
         </w:tc>
@@ -679,28 +770,26 @@
         <w:pStyle w:val="Heading2"/>
       </w:pPr>
       <w:r>
-        <w:t>3.6 Sistem akisi</w:t>
+        <w:t>Sistem akışı</w:t>
       </w:r>
     </w:p>
     <w:p/>
     <w:p>
       <w:r>
-        <w:t>Onerilen is akisi bes adimdan olusmaktadir: normal verinin secilmesi, on isleme, autoencoder egitimi, validation error dagilimindan esik secimi ve testte anomaly scoring. Raporun sonundaki Sekil 1 bu boru hattini gorsel olarak ozetlemektedir. Bu sema, odevde istenen sistem mimarisi beklentisini karsilamak icin eklenmistir.</w:t>
-      </w:r>
-    </w:p>
-    <w:p/>
+        <w:t>Önerilen iş akışı beş adımdan oluşmaktadır: normal verinin seçilmesi, ön işleme, autoencoder eğitimi, validation error dağılımından eşik seçimi ve testte anomaly scoring. Raporun sonundaki Şekil 1 bu boru hattını görsel olarak özetlemektedir. Bu şema, ödevde istenen sistem mimarisi beklentisini karşılamak için eklenmiştir.</w:t>
+      </w:r>
+    </w:p>
     <w:p>
       <w:pPr>
         <w:pStyle w:val="Heading1"/>
       </w:pPr>
       <w:r>
-        <w:t>4. Ara Sonuclar</w:t>
-      </w:r>
-    </w:p>
-    <w:p/>
-    <w:p>
-      <w:r>
-        <w:t>Bu ara raporda uretilen temel ciktilar; egitim/validation loss grafigi, validation reconstruction error histogrami, test error dagilimi, ROC curve, confusion matrix ve ornek reconstruction-residual goruntuleridir. Deney sonunda secilen p95 esiginde elde edilen metrikler asagidaki gibidir:</w:t>
+        <w:t>Ara Sonuçlar</w:t>
+      </w:r>
+    </w:p>
+    <w:p>
+      <w:r>
+        <w:t>Bu ara raporda üretilen temel çıktılar; eğitim/validation loss grafiği, validation reconstruction error histogramı, test error dağılımı, ROC curve, confusion matrix ve örnek reconstruction-residual görüntüleridir. Deney sonunda seçilen p95 eşiğinde elde edilen metrikler aşağıdaki gibidir:</w:t>
       </w:r>
     </w:p>
     <w:p/>
@@ -730,7 +819,7 @@
           </w:tcPr>
           <w:p>
             <w:r>
-              <w:t>Deger</w:t>
+              <w:t>Değer</w:t>
             </w:r>
           </w:p>
         </w:tc>
@@ -915,7 +1004,7 @@
     <w:p/>
     <w:p>
       <w:r>
-        <w:t>Validation percentil esikleri:</w:t>
+        <w:t>Validation persentil eşikleri:</w:t>
       </w:r>
     </w:p>
     <w:p/>
@@ -1266,7 +1355,7 @@
     <w:p/>
     <w:p>
       <w:r>
-        <w:t>Sinif bazli reconstruction error ozeti:</w:t>
+        <w:t>Sınıf bazlı reconstruction error özeti:</w:t>
       </w:r>
     </w:p>
     <w:p/>
@@ -1546,7 +1635,7 @@
     <w:p/>
     <w:p>
       <w:r>
-        <w:t>Veri bolme ozeti:</w:t>
+        <w:t>Veri bölme özeti:</w:t>
       </w:r>
     </w:p>
     <w:p/>
@@ -1859,150 +1948,154 @@
     <w:p/>
     <w:p>
       <w:r>
-        <w:t>Sonuclar yalnizca tablo duzeyinde degil, yorum duzeyinde de anlamlidir. p95 esigi p97 ve p99'a gore daha yuksek recall ve F1 vermistir; bu nedenle ara rapor icin daha dengeli operasyon noktasi olarak secilmistir. CNV ve DME siniflari NORMAL goruntulerden belirgin sekilde ayrisirken, DRUSEN sinifinin error dagilimi normale daha yakindir. Bu durum, bazi patolojilerin reconstruction tabanli yaklasimlarda digerlerine gore daha zor ayristigini gostermektedir.</w:t>
+        <w:t>Sonuçlar yalnızca tablo düzeyinde değil, yorum düzeyinde de anlamlıdır. p95 eşiği p97 ve p99'a göre daha yüksek recall ve F1 vermiştir; bu nedenle ara rapor için daha dengeli operasyon noktası olarak seçilmiştir. CNV ve DME sınıfları NORMAL görüntülerden belirgin şekilde ayrışırken, DRUSEN sınıfının error dağılımı normale daha yakındır. Bu durum, bazı patolojilerin reconstruction tabanlı yaklaşımlarda diğerlerine göre daha zor ayrıştığını göstermektedir.</w:t>
       </w:r>
     </w:p>
     <w:p/>
     <w:p>
       <w:r>
-        <w:t>Rapor sonunda verilen Sekil 2, egitim egrisi, ROC performansi, error dagilimi ve reconstruction orneklerini bir araya getirerek ara sonuclarin gorsel ozetini sunmaktadir.</w:t>
+        <w:t>Rapor sonunda verilen Şekil 2, eğitim eğrisi, ROC performansı, error dağılımı ve reconstruction örneklerini bir araya getirerek ara sonuçların görsel özetini sunmaktadır.</w:t>
+      </w:r>
+    </w:p>
+    <w:p>
+      <w:pPr>
+        <w:pStyle w:val="Heading1"/>
+      </w:pPr>
+      <w:r>
+        <w:t>Tartışma</w:t>
+      </w:r>
+    </w:p>
+    <w:p>
+      <w:r>
+        <w:t>Baseline model, görece basit olmasına rağmen normal anatomi dağılımını öğrenerek patolojik sınıfların reconstruction error değerlerini yükseltebilmektedir. Bununla birlikte reconstruction tabanlı yöntemlerin iyi bilinen bir sınırı vardır: güçlü decoder yapıları bazen anomalileri de fazla iyi yeniden üretebilir [4], [8]. Kermany veri kümesi image-level etiketler içerir; bu nedenle lokal lesion segmentasyonu için doğrudan pixel-level ground truth bulunmamaktadır. Ayrıca threshold seçiminin precision-recall dengesi üzerinde güçlü etkisi vardır. Bu nedenle tek bir metrik yerine percentile bazlı karşılaştırma tablosu korunmuştur.</w:t>
       </w:r>
     </w:p>
     <w:p/>
     <w:p>
+      <w:r>
+        <w:t>Hesaplama maliyeti de göz ardı edilemez. Eğitim koşusu yerel ortamda uzun sayılabilecek bir sürede tamamlanmıştır ve bu durum veri yükleme ile ön işleme hattının da iyileştirme alanı olduğunu göstermektedir. Dolayısıyla mevcut sistem klinik kullanımdan ziyade araştırma ve erken tarama mantığında değerlendirilmelidir.</w:t>
+      </w:r>
+    </w:p>
+    <w:p>
       <w:pPr>
         <w:pStyle w:val="Heading1"/>
       </w:pPr>
       <w:r>
-        <w:t>5. Tartisma</w:t>
+        <w:t>Gelecek Çalışmalar</w:t>
+      </w:r>
+    </w:p>
+    <w:p>
+      <w:r>
+        <w:t>Final aşamada ilk geliştirme ekseni, mimari seviyesinde daha güçlü reconstruction modellerinin denenmesi olacaktır. Standart convolutional autoencoder yerine VAE, skip-connection içeren daha derin encoder-decoder yapıları veya memory-augmented reconstruction modelleri uygulanabilir. Bu sayede modelin normal anatomi dağılımını daha zengin bir latent temsille öğrenmesi ve özellikle sınıra yakın patolojik örneklerde daha ayırt edici reconstruction error üretmesi hedeflenmektedir. Buna ek olarak yalnızca MSE yerine L1, SSIM tabanlı kayıplar veya birleşik loss fonksiyonları denenerek yeniden oluşturma kalitesi ile anomaly sensitivity arasındaki denge incelenebilir.</w:t>
       </w:r>
     </w:p>
     <w:p/>
     <w:p>
       <w:r>
-        <w:t>Baseline model, gorece basit olmasina ragmen normal anatomi dagilimini ogrenerek patolojik siniflarin reconstruction error degerlerini yukseltebilmektedir. Bununla birlikte reconstruction tabanli yontemlerin iyi bilinen bir siniri vardir: guclu decoder yapilari bazen anomalileri de fazla iyi yeniden uretebilir [4], [8]. Kermany veri kumesi image-level etiketler icerir; bu nedenle lokal lesion segmentasyonu icin dogrudan pixel-level ground truth bulunmamaktadir. Ayrica threshold seciminin precision-recall dengesi uzerinde guclu etkisi vardir. Bu nedenle tek bir metrik yerine percentile bazli karsilastirma tablosu korunmustur.</w:t>
+        <w:t>İkinci geliştirme ekseni, veri ve deney tasarımı tarafında planlanmaktadır. Daha yüksek giriş çözünürlüğü ile deney yapılarak ince retinal yapıların ve özellikle DRUSEN gibi daha zor ayrıştırılan sınıfların model tarafından daha iyi temsil edilip edilmediği test edilecektir. Bunun yanında latent boyut, batch size, threshold seçimi ve image size gibi hiperparametreler sistematik bir ablation çalışması ile karşılaştırılacaktır. Böylece final raporda yalnızca tek bir model sonucu değil, tasarım kararlarının performansa etkisini gösteren daha akademik bir deney tablosu sunulabilecektir.</w:t>
       </w:r>
     </w:p>
     <w:p/>
     <w:p>
       <w:r>
-        <w:t>Hesaplama maliyeti de goz ardi edilemez. Egitim kosusu yerel ortamda uzun sayilabilecek bir surede tamamlanmistir ve bu durum veri yukleme ile on isleme hattinin da iyilestirme alani oldugunu gostermektedir. Dolayisiyla mevcut sistem klinik kullanimdan ziyade arastirma ve erken tarama mantiginda degerlendirilmelidir.</w:t>
+        <w:t>Üçüncü geliştirme ekseni, yorumlanabilirlik ve klinik anlamlandırma üzerine kurulacaktır. Mevcut residual map çıktıları daha detaylı incelenerek hata haritalarının retina üzerindeki hangi bölgelerde yoğunlaştığı analiz edilebilir. Eğer rekonstrüksiyon hatası belirli anatomik bozulmalarla tutarlı biçimde eşleşirse, modelin yalnızca sayısal anomaly skor üreten bir kara kutu olmaktan çıkması ve klinik olarak daha anlamlı hale gelmesi sağlanabilir. Bu nedenle final aşamada residual map görselleştirmeleri, en iyi ve en kötü örneklerin ayrı sunulması ve sınıf bazlı hata desenlerinin nitel olarak tartışılması planlanmaktadır.</w:t>
       </w:r>
     </w:p>
     <w:p/>
     <w:p>
+      <w:r>
+        <w:t>Son olarak, hesaplama verimliliği ve karşılaştırmalı değerlendirme de gelecekteki temel adımlardan biridir. Veri yükleme hattının hızlandırılması, daha uygun batch boyutlarının seçilmesi ve eğitim süresinin optimize edilmesi ile tekrarlı deneyler daha verimli hale getirilecektir. Mevcut baseline sonucunun yanına en az bir geliştirilmiş model eklenerek AE ile geliştirilmiş varyantın AUROC, F1, recall ve FPR açısından doğrudan karşılaştırılması hedeflenmektedir. Bu geliştirmeler tamamlandığında proje, ara rapor seviyesindeki çalışan baseline'dan, karşılaştırmalı ve daha güçlü bir final proje yapısına taşınmış olacaktır.</w:t>
+      </w:r>
+    </w:p>
+    <w:p>
       <w:pPr>
         <w:pStyle w:val="Heading1"/>
       </w:pPr>
       <w:r>
-        <w:t>6. Gelecek Calismalar</w:t>
-      </w:r>
-    </w:p>
-    <w:p/>
-    <w:p>
-      <w:r>
-        <w:t>Final asamada ilk gelistirme ekseni, mimari seviyesinde daha guclu reconstruction modellerinin denenmesi olacaktir. Standart convolutional autoencoder yerine VAE, skip-connection iceren daha derin encoder-decoder yapilari veya memory-augmented reconstruction modelleri uygulanabilir. Bu sayede modelin normal anatomi dagilimini daha zengin bir latent temsille ogrenmesi ve ozellikle sinira yakin patolojik orneklerde daha ayirt edici reconstruction error uretmesi hedeflenmektedir. Buna ek olarak yalnizca MSE yerine L1, SSIM tabanli kayiplar veya birlesik loss fonksiyonlari denenerek yeniden olusturma kalitesi ile anomaly sensitivity arasindaki denge incelenebilir.</w:t>
-      </w:r>
-    </w:p>
-    <w:p/>
-    <w:p>
-      <w:r>
-        <w:t>Ikinci gelistirme ekseni, veri ve deney tasarimi tarafinda planlanmaktadir. Daha yuksek giris cozunurlugu ile deney yapilarak ince retinal yapilarin ve ozellikle DRUSEN gibi daha zor ayristirilan siniflarin model tarafindan daha iyi temsil edilip edilmedigi test edilecektir. Bunun yaninda latent boyut, batch size, threshold secimi ve image size gibi hiperparametreler sistematik bir ablation calismasi ile karsilastirilacaktir. Boylece final raporda yalnizca tek bir model sonucu degil, tasarim kararlarinin performansa etkisini gosteren daha akademik bir deney tablosu sunulabilecektir.</w:t>
-      </w:r>
-    </w:p>
-    <w:p/>
-    <w:p>
-      <w:r>
-        <w:t>Ucuncu gelistirme ekseni, yorumlanabilirlik ve klinik anlamlandirma uzerine kurulacaktir. Mevcut residual map ciktilari daha detayli incelenerek hata haritalarinin retina uzerindeki hangi bolgelerde yogunlastigi analiz edilebilir. Eger rekonstruksiyon hatasi belirli anatomik bozulmalarla tutarli bicimde eslesirse, modelin yalnizca sayisal anomaly skor ureten bir kara kutu olmaktan cikmasi ve klinik olarak daha anlamli hale gelmesi saglanabilir. Bu nedenle final asamada residual map gorsellestirmeleri, en iyi ve en kotu orneklerin ayri sunulmasi ve sinif bazli hata desenlerinin nitel olarak tartisilmasi planlanmaktadir.</w:t>
-      </w:r>
-    </w:p>
-    <w:p/>
-    <w:p>
-      <w:r>
-        <w:t>Son olarak, hesaplama verimliligi ve karsilastirmali degerlendirme de gelecekteki temel adimlardan biridir. Veri yukleme hattinin hizlandirilmasi, daha uygun batch boyutlarinin secilmesi ve egitim suresinin optimize edilmesi ile tekrarli deneyler daha verimli hale getirilecektir. Mevcut baseline sonucunun yanina en az bir gelistirilmis model eklenerek AE ile gelistirilmis varyantin AUROC, F1, recall ve FPR acisindan dogrudan karsilastirilmasi hedeflenmektedir. Bu gelistirmeler tamamlandiginda proje, ara rapor seviyesindeki calisan baseline'dan, karsilastirmali ve daha guclu bir final proje yapisina tasinmis olacaktir.</w:t>
-      </w:r>
-    </w:p>
-    <w:p/>
+        <w:t>Sonuç</w:t>
+      </w:r>
+    </w:p>
+    <w:p>
+      <w:r>
+        <w:t>Bu ara rapor aşamasında, Kermany OCT verisi için hasta-bazlı doğrulama kullanan, yalnızca normal görüntülerle eğitilen ve reconstruction error ile patolojik scan tespiti yapan tekrar üretilebilir bir baseline sistem kurulmuştur. Gerçek veri üzerinde elde edilen AUROC 0.9108 ve F1 0.8201 değerleri, yaklaşımın umut verici olduğunu göstermektedir. Final aşamada hedef, bu baseline'i daha güçlü anomaly detection yaklaşımlarıyla genişletmek ve sonuçları karşılaştırmalı deneylerle desteklemektir.</w:t>
+      </w:r>
+    </w:p>
     <w:p>
       <w:pPr>
         <w:pStyle w:val="Heading1"/>
       </w:pPr>
       <w:r>
-        <w:t>7. Sonuc</w:t>
-      </w:r>
-    </w:p>
-    <w:p/>
-    <w:p>
-      <w:r>
-        <w:t>Bu ara rapor asamasinda, Kermany OCT verisi icin patient-level validation kullanan, yalnizca normal goruntulerle egitilen ve reconstruction error ile patolojik scan tespiti yapan tekrar uretilebilir bir baseline sistem kurulmustur. Gercek veri uzerinde elde edilen AUROC 0.9108 ve F1 0.8201 degerleri, projenin planlama asamasini gecip calisir ve savunulabilir bir noktaya geldigini gostermektedir. Final asamada hedef, bu baseline'i daha guclu anomaly detection yaklasimlariyla genisletmek ve sonuclari karsilastirmali deneylerle desteklemektir.</w:t>
-      </w:r>
-    </w:p>
-    <w:p/>
+        <w:t>Kaynaklar</w:t>
+      </w:r>
+    </w:p>
+    <w:p>
+      <w:r>
+        <w:t>[1] Kermany DS, Goldbaum M, Cai W, et al. Identifying Medical Diagnoses and Treatable Diseases by Image-Based Deep Learning. Cell. 2018;172(5):1122-1131. doi:10.1016/j.cell.2018.02.010</w:t>
+      </w:r>
+    </w:p>
+    <w:p>
+      <w:r>
+        <w:t>[2] Kermany DS, Zhang K, Goldbaum M. Large Dataset of Labeled Optical Coherence Tomography (OCT) and Chest X-Ray Images. Mendeley Data. 2018;v3. doi:10.17632/rscbjbr9sj.3</w:t>
+      </w:r>
+    </w:p>
+    <w:p>
+      <w:r>
+        <w:t>[3] Litjens G, Kooi T, Bejnordi BE, et al. A survey on deep learning in medical image analysis. Med Image Anal. 2017;42:60-88. doi:10.1016/j.media.2017.07.005</w:t>
+      </w:r>
+    </w:p>
+    <w:p>
+      <w:r>
+        <w:t>[4] Schlegl T, Seebock P, Waldstein SM, Schmidt-Erfurth U, Langs G. Unsupervised Anomaly Detection with Generative Adversarial Networks to Guide Marker Discovery. arXiv. 2017. doi:10.48550/arXiv.1703.05921</w:t>
+      </w:r>
+    </w:p>
+    <w:p>
+      <w:r>
+        <w:t>[5] Akcay S, Atapour-Abarghouei A, Breckon TP. GANomaly: Semi-Supervised Anomaly Detection via Adversarial Training. arXiv. 2018. doi:10.48550/arXiv.1805.06725</w:t>
+      </w:r>
+    </w:p>
+    <w:p>
+      <w:r>
+        <w:t>[6] Zavrtanik V, Kristan M, Skocaj D. DRAEM: A Discriminatively Trained Reconstruction Embedding for Surface Anomaly Detection. ICCV. 2021.</w:t>
+      </w:r>
+    </w:p>
+    <w:p>
+      <w:r>
+        <w:t>[7] Seebock P, Orlando JI, Schlegl T, et al. Exploiting Epistemic Uncertainty of Anatomy Segmentation for Anomaly Detection in Retinal OCT. IEEE Trans Med Imaging. 2019. doi:10.1109/TMI.2019.2919951</w:t>
+      </w:r>
+    </w:p>
+    <w:p>
+      <w:r>
+        <w:t>[8] Zhou K, Li J, Luo W, et al. Proxy-bridged Image Reconstruction Network for Anomaly Detection in Medical Images. arXiv. 2021. doi:10.48550/arXiv.2110.01761</w:t>
+      </w:r>
+    </w:p>
+    <w:p>
+      <w:r>
+        <w:t>[9] Luo Y, Ma Y, Yang Z. Multi-resolution auto-encoder for anomaly detection of retinal imaging. Phys Eng Sci Med. 2024;47(2):517-529. doi:10.1007/s13246-023-01381-x</w:t>
+      </w:r>
+    </w:p>
+    <w:p>
+      <w:r>
+        <w:t>[10] Wang J, Li W, Chen Y, et al. Weakly supervised anomaly segmentation in retinal OCT images using an adversarial learning approach. Biomed Opt Express. 2021;12(8):4713-4729. doi:10.1364/BOE.426803</w:t>
+      </w:r>
+    </w:p>
+    <w:p>
+      <w:pPr>
+        <w:sectPr>
+          <w:type w:val="continuous"/>
+          <w:pgSz w:w="11906" w:h="16838"/>
+          <w:pgMar w:top="1080" w:right="734" w:bottom="2434" w:left="734" w:header="0" w:footer="0" w:gutter="0"/>
+          <w:cols w:num="2" w:space="360"/>
+          <w:formProt w:val="0"/>
+          <w:docGrid w:linePitch="360" w:charSpace="8192"/>
+        </w:sectPr>
+      </w:pPr>
+    </w:p>
     <w:p>
       <w:pPr>
         <w:pStyle w:val="Heading1"/>
       </w:pPr>
       <w:r>
-        <w:t>Kaynaklar</w:t>
-      </w:r>
-    </w:p>
-    <w:p/>
-    <w:p>
-      <w:r>
-        <w:t>[1] Kermany DS, Goldbaum M, Cai W, et al. Identifying Medical Diagnoses and Treatable Diseases by Image-Based Deep Learning. Cell. 2018;172(5):1122-1131. doi:10.1016/j.cell.2018.02.010</w:t>
-      </w:r>
-    </w:p>
-    <w:p>
-      <w:r>
-        <w:t>[2] Kermany DS, Zhang K, Goldbaum M. Large Dataset of Labeled Optical Coherence Tomography (OCT) and Chest X-Ray Images. Mendeley Data. 2018;v3. doi:10.17632/rscbjbr9sj.3</w:t>
-      </w:r>
-    </w:p>
-    <w:p>
-      <w:r>
-        <w:t>[3] Litjens G, Kooi T, Bejnordi BE, et al. A survey on deep learning in medical image analysis. Med Image Anal. 2017;42:60-88. doi:10.1016/j.media.2017.07.005</w:t>
-      </w:r>
-    </w:p>
-    <w:p>
-      <w:r>
-        <w:t>[4] Schlegl T, Seebock P, Waldstein SM, Schmidt-Erfurth U, Langs G. Unsupervised Anomaly Detection with Generative Adversarial Networks to Guide Marker Discovery. arXiv. 2017. doi:10.48550/arXiv.1703.05921</w:t>
-      </w:r>
-    </w:p>
-    <w:p>
-      <w:r>
-        <w:t>[5] Akcay S, Atapour-Abarghouei A, Breckon TP. GANomaly: Semi-Supervised Anomaly Detection via Adversarial Training. arXiv. 2018. doi:10.48550/arXiv.1805.06725</w:t>
-      </w:r>
-    </w:p>
-    <w:p>
-      <w:r>
-        <w:t>[6] Zavrtanik V, Kristan M, Skocaj D. DRAEM: A Discriminatively Trained Reconstruction Embedding for Surface Anomaly Detection. ICCV. 2021.</w:t>
-      </w:r>
-    </w:p>
-    <w:p>
-      <w:r>
-        <w:t>[7] Seebock P, Orlando JI, Schlegl T, et al. Exploiting Epistemic Uncertainty of Anatomy Segmentation for Anomaly Detection in Retinal OCT. IEEE Trans Med Imaging. 2019. doi:10.1109/TMI.2019.2919951</w:t>
-      </w:r>
-    </w:p>
-    <w:p>
-      <w:r>
-        <w:t>[8] Zhou K, Li J, Luo W, et al. Proxy-bridged Image Reconstruction Network for Anomaly Detection in Medical Images. arXiv. 2021. doi:10.48550/arXiv.2110.01761</w:t>
-      </w:r>
-    </w:p>
-    <w:p>
-      <w:r>
-        <w:t>[9] Luo Y, Ma Y, Yang Z. Multi-resolution auto-encoder for anomaly detection of retinal imaging. Phys Eng Sci Med. 2024;47(2):517-529. doi:10.1007/s13246-023-01381-x</w:t>
-      </w:r>
-    </w:p>
-    <w:p>
-      <w:r>
-        <w:t>[10] Wang J, Li W, Chen Y, et al. Weakly supervised anomaly segmentation in retinal OCT images using an adversarial learning approach. Biomed Opt Express. 2021;12(8):4713-4729. doi:10.1364/BOE.426803</w:t>
-      </w:r>
-    </w:p>
-    <w:p>
-      <w:pPr>
-        <w:pStyle w:val="Heading1"/>
-      </w:pPr>
-      <w:r>
-        <w:t>Sekiller</w:t>
+        <w:t>Şekiller</w:t>
       </w:r>
     </w:p>
     <w:p>
@@ -2046,14 +2139,14 @@
         <w:jc w:val="center"/>
       </w:pPr>
       <w:r>
-        <w:t>Sekil 1. Onerilen retina OCT anomaly detection boru hatti.</w:t>
+        <w:t>Şekil 1. Önerilen retina OCT anomali tespit boru hattı.</w:t>
       </w:r>
     </w:p>
     <w:p>
       <w:r>
         <w:drawing>
           <wp:inline xmlns:a="http://schemas.openxmlformats.org/drawingml/2006/main" xmlns:pic="http://schemas.openxmlformats.org/drawingml/2006/picture">
-            <wp:extent cx="5669280" cy="4103290"/>
+            <wp:extent cx="5669280" cy="4102377"/>
             <wp:docPr id="2" name="Picture 2"/>
             <wp:cNvGraphicFramePr>
               <a:graphicFrameLocks noChangeAspect="1"/>
@@ -2074,7 +2167,7 @@
                   <pic:spPr>
                     <a:xfrm>
                       <a:off x="0" y="0"/>
-                      <a:ext cx="5669280" cy="4103290"/>
+                      <a:ext cx="5669280" cy="4102377"/>
                     </a:xfrm>
                     <a:prstGeom prst="rect"/>
                   </pic:spPr>
@@ -2090,14 +2183,14 @@
         <w:jc w:val="center"/>
       </w:pPr>
       <w:r>
-        <w:t>Sekil 2. Egitim, ROC, error dagilimi ve reconstruction ciktilarini bir araya getiren ozet gorsel.</w:t>
+        <w:t>Şekil 2. Eğitim, ROC, error dağılımı ve reconstruction çıktılarının özet görseli.</w:t>
       </w:r>
     </w:p>
     <w:sectPr>
       <w:type w:val="continuous"/>
       <w:pgSz w:w="11906" w:h="16838"/>
       <w:pgMar w:top="1080" w:right="734" w:bottom="2434" w:left="734" w:header="0" w:footer="0" w:gutter="0"/>
-      <w:cols w:num="2" w:space="360"/>
+      <w:cols w:num="1" w:space="360"/>
       <w:formProt w:val="0"/>
       <w:docGrid w:linePitch="360" w:charSpace="8192"/>
     </w:sectPr>

</xml_diff>